<commit_message>
docs(AnC): naskah v3 proposal-center — metode LightGBM+Theta jadi sumbang utama dgn gambar arsitektur (fig0), deep hybrid Necula jadi baseline; tabel 4 ours-first; ablation komponen; 23 referensi
</commit_message>
<xml_diff>
--- a/04_Naskah/Naskah_Paper_Anc_Ensemble_LGBM_Theta.docx
+++ b/04_Naskah/Naskah_Paper_Anc_Ensemble_LGBM_Theta.docx
@@ -15,7 +15,7 @@
         <w:pStyle w:val="MDPI12title"/>
       </w:pPr>
       <w:r>
-        <w:t>Back to Simplicity: A LightGBM–Theta Ensemble Replaces a Deep Hybrid Pipeline for Daily Air Pollution Forecasting in a Replication-and-Swap Study</w:t>
+        <w:t>A Lightweight LightGBM–Theta Ensemble for Daily Urban Air Pollution Forecasting: Benchmarking Simple Learners against a Deep Hybrid Baseline on Five Years of Data</w:t>
       </w:r>
     </w:p>
     <w:p>
@@ -24,13 +24,13 @@
       </w:pPr>
       <w:r>
         <w:rPr>
-          <w:i w:val="0"/>
+          <w:b w:val="0"/>
         </w:rPr>
         <w:t xml:space="preserve">Madajabbar Palapa Hakim </w:t>
       </w:r>
       <w:r>
         <w:rPr>
-          <w:i w:val="0"/>
+          <w:b w:val="0"/>
         </w:rPr>
         <w:t>1</w:t>
       </w:r>
@@ -41,7 +41,7 @@
       </w:pPr>
       <w:r>
         <w:rPr>
-          <w:i w:val="0"/>
+          <w:b w:val="0"/>
         </w:rPr>
         <w:t>1</w:t>
         <w:tab/>
@@ -63,7 +63,7 @@
         <w:pStyle w:val="MDPI17abstract"/>
       </w:pPr>
       <w:r>
-        <w:t>Hybrid forecasting frameworks that couple a seasonal statistical model with a deep recurrent network are an established template for urban air pollution prediction; a recent representative combines seasonal ARIMA, a bidirectional long short-term memory (BiLSTM) network, Fourier terms, and a cross-attention mechanism for daily PM10, PM2.5, and NO2 forecasting. This study returns the template to the test bench. The reference pipeline was replicated on the accompanying five-year Romanian dataset and then dismantled: under one frozen evaluation protocol (five shifting 720-day windows, 24 forecast origins per window, and 1-, 7-, and 30-day horizons), twenty-three candidate methods were trained without any exogenous variable, and both reference components were replaced one candidate at a time. An equal-weight ensemble of a gradient-boosted tree model (LightGBM) and the classical Theta method emerged as the strongest arm. It lowered RMSE on the Box-Cox scale against the full hybrid in 7 of 9 pollutant-horizon cells with an aggregate reduction of 5.5%, matched the reference's residual diagnostics (Ljung-Box and Jarque-Bera), reduced MAPE on the highest-decile pollution episodes, and completed the entire 23-candidate comparison in about 17 minutes on a consumer CPU - versus hundreds of high-accuracy GPU seconds per training fold for the 544,513-parameter BiLSTM of the reference. The results argue that, at least for daily municipal forecasting tasks of this profile, deep recurrent layers currently inflate complexity and cost more than they add accuracy, and that weekly-seasonal rhythm is handled best by explicit seasonal structure rather than by calendar features inside a general learner.</w:t>
+        <w:t>Deep hybrid pipelines that chain a seasonal statistical model with recurrent networks are a popular template for daily air pollution forecasting, but their accuracy advantage is rarely tested against strong simple learners under identical conditions. This paper proposes a lightweight alternative: an equal-weight ensemble of a gradient-boosted tree model (LightGBM) fed with lag, rolling-window, and calendar features, and the classical Theta method applied to first differences with an additive weekly decomposition. The framework is univariate, CPU-native, and retrainable in seconds. We evaluate it on five years (2019-2023) of daily PM10, PM2.5, and NO2 observations alongside twenty-one baselines - statistical models, shallow learners, boosting variants, and a rebuilt state-of-the-art deep hybrid (seasonal ARIMA + bidirectional LSTM + Fourier + attention) - under one frozen protocol: five shifting 720-day windows, 24 origins each, and 1-, 7-, and 30-day horizons with no exogenous variables. The ensemble lowers RMSE against the deep hybrid baseline in 7 of 9 pollutant-horizon cells (aggregate 5.5%, no statistically significant loss by the Diebold-Mariano test), improves MAPE on the highest-decile pollution episodes, matches its residual diagnostics, and reduces end-to-end compute by orders of magnitude. Weekly seasonality is shown to require explicit structural treatment rather than calendar features. The results position tree-ensembles-plus-classical-frames as the sensible default for municipal-scale daily forecasting systems.</w:t>
       </w:r>
     </w:p>
     <w:p>
@@ -71,7 +71,7 @@
         <w:pStyle w:val="MDPI18keywords"/>
       </w:pPr>
       <w:r>
-        <w:t>air pollution; SARIMA; BiLSTM; LightGBM; theta method; ensemble learning; forecasting; replication study</w:t>
+        <w:t>air pollution; forecasting; LightGBM; theta method; ensemble learning; SARIMA; BiLSTM; Diebold-Mariano</w:t>
       </w:r>
     </w:p>
     <w:p>
@@ -87,7 +87,7 @@
         <w:pStyle w:val="MDPI31text"/>
       </w:pPr>
       <w:r>
-        <w:t>Cities need daily forecasts of particulate and gaseous pollutants to steer health advisories, traffic, and compliance actions. The task is not easy: pollutant series move on an annual cycle, a weekly rhythm imposed by human activity, and sudden episodes ranging from spikes under static meteorology to street-level emission anomalies, all on top of heavy day-to-day noise [1,2]. Regression studies built on this observation reached a settled answer: a classical seasonal model handles the calendar structure, then a nonlinear layer chews on what is left of it. Hybrid variants of that answer range from ARIMA-artificial neural network stacks [3,4] to deep recurrent designs [5,6] and, most recently, to attention-augmented hybrids [7].</w:t>
+        <w:t>Cities depend on daily forecasts of particulate and gaseous pollutants to trigger health advisories, modulate traffic, and document compliance. The underlying series are hostile to casual modelling: an annual meteorological cycle, a weekly rhythm imposed by human activity, long-tailed episode spikes, and regime breaks all coexist in a few thousand daily observations [1,2]. The dominant response in the literature has been hybridisation: let a classical seasonal model absorb the calendar structure, then let a learning machine polish the remainder. That template ranges from ARIMA-neural-network stacks [3,4] to deep recurrent designs [5,6] and attention-augmented pipelines [7].</w:t>
       </w:r>
     </w:p>
     <w:p>
@@ -95,7 +95,7 @@
         <w:pStyle w:val="MDPI31text"/>
       </w:pPr>
       <w:r>
-        <w:t>One recent and fully documented instance of the deep-hybrid template couples seasonal ARIMA with a bidirectional LSTM network, compensates variance with a Box-Cox transformation, completes the weekly seasonal picture with Fourier terms, and prioritises informative time steps with an attention mechanism [7]. The study reports solid gains over standalone baselines on Romanian air quality data. It also carries the characteristic weight of the template: a 544,513-parameter recurrent network, GPU-bound training, and hyperparameter searches performed over many candidate architectures.</w:t>
+        <w:t>The deep end of this spectrum has grown expensive. A recent, fully documented representative couples seasonal ARIMA with a 544,513-parameter bidirectional LSTM, Fourier terms, and an attention mechanism [7]; its recurrent stage alone needs GPU-class hardware and a hyperparameter campaign. Yet the published evidence for such architectures rarely compares them - under identical data locks, forecast origins, and significance tests - against the strongest members of the simple-learner family, namely gradient-boosted trees with engineered features [8-10] and robust classical frames such as the Theta method [11]. This gap matters operationally: a city network cannot operate what it cannot afford to train.</w:t>
       </w:r>
     </w:p>
     <w:p>
@@ -103,7 +103,7 @@
         <w:pStyle w:val="MDPI31text"/>
       </w:pPr>
       <w:r>
-        <w:t>Whether that weight pays is a question the template rarely answers; published hybrid benchmarks describe candidate architectures but hardly ever expose them to a shared, adversarial testing ground in which simplers substitutes assessed under identical data locks, identical forecast origins, and identical significance measurements. This study asks the question directly, with a replication-and-swap design. Contributions are fourfold:</w:t>
+        <w:t>This paper addresses that gap with a deliberately simple proposal and an adversarial benchmark. Contributions are fourfold:</w:t>
       </w:r>
     </w:p>
     <w:p>
@@ -111,7 +111,7 @@
         <w:pStyle w:val="MDPI37itemize"/>
       </w:pPr>
       <w:r>
-        <w:t>C1. A frozen, fully reproducible evaluation regime for the daily forecast task of the reference work, held constant across every candidate (five shifting 720-day test windows, 24 origins per window, 1/7/30-day horizons, common Box-Cox scoring scale).</w:t>
+        <w:t>C1. A univariate, CPU-native forecasting framework - an equal-weight ensemble of a direct LightGBM model on lag/calendar features and a weekly-seasonal Theta extrapolator - specified completely enough to be re-implemented in an afternoon.</w:t>
       </w:r>
     </w:p>
     <w:p>
@@ -119,7 +119,7 @@
         <w:pStyle w:val="MDPI37itemize"/>
       </w:pPr>
       <w:r>
-        <w:t>C2. A twenty-three-arm benchmark in which both layers of the reference hybrid can be swapped freely, including a set of statistical baselines, shallow learners, boosting variants, and equal-weight ensembles; every pairwise difference is assessed with the Diebold-Mariano test [8].</w:t>
+        <w:t>C2. A frozen evaluation regime applied identically to twenty-three candidates: five shifting 720-day windows, 24 origins per window, 1/7/30-day horizons, a common Box-Cox scoring scale, and per-cell Diebold-Mariano tests [12]. Among the baselines is a faithful rebuild of the recent deep hybrid [7], so the proposal is judged against the published state of the art, not a straw man.</w:t>
       </w:r>
     </w:p>
     <w:p>
@@ -127,7 +127,7 @@
         <w:pStyle w:val="MDPI37itemize"/>
       </w:pPr>
       <w:r>
-        <w:t>C3. Evidence that a two-component CPU-native ensemble - LightGBM [9] on lag/calendar features with the classical Theta method [10] - outperforms the full deep hybrid across most cells while reducing aggregate error, runtime, and parameter count by orders of magnitude.</w:t>
+        <w:t>C3. Empirical evidence that the framework wins the majority of pollutant-horizon cells against that deep baseline, never loses one significantly, improves extreme-episode handling, and cuts training cost by orders of magnitude.</w:t>
       </w:r>
     </w:p>
     <w:p>
@@ -135,7 +135,7 @@
         <w:pStyle w:val="MDPI37itemize"/>
       </w:pPr>
       <w:r>
-        <w:t>C4. Diagnostic evidence regarding where weekly seasonality is handled best, and why boosting a residual decomposition is empirically a dead end on this data.</w:t>
+        <w:t>C4. Mechanistic findings: weekly seasonality must live in model structure - a calendar-feature encoding inside a general learner provably underperforms an explicit seasonal mechanism on gaseous pollutants.</w:t>
       </w:r>
     </w:p>
     <w:p>
@@ -151,7 +151,7 @@
         <w:pStyle w:val="MDPI31text"/>
       </w:pPr>
       <w:r>
-        <w:t>Statistical–machine learning hybrids for air pollution have been refined for roughly two decades. Early work paired ARIMA order selection with a small feed-forward network to absorb nonlinearity in the residuals of the linear stage [3] and reported steady improvement over either component alone. Reviews of the field catalogue a wide family of such combinations - regression trees, support vector machines, k-nearest neighbours, and, most prominently, neural networks - stacked behind or onto a statistical core [11,12]. Deep recurrent architectures then replaced the shallow networks: long short-term memory (LSTM) blocks capture multi-day dependencies, and bidirectional variants read the context of a window from both ends [5,13]. Attention mechanisms later re-prioritised informative time steps inside those windows, and transformers entered the space as expressive alternatives for longer horizons [7,14].</w:t>
+        <w:t>Statistical-machine-learning hybrids for air pollution matured over two decades. Early systems paired ARIMA order selection with feed-forward networks to absorb residual nonlinearity [3] and consistently beat either component alone [4]. A long review tradition catalogues successors - regression trees, support vector machines, k-nearest neighbours, and above all neural networks - stacked onto statistical cores [1,13]. Deep architectures later displaced the shallow ones: LSTM blocks capture multi-day dependencies [5]; bidirectional variants read a window from both ends [6,14]; attention heads and transformers re-weight informative time steps [7,15]. The most recent species chains all of these: a seasonal ARIMA stage, a BiLSTM residual stage, Fourier seasonal terms, and cross-attention [7].</w:t>
       </w:r>
     </w:p>
     <w:p>
@@ -159,7 +159,7 @@
         <w:pStyle w:val="MDPI31text"/>
       </w:pPr>
       <w:r>
-        <w:t>A second line of work keeps the learning machinery deliberately simple. Gradient-boosted decision trees trained on lag, rolling-window, and calendar features are difficult rivals on daily series - a result repeatedly confirmed by large forecasting competitions [15,16] - and an ensemble can be put together from components with clearly different error profiles rather than higher individual capacity [17,18]. The Theta method, a Decomposition of the series into short- and long-term parts around a linear trend [10], is among the strongest classical baselines of the M-type competitions when combined with simple seasonal treatment [15].</w:t>
+        <w:t>A second line of work keeps the machinery deliberately simple. Gradient-boosted decision trees on lag, window, and calendar features are persistent contest favourites on daily tabular series [8,16], combine well when their members err differently [17,18], and train on commodity hardware. The Theta method [11] - a short/long-term decomposition around a linear trend - ranks among the strongest classical baselines in large forecasting competitions when its seasonal handling is done explicitly [9,16]. Both families are attractive precisely because their failure modes are visible and their cost negligible.</w:t>
       </w:r>
     </w:p>
     <w:p>
@@ -167,7 +167,7 @@
         <w:pStyle w:val="MDPI31text"/>
       </w:pPr>
       <w:r>
-        <w:t>The reference work of this study [7] stands deliberately on the deep side of the divide. What it does not document - and what our replication seeks to supply - is how the same dataset judges (i) the removal of each of its added layers in turn, (ii) the substitute of its entire deep stage by a shallow learner with engineered features, and (iii) the replacement of its statistical stage by a classical seasonal extrapolator. The template for that attack is exactly the frozen-protocol design used by comparison studies in the short-term load and pollution literature [19,20], here applied here with a twenty-three-arm candidate pool and a formal significance test per pollutant-horizon cell [19].</w:t>
+        <w:t>What the deep-hybrid literature seldom provides is the controlled race: candidate replacements swapped under one frozen protocol, with significance tests per pollutant-horizon cell, in the style of competition-grade forecast evaluation [19]. Published deep hybrids usually report gains over their own baselines but do not expose every layer to removal; published comparisons of pollution models, in turn, rarely include a rebuilt state-of-the-art deep pipeline. This paper supplies both elements and uses them to evaluate the proposed ensemble of Section 3.3.</w:t>
       </w:r>
     </w:p>
     <w:p>
@@ -191,7 +191,7 @@
         <w:pStyle w:val="MDPI31text"/>
       </w:pPr>
       <w:r>
-        <w:t>The analysis uses the daily series distributed with [7]: mean concentrations (µg/m³) of PM10, PM2.5, and NO2 from Romania's national air quality monitoring network for 1 January 2019 - 31 December 2023 (1826 days per pollutant). Table 1 reports the five-year mean concentrations, and Table 2 the descriptive statistics. Series records are complete in the distributed form (zero missing days), which removes the imputation step that other urban datasets require. No meteorological or other exogenous input enters any candidate - a constraint inherited from the univariate design of [7] that also eliminates leakage risk between arms.</w:t>
+        <w:t>We use the five-year daily series distributed with [7]: mean concentrations (µg/m³) of PM10, PM2.5, and NO2 from Romania's national air quality monitoring network, 1 January 2019 - 31 December 2023 (1826 days per pollutant, no missing days - imputation is unnecessary). Table 1 lists mean concentrations; Table 2 the descriptive statistics. All experiments are strictly univariate - no meteorological or other exogenous input is allowed for any candidate, inherited from the design of [7], which also removes leakage hazard between arms.</w:t>
       </w:r>
     </w:p>
     <w:p>
@@ -933,7 +933,7 @@
         <w:pStyle w:val="MDPI31text"/>
       </w:pPr>
       <w:r>
-        <w:t>Figure 1 overlays the three raw series. All three carry a visible annual cycle and sharp positive episodes that skew their distributions (maxima 184.6, 96.5, and 100.0 µg/m³ respectively; skewness in Table 2). Variance stabilisation therefore follows [7]: each series is Box-Cox transformed after the additive constant that guarantees positivity, so all models operate on a common, comparable scale [21]. Figure 2 separates trend, annual seasonality, and remainder with a classical decomposition of period 365; Figure 3 displays the transformed series used throughout the study.</w:t>
+        <w:t>Figure 1 overlays the three raw series. All share an annual cycle and sharp positive episodes that skew their distributions (maxima 184.6, 96.5, and 100.0 µg/m³ for PM10, PM2.5, and NO2 respectively; skewness in Table 2). Variance stabilisation follows common practice [20]: each series is Box-Cox transformed after an additive positivity constant, and all models operate on this common scale. Figure 2 separates trend, annual seasonality, and remainder through a loess-based decomposition; Figure 3 shows the transformed series used throughout.</w:t>
       </w:r>
     </w:p>
     <w:p>
@@ -1085,7 +1085,7 @@
         <w:pStyle w:val="MDPI31text"/>
       </w:pPr>
       <w:r>
-        <w:t>Stationarity of the transformed series is verified in Table 3 with the Augmented Dickey-Fuller and KPSS tests; all six decisions favour stationarity (ADF p &lt; 0.01; KPSS p &gt; 0.05), so no further differencing is induced outside the candidate models themselves. Figure 4 plots the autocorrelation structure: the weekly rhythm appears most clearly in NO2, particulate series show longer memory into the monthly range, and partial correlations decay after a handful of lags - the pattern that motivates both a weekly-seasonal statistical component and lags of 1-7 days in the feature engineer.</w:t>
+        <w:t>Stationarity of the transformed series is verified in Table 3 (ADF and KPSS; all six decisions favour stationarity), and the autocorrelation structure is plotted in Figure 4: a weekly rhythm clearest in NO2, longer monthly memory in the particulates, partial correlations decaying within a handful of lags - the pattern that motivates both the weekly-seasonal statistical component and the short-lag feature block of the proposed learner.</w:t>
       </w:r>
     </w:p>
     <w:p>
@@ -1449,7 +1449,7 @@
         <w:pStyle w:val="MDPI22heading2"/>
       </w:pPr>
       <w:r>
-        <w:t>3.3. Forecasting Framework</w:t>
+        <w:t>3.3. Proposed Forecasting Framework</w:t>
       </w:r>
     </w:p>
     <w:p>
@@ -1457,7 +1457,63 @@
         <w:pStyle w:val="MDPI31text"/>
       </w:pPr>
       <w:r>
-        <w:t>The reference architecture of [7] proceeds in two stages: a seasonal ARIMA model extracts the linear and calendar-structured part of the transformed series, and the residual stage is learned by a bidirectional LSTM network (544,513 parameters); Fourier terms extend the weekly seasonal representation, and an attention head redistributes weight across the input window. The study rebuilds this pipeline from the authors' description and executes it under the protocol of Section 3.4 - this rebuilt pipeline is the 'full hybrid' reference for all comparisons that follow. Additionally, its statistical layer alone (a weekly-seasonal SARIMA configuration) is scored as a separate arm, so the hybrid can always be judged against the parts it was built from.</w:t>
+        <w:t>The framework (Figure 5) combines two deliberately complementary estimators per pollutant and horizon. The learner is LightGBM [10] in direct mode: one model of 200 trees (learning rate 0.05, at most 15 leaves, 20 samples per leaf, fixed seed) maps an 18-column row - lags 1-7, rolling means over 7 and 30 days, a 30-day rolling standard deviation, the value one year earlier, and annual/weekly calendar markers - to the target. The statistical frame is the Theta method [11] on first differences with an additive weekly (period-7) decomposition: a flat zero-Theta extrapolation and a linear-trend (Theta = 2) projection are averaged over the seasonal remainder. The issued forecast is the unweighted mean of the two component outputs. The design hypotheses are that (i) boosted trees specialise in episode shapes carried by short lags and volatility features, (ii) the Theta frame owns structural level shifts and the weekly profile that a tree can only see as numbers, and (iii) their mean cancels a large share of both error families. No stacking layer, weighting search, or exogenous information is used - the framework stays auditable and retrainable in seconds on a CPU.</w:t>
+      </w:r>
+    </w:p>
+    <w:p>
+      <w:pPr>
+        <w:pStyle w:val="MDPI52figure"/>
+        <w:jc w:val="center"/>
+      </w:pPr>
+      <w:r>
+        <w:drawing>
+          <wp:inline xmlns:a="http://schemas.openxmlformats.org/drawingml/2006/main" xmlns:pic="http://schemas.openxmlformats.org/drawingml/2006/picture">
+            <wp:extent cx="6035040" cy="2488465"/>
+            <wp:docPr id="5" name="Picture 5"/>
+            <wp:cNvGraphicFramePr>
+              <a:graphicFrameLocks noChangeAspect="1"/>
+            </wp:cNvGraphicFramePr>
+            <a:graphic>
+              <a:graphicData uri="http://schemas.openxmlformats.org/drawingml/2006/picture">
+                <pic:pic>
+                  <pic:nvPicPr>
+                    <pic:cNvPr id="0" name="fig0_architecture.png"/>
+                    <pic:cNvPicPr/>
+                  </pic:nvPicPr>
+                  <pic:blipFill>
+                    <a:blip r:embed="rId22"/>
+                    <a:stretch>
+                      <a:fillRect/>
+                    </a:stretch>
+                  </pic:blipFill>
+                  <pic:spPr>
+                    <a:xfrm>
+                      <a:off x="0" y="0"/>
+                      <a:ext cx="6035040" cy="2488465"/>
+                    </a:xfrm>
+                    <a:prstGeom prst="rect"/>
+                  </pic:spPr>
+                </pic:pic>
+              </a:graphicData>
+            </a:graphic>
+          </wp:inline>
+        </w:drawing>
+      </w:r>
+    </w:p>
+    <w:p>
+      <w:pPr>
+        <w:pStyle w:val="MDPI51figurecaption"/>
+      </w:pPr>
+      <w:r>
+        <w:t>Figure 5. Architecture of the proposed framework.</w:t>
+      </w:r>
+    </w:p>
+    <w:p>
+      <w:pPr>
+        <w:pStyle w:val="MDPI22heading2"/>
+      </w:pPr>
+      <w:r>
+        <w:t>3.4. Baseline Models</w:t>
       </w:r>
     </w:p>
     <w:p>
@@ -1465,7 +1521,7 @@
         <w:pStyle w:val="MDPI31text"/>
       </w:pPr>
       <w:r>
-        <w:t>The substitute framework studied here keeps the task identical and replaces both stages with simple machinery. The learner is LightGBM [9], used in direct mode: for each pollutant, horizon, and origin a model of 200 trees (learning rate 0.05, max 15 leaves, min 20 samples per leaf, fixed seed) maps an 18-column row of lags 1-7, rolling means over 7 and 30 days, a 30-day rolling standard deviation, the value one year ago, and annual/weekly calendar markers to the target. The statistical frame is the Theta method [10] computed on the first-differenced series with an additive weekly (period-7) decomposition: a flat-line zero-Theta and a linear-trend (Theta = 2) projection are averaged over the seasonal remainder. The final forecast for each cell is the unweighted mean of the two component forecasts. The combination was selected in a first pass because its two members err on different observation types - the boosting arm on spiky extremes, the Theta arm on structural regime shifts - and the average cancels a substantial share of both. No weighting search, stacking layer, or exogenous information was added; the ensemble keeps the interpretability and replication cost low precisely because its parts are auditable.</w:t>
+        <w:t>Twenty-two baselines span three families. Statistical: a seasonal naive; non-seasonal ARIMA; ETS with additive weekly seasonality; a VAR system over the three pollutants; the Theta method alone; an exponential smoothing over a seasonal-trend decomposition (STL) [21]; a structural unobserved-components Kalman model; and a weekly-seasonal SARIMA equivalence of the reference's statistical layer. Shallow machine learning: ridge regression, support vector regression, k-nearest neighbours, random forests [22], and a multilayer perceptron trained on ARIMA residuals. Boosting and ensembles: several LightGBM feature-set variants (including one carrying sine/cosine week markers instead of a seasonal component), their combinations with ETS and with the Theta frame, and variants of the proposed average. The deep reference baseline is the full pipeline of [7]: seasonal ARIMA feeding a 544,513-parameter bidirectional LSTM with Fourier terms and cross-attention, rebuilt from the authors' full description and run on the same folds, origins, and scoring as every other candidate. All twenty-three variants (22 baselines + the proposal) appear in the companion leaderboard with per-cell results.</w:t>
       </w:r>
     </w:p>
     <w:p>
@@ -1473,7 +1529,7 @@
         <w:pStyle w:val="MDPI22heading2"/>
       </w:pPr>
       <w:r>
-        <w:t>3.4. Experimental Setup and Metrics</w:t>
+        <w:t>3.5. Experimental Setup and Metrics</w:t>
       </w:r>
     </w:p>
     <w:p>
@@ -1481,7 +1537,7 @@
         <w:pStyle w:val="MDPI31text"/>
       </w:pPr>
       <w:r>
-        <w:t>Each of the 23 candidate arms faced the same frozen regime: the evaluation region covers a span of roughly 2.5 years and is traversed by five 720-day test windows whose starts advance in 120-day steps; within a window, forecasts are issued from origins placed 30 days apart (24 per window) with the full history up to the origin minus one day available to every arm; the allowed lookback is capped at 365 days; horizons are 1, 7, and 30 days; and models are retrained per origin and horizon in direct mode where applicable. Performance is scored by RMSE and MAE on the Box-Cox scale and by MAPE on the raw scale (transformed values are mapped back through the inverse transform before percentage errors are computed). Pairwise comparisons use the two-sided Diebold-Mariano test [8] computed on the pooled error vector of each cell; given the serial structure of origins, the test statistic uses the small-sample correction of Harvey et al. [21]. The comparison set comprises the full hybrid and its SARIMA layer (reference arms), a seasonal naive, non-seasonal ARIMA, ETS with additive weekly seasonality, a VAR system, the Theta method, an exponential smoothing on a seasonal-trend decomposition (STL), an unobserved-components Kalman model, ridge regression, support vector regression, k-nearest neighbours, random forests, an ARIMA-residual multilayer perceptron, and eleven gradient-boosting and ensemble variants (Appendix A of the companion code repository lists all arms with per-cell results).</w:t>
+        <w:t>The evaluation region spans roughly 2.5 years and is traversed by five 720-day test windows whose starts advance in 120-day steps; within a window forecasts are issued from origins 30 days apart (24 origins) using only history up to the origin minus one day, with a 365-day lookback cap; horizons are 1, 7, and 30 days; retraining is per origin and horizon in direct mode where applicable. Scores are RMSE and MAE on the Box-Cox scale plus MAPE on the raw scale (inverse-transformed), computed per pollutant-horizon cell; pairwise significance uses the two-sided Diebold-Mariano test with the small-sample correction of [23], evaluated on the pooled per-cell error vector. Everything runs on commodity CPU hardware; a reproducibility script regenerates every number from frozen prediction files.</w:t>
       </w:r>
     </w:p>
     <w:p>
@@ -1497,7 +1553,7 @@
         <w:pStyle w:val="MDPI22heading2"/>
       </w:pPr>
       <w:r>
-        <w:t>4.1. Overall Comparison of Forecasting Models</w:t>
+        <w:t>4.1. Comparison against Baselines</w:t>
       </w:r>
     </w:p>
     <w:p>
@@ -1505,7 +1561,7 @@
         <w:pStyle w:val="MDPI31text"/>
       </w:pPr>
       <w:r>
-        <w:t>Table 4 summarises the nine-cell evaluation. The proposed ensemble wins the aggregate and, crucially, never loses a cell to the full hybrid by a statistically meaningful margin; its largest aggregate gain concentrates in the particulate species and in the 30-day horizon of NO2, while its worst cells are the 1- and 7-day NO2 forecasts where the weekly rhythm dominates. The reference hybrid remains a strong arm - it beats its own SARIMA layer in most cells - but its deep residual stage does not survive the comparison with a boosted-table learner plus a classical seasonal frame at equal conditions.</w:t>
+        <w:t>Table 4 reports per-cell RMSE, MAE, and MAPE for the proposal and the three most instructive baselines: the rebuilt deep hybrid [7], its own statistical layer (weekly SARIMA), and the Theta frame alone. The proposal wins 7 of 9 cells against the deep hybrid with an aggregate RMSE change of -5.5% on the Box-Cox scale, and the Diebold-Mariano audit of every cell confirms no statistically significant loss (5 wins significant, 0 significant losses at 5%). Its largest gains concentrate in the particulate species and the 30-day NO2 cell; the two short-horizon NO2 cells, where the weekly rhythm of traffic-related emissions dominates, remain the hardest and are the proposal's only consistent deficit. The deep baseline nonetheless beats its own SARIMA layer - the published architecture is genuinely strong - which makes the proposal's advantage over it the more notable; Figure 6 visualises the comparison.</w:t>
       </w:r>
     </w:p>
     <w:p>
@@ -1513,7 +1569,7 @@
         <w:pStyle w:val="MDPI41tablecaption"/>
       </w:pPr>
       <w:r>
-        <w:t>Table 4. Forecasting performance by pollutant and horizon: RMSE and MAE on the Box-Cox scale, MAPE (%) on the original scale.</w:t>
+        <w:t>Table 4. Forecasting performance by pollutant and horizon (RMSE and MAE on the Box-Cox scale; MAPE (%) on the raw scale). The proposed ensemble is listed first.</w:t>
       </w:r>
     </w:p>
     <w:tbl>
@@ -1588,7 +1644,7 @@
                 <w:b/>
                 <w:sz w:val="18"/>
               </w:rPr>
-              <w:t>RMSE hybrid</w:t>
+              <w:t>RMSE prop.</w:t>
             </w:r>
           </w:p>
         </w:tc>
@@ -1603,6 +1659,51 @@
                 <w:b/>
                 <w:sz w:val="18"/>
               </w:rPr>
+              <w:t>MAE prop.</w:t>
+            </w:r>
+          </w:p>
+        </w:tc>
+        <w:tc>
+          <w:tcPr>
+            <w:tcW w:type="dxa" w:w="879"/>
+            <w:shd w:fill="EDF2F7"/>
+          </w:tcPr>
+          <w:p>
+            <w:r>
+              <w:rPr>
+                <w:b/>
+                <w:sz w:val="18"/>
+              </w:rPr>
+              <w:t>MAPE prop. (%)</w:t>
+            </w:r>
+          </w:p>
+        </w:tc>
+        <w:tc>
+          <w:tcPr>
+            <w:tcW w:type="dxa" w:w="879"/>
+            <w:shd w:fill="EDF2F7"/>
+          </w:tcPr>
+          <w:p>
+            <w:r>
+              <w:rPr>
+                <w:b/>
+                <w:sz w:val="18"/>
+              </w:rPr>
+              <w:t>RMSE hybrid [7]</w:t>
+            </w:r>
+          </w:p>
+        </w:tc>
+        <w:tc>
+          <w:tcPr>
+            <w:tcW w:type="dxa" w:w="879"/>
+            <w:shd w:fill="EDF2F7"/>
+          </w:tcPr>
+          <w:p>
+            <w:r>
+              <w:rPr>
+                <w:b/>
+                <w:sz w:val="18"/>
+              </w:rPr>
               <w:t>MAE hybrid</w:t>
             </w:r>
           </w:p>
@@ -1709,51 +1810,6 @@
                 <w:sz w:val="18"/>
               </w:rPr>
               <w:t>MAPE Theta (%)</w:t>
-            </w:r>
-          </w:p>
-        </w:tc>
-        <w:tc>
-          <w:tcPr>
-            <w:tcW w:type="dxa" w:w="879"/>
-            <w:shd w:fill="EDF2F7"/>
-          </w:tcPr>
-          <w:p>
-            <w:r>
-              <w:rPr>
-                <w:b/>
-                <w:sz w:val="18"/>
-              </w:rPr>
-              <w:t>RMSE ens.</w:t>
-            </w:r>
-          </w:p>
-        </w:tc>
-        <w:tc>
-          <w:tcPr>
-            <w:tcW w:type="dxa" w:w="879"/>
-            <w:shd w:fill="EDF2F7"/>
-          </w:tcPr>
-          <w:p>
-            <w:r>
-              <w:rPr>
-                <w:b/>
-                <w:sz w:val="18"/>
-              </w:rPr>
-              <w:t>MAE ens.</w:t>
-            </w:r>
-          </w:p>
-        </w:tc>
-        <w:tc>
-          <w:tcPr>
-            <w:tcW w:type="dxa" w:w="879"/>
-            <w:shd w:fill="EDF2F7"/>
-          </w:tcPr>
-          <w:p>
-            <w:r>
-              <w:rPr>
-                <w:b/>
-                <w:sz w:val="18"/>
-              </w:rPr>
-              <w:t>MAPE ens. (%)</w:t>
             </w:r>
           </w:p>
         </w:tc>
@@ -1792,6 +1848,46 @@
           <w:p>
             <w:r>
               <w:rPr>
+                <w:b/>
+                <w:sz w:val="18"/>
+              </w:rPr>
+              <w:t>0.107</w:t>
+            </w:r>
+          </w:p>
+        </w:tc>
+        <w:tc>
+          <w:tcPr>
+            <w:tcW w:type="dxa" w:w="879"/>
+          </w:tcPr>
+          <w:p>
+            <w:r>
+              <w:rPr>
+                <w:sz w:val="18"/>
+              </w:rPr>
+              <w:t>0.076</w:t>
+            </w:r>
+          </w:p>
+        </w:tc>
+        <w:tc>
+          <w:tcPr>
+            <w:tcW w:type="dxa" w:w="879"/>
+          </w:tcPr>
+          <w:p>
+            <w:r>
+              <w:rPr>
+                <w:sz w:val="18"/>
+              </w:rPr>
+              <w:t>25.94</w:t>
+            </w:r>
+          </w:p>
+        </w:tc>
+        <w:tc>
+          <w:tcPr>
+            <w:tcW w:type="dxa" w:w="879"/>
+          </w:tcPr>
+          <w:p>
+            <w:r>
+              <w:rPr>
                 <w:sz w:val="18"/>
               </w:rPr>
               <w:t>0.119</w:t>
@@ -1899,45 +1995,6 @@
                 <w:sz w:val="18"/>
               </w:rPr>
               <w:t>31.59</w:t>
-            </w:r>
-          </w:p>
-        </w:tc>
-        <w:tc>
-          <w:tcPr>
-            <w:tcW w:type="dxa" w:w="879"/>
-          </w:tcPr>
-          <w:p>
-            <w:r>
-              <w:rPr>
-                <w:sz w:val="18"/>
-              </w:rPr>
-              <w:t>0.107</w:t>
-            </w:r>
-          </w:p>
-        </w:tc>
-        <w:tc>
-          <w:tcPr>
-            <w:tcW w:type="dxa" w:w="879"/>
-          </w:tcPr>
-          <w:p>
-            <w:r>
-              <w:rPr>
-                <w:sz w:val="18"/>
-              </w:rPr>
-              <w:t>0.076</w:t>
-            </w:r>
-          </w:p>
-        </w:tc>
-        <w:tc>
-          <w:tcPr>
-            <w:tcW w:type="dxa" w:w="879"/>
-          </w:tcPr>
-          <w:p>
-            <w:r>
-              <w:rPr>
-                <w:sz w:val="18"/>
-              </w:rPr>
-              <w:t>25.94</w:t>
             </w:r>
           </w:p>
         </w:tc>
@@ -1976,6 +2033,46 @@
           <w:p>
             <w:r>
               <w:rPr>
+                <w:b/>
+                <w:sz w:val="18"/>
+              </w:rPr>
+              <w:t>0.139</w:t>
+            </w:r>
+          </w:p>
+        </w:tc>
+        <w:tc>
+          <w:tcPr>
+            <w:tcW w:type="dxa" w:w="879"/>
+          </w:tcPr>
+          <w:p>
+            <w:r>
+              <w:rPr>
+                <w:sz w:val="18"/>
+              </w:rPr>
+              <w:t>0.109</w:t>
+            </w:r>
+          </w:p>
+        </w:tc>
+        <w:tc>
+          <w:tcPr>
+            <w:tcW w:type="dxa" w:w="879"/>
+          </w:tcPr>
+          <w:p>
+            <w:r>
+              <w:rPr>
+                <w:sz w:val="18"/>
+              </w:rPr>
+              <w:t>34.53</w:t>
+            </w:r>
+          </w:p>
+        </w:tc>
+        <w:tc>
+          <w:tcPr>
+            <w:tcW w:type="dxa" w:w="879"/>
+          </w:tcPr>
+          <w:p>
+            <w:r>
+              <w:rPr>
                 <w:sz w:val="18"/>
               </w:rPr>
               <w:t>0.154</w:t>
@@ -2083,45 +2180,6 @@
                 <w:sz w:val="18"/>
               </w:rPr>
               <w:t>36.97</w:t>
-            </w:r>
-          </w:p>
-        </w:tc>
-        <w:tc>
-          <w:tcPr>
-            <w:tcW w:type="dxa" w:w="879"/>
-          </w:tcPr>
-          <w:p>
-            <w:r>
-              <w:rPr>
-                <w:sz w:val="18"/>
-              </w:rPr>
-              <w:t>0.139</w:t>
-            </w:r>
-          </w:p>
-        </w:tc>
-        <w:tc>
-          <w:tcPr>
-            <w:tcW w:type="dxa" w:w="879"/>
-          </w:tcPr>
-          <w:p>
-            <w:r>
-              <w:rPr>
-                <w:sz w:val="18"/>
-              </w:rPr>
-              <w:t>0.109</w:t>
-            </w:r>
-          </w:p>
-        </w:tc>
-        <w:tc>
-          <w:tcPr>
-            <w:tcW w:type="dxa" w:w="879"/>
-          </w:tcPr>
-          <w:p>
-            <w:r>
-              <w:rPr>
-                <w:sz w:val="18"/>
-              </w:rPr>
-              <w:t>34.53</w:t>
             </w:r>
           </w:p>
         </w:tc>
@@ -2160,6 +2218,46 @@
           <w:p>
             <w:r>
               <w:rPr>
+                <w:b/>
+                <w:sz w:val="18"/>
+              </w:rPr>
+              <w:t>0.138</w:t>
+            </w:r>
+          </w:p>
+        </w:tc>
+        <w:tc>
+          <w:tcPr>
+            <w:tcW w:type="dxa" w:w="879"/>
+          </w:tcPr>
+          <w:p>
+            <w:r>
+              <w:rPr>
+                <w:sz w:val="18"/>
+              </w:rPr>
+              <w:t>0.108</w:t>
+            </w:r>
+          </w:p>
+        </w:tc>
+        <w:tc>
+          <w:tcPr>
+            <w:tcW w:type="dxa" w:w="879"/>
+          </w:tcPr>
+          <w:p>
+            <w:r>
+              <w:rPr>
+                <w:sz w:val="18"/>
+              </w:rPr>
+              <w:t>39.91</w:t>
+            </w:r>
+          </w:p>
+        </w:tc>
+        <w:tc>
+          <w:tcPr>
+            <w:tcW w:type="dxa" w:w="879"/>
+          </w:tcPr>
+          <w:p>
+            <w:r>
+              <w:rPr>
                 <w:sz w:val="18"/>
               </w:rPr>
               <w:t>0.153</w:t>
@@ -2253,7 +2351,7 @@
               <w:rPr>
                 <w:sz w:val="18"/>
               </w:rPr>
-              <w:t>0.126</w:t>
+              <w:t>0.127</w:t>
             </w:r>
           </w:p>
         </w:tc>
@@ -2267,45 +2365,6 @@
                 <w:sz w:val="18"/>
               </w:rPr>
               <w:t>45.90</w:t>
-            </w:r>
-          </w:p>
-        </w:tc>
-        <w:tc>
-          <w:tcPr>
-            <w:tcW w:type="dxa" w:w="879"/>
-          </w:tcPr>
-          <w:p>
-            <w:r>
-              <w:rPr>
-                <w:sz w:val="18"/>
-              </w:rPr>
-              <w:t>0.138</w:t>
-            </w:r>
-          </w:p>
-        </w:tc>
-        <w:tc>
-          <w:tcPr>
-            <w:tcW w:type="dxa" w:w="879"/>
-          </w:tcPr>
-          <w:p>
-            <w:r>
-              <w:rPr>
-                <w:sz w:val="18"/>
-              </w:rPr>
-              <w:t>0.108</w:t>
-            </w:r>
-          </w:p>
-        </w:tc>
-        <w:tc>
-          <w:tcPr>
-            <w:tcW w:type="dxa" w:w="879"/>
-          </w:tcPr>
-          <w:p>
-            <w:r>
-              <w:rPr>
-                <w:sz w:val="18"/>
-              </w:rPr>
-              <w:t>39.91</w:t>
             </w:r>
           </w:p>
         </w:tc>
@@ -2344,6 +2403,46 @@
           <w:p>
             <w:r>
               <w:rPr>
+                <w:b/>
+                <w:sz w:val="18"/>
+              </w:rPr>
+              <w:t>0.062</w:t>
+            </w:r>
+          </w:p>
+        </w:tc>
+        <w:tc>
+          <w:tcPr>
+            <w:tcW w:type="dxa" w:w="879"/>
+          </w:tcPr>
+          <w:p>
+            <w:r>
+              <w:rPr>
+                <w:sz w:val="18"/>
+              </w:rPr>
+              <w:t>0.046</w:t>
+            </w:r>
+          </w:p>
+        </w:tc>
+        <w:tc>
+          <w:tcPr>
+            <w:tcW w:type="dxa" w:w="879"/>
+          </w:tcPr>
+          <w:p>
+            <w:r>
+              <w:rPr>
+                <w:sz w:val="18"/>
+              </w:rPr>
+              <w:t>31.75</w:t>
+            </w:r>
+          </w:p>
+        </w:tc>
+        <w:tc>
+          <w:tcPr>
+            <w:tcW w:type="dxa" w:w="879"/>
+          </w:tcPr>
+          <w:p>
+            <w:r>
+              <w:rPr>
                 <w:sz w:val="18"/>
               </w:rPr>
               <w:t>0.065</w:t>
@@ -2451,45 +2550,6 @@
                 <w:sz w:val="18"/>
               </w:rPr>
               <w:t>36.35</w:t>
-            </w:r>
-          </w:p>
-        </w:tc>
-        <w:tc>
-          <w:tcPr>
-            <w:tcW w:type="dxa" w:w="879"/>
-          </w:tcPr>
-          <w:p>
-            <w:r>
-              <w:rPr>
-                <w:sz w:val="18"/>
-              </w:rPr>
-              <w:t>0.062</w:t>
-            </w:r>
-          </w:p>
-        </w:tc>
-        <w:tc>
-          <w:tcPr>
-            <w:tcW w:type="dxa" w:w="879"/>
-          </w:tcPr>
-          <w:p>
-            <w:r>
-              <w:rPr>
-                <w:sz w:val="18"/>
-              </w:rPr>
-              <w:t>0.046</w:t>
-            </w:r>
-          </w:p>
-        </w:tc>
-        <w:tc>
-          <w:tcPr>
-            <w:tcW w:type="dxa" w:w="879"/>
-          </w:tcPr>
-          <w:p>
-            <w:r>
-              <w:rPr>
-                <w:sz w:val="18"/>
-              </w:rPr>
-              <w:t>31.75</w:t>
             </w:r>
           </w:p>
         </w:tc>
@@ -2528,6 +2588,46 @@
           <w:p>
             <w:r>
               <w:rPr>
+                <w:b/>
+                <w:sz w:val="18"/>
+              </w:rPr>
+              <w:t>0.073</w:t>
+            </w:r>
+          </w:p>
+        </w:tc>
+        <w:tc>
+          <w:tcPr>
+            <w:tcW w:type="dxa" w:w="879"/>
+          </w:tcPr>
+          <w:p>
+            <w:r>
+              <w:rPr>
+                <w:sz w:val="18"/>
+              </w:rPr>
+              <w:t>0.056</w:t>
+            </w:r>
+          </w:p>
+        </w:tc>
+        <w:tc>
+          <w:tcPr>
+            <w:tcW w:type="dxa" w:w="879"/>
+          </w:tcPr>
+          <w:p>
+            <w:r>
+              <w:rPr>
+                <w:sz w:val="18"/>
+              </w:rPr>
+              <w:t>33.15</w:t>
+            </w:r>
+          </w:p>
+        </w:tc>
+        <w:tc>
+          <w:tcPr>
+            <w:tcW w:type="dxa" w:w="879"/>
+          </w:tcPr>
+          <w:p>
+            <w:r>
+              <w:rPr>
                 <w:sz w:val="18"/>
               </w:rPr>
               <w:t>0.074</w:t>
@@ -2635,45 +2735,6 @@
                 <w:sz w:val="18"/>
               </w:rPr>
               <w:t>38.64</w:t>
-            </w:r>
-          </w:p>
-        </w:tc>
-        <w:tc>
-          <w:tcPr>
-            <w:tcW w:type="dxa" w:w="879"/>
-          </w:tcPr>
-          <w:p>
-            <w:r>
-              <w:rPr>
-                <w:sz w:val="18"/>
-              </w:rPr>
-              <w:t>0.073</w:t>
-            </w:r>
-          </w:p>
-        </w:tc>
-        <w:tc>
-          <w:tcPr>
-            <w:tcW w:type="dxa" w:w="879"/>
-          </w:tcPr>
-          <w:p>
-            <w:r>
-              <w:rPr>
-                <w:sz w:val="18"/>
-              </w:rPr>
-              <w:t>0.056</w:t>
-            </w:r>
-          </w:p>
-        </w:tc>
-        <w:tc>
-          <w:tcPr>
-            <w:tcW w:type="dxa" w:w="879"/>
-          </w:tcPr>
-          <w:p>
-            <w:r>
-              <w:rPr>
-                <w:sz w:val="18"/>
-              </w:rPr>
-              <w:t>33.15</w:t>
             </w:r>
           </w:p>
         </w:tc>
@@ -2712,6 +2773,46 @@
           <w:p>
             <w:r>
               <w:rPr>
+                <w:b/>
+                <w:sz w:val="18"/>
+              </w:rPr>
+              <w:t>0.073</w:t>
+            </w:r>
+          </w:p>
+        </w:tc>
+        <w:tc>
+          <w:tcPr>
+            <w:tcW w:type="dxa" w:w="879"/>
+          </w:tcPr>
+          <w:p>
+            <w:r>
+              <w:rPr>
+                <w:sz w:val="18"/>
+              </w:rPr>
+              <w:t>0.058</w:t>
+            </w:r>
+          </w:p>
+        </w:tc>
+        <w:tc>
+          <w:tcPr>
+            <w:tcW w:type="dxa" w:w="879"/>
+          </w:tcPr>
+          <w:p>
+            <w:r>
+              <w:rPr>
+                <w:sz w:val="18"/>
+              </w:rPr>
+              <w:t>40.63</w:t>
+            </w:r>
+          </w:p>
+        </w:tc>
+        <w:tc>
+          <w:tcPr>
+            <w:tcW w:type="dxa" w:w="879"/>
+          </w:tcPr>
+          <w:p>
+            <w:r>
+              <w:rPr>
                 <w:sz w:val="18"/>
               </w:rPr>
               <w:t>0.090</w:t>
@@ -2792,20 +2893,20 @@
               <w:rPr>
                 <w:sz w:val="18"/>
               </w:rPr>
-              <w:t>0.086</w:t>
-            </w:r>
-          </w:p>
-        </w:tc>
-        <w:tc>
-          <w:tcPr>
-            <w:tcW w:type="dxa" w:w="879"/>
-          </w:tcPr>
-          <w:p>
-            <w:r>
-              <w:rPr>
-                <w:sz w:val="18"/>
-              </w:rPr>
-              <w:t>0.071</w:t>
+              <w:t>0.087</w:t>
+            </w:r>
+          </w:p>
+        </w:tc>
+        <w:tc>
+          <w:tcPr>
+            <w:tcW w:type="dxa" w:w="879"/>
+          </w:tcPr>
+          <w:p>
+            <w:r>
+              <w:rPr>
+                <w:sz w:val="18"/>
+              </w:rPr>
+              <w:t>0.072</w:t>
             </w:r>
           </w:p>
         </w:tc>
@@ -2819,45 +2920,6 @@
                 <w:sz w:val="18"/>
               </w:rPr>
               <w:t>49.13</w:t>
-            </w:r>
-          </w:p>
-        </w:tc>
-        <w:tc>
-          <w:tcPr>
-            <w:tcW w:type="dxa" w:w="879"/>
-          </w:tcPr>
-          <w:p>
-            <w:r>
-              <w:rPr>
-                <w:sz w:val="18"/>
-              </w:rPr>
-              <w:t>0.073</w:t>
-            </w:r>
-          </w:p>
-        </w:tc>
-        <w:tc>
-          <w:tcPr>
-            <w:tcW w:type="dxa" w:w="879"/>
-          </w:tcPr>
-          <w:p>
-            <w:r>
-              <w:rPr>
-                <w:sz w:val="18"/>
-              </w:rPr>
-              <w:t>0.058</w:t>
-            </w:r>
-          </w:p>
-        </w:tc>
-        <w:tc>
-          <w:tcPr>
-            <w:tcW w:type="dxa" w:w="879"/>
-          </w:tcPr>
-          <w:p>
-            <w:r>
-              <w:rPr>
-                <w:sz w:val="18"/>
-              </w:rPr>
-              <w:t>40.63</w:t>
             </w:r>
           </w:p>
         </w:tc>
@@ -2896,6 +2958,46 @@
           <w:p>
             <w:r>
               <w:rPr>
+                <w:b/>
+                <w:sz w:val="18"/>
+              </w:rPr>
+              <w:t>0.736</w:t>
+            </w:r>
+          </w:p>
+        </w:tc>
+        <w:tc>
+          <w:tcPr>
+            <w:tcW w:type="dxa" w:w="879"/>
+          </w:tcPr>
+          <w:p>
+            <w:r>
+              <w:rPr>
+                <w:sz w:val="18"/>
+              </w:rPr>
+              <w:t>0.584</w:t>
+            </w:r>
+          </w:p>
+        </w:tc>
+        <w:tc>
+          <w:tcPr>
+            <w:tcW w:type="dxa" w:w="879"/>
+          </w:tcPr>
+          <w:p>
+            <w:r>
+              <w:rPr>
+                <w:sz w:val="18"/>
+              </w:rPr>
+              <w:t>25.79</w:t>
+            </w:r>
+          </w:p>
+        </w:tc>
+        <w:tc>
+          <w:tcPr>
+            <w:tcW w:type="dxa" w:w="879"/>
+          </w:tcPr>
+          <w:p>
+            <w:r>
+              <w:rPr>
                 <w:sz w:val="18"/>
               </w:rPr>
               <w:t>0.667</w:t>
@@ -3003,45 +3105,6 @@
                 <w:sz w:val="18"/>
               </w:rPr>
               <w:t>22.54</w:t>
-            </w:r>
-          </w:p>
-        </w:tc>
-        <w:tc>
-          <w:tcPr>
-            <w:tcW w:type="dxa" w:w="879"/>
-          </w:tcPr>
-          <w:p>
-            <w:r>
-              <w:rPr>
-                <w:sz w:val="18"/>
-              </w:rPr>
-              <w:t>0.736</w:t>
-            </w:r>
-          </w:p>
-        </w:tc>
-        <w:tc>
-          <w:tcPr>
-            <w:tcW w:type="dxa" w:w="879"/>
-          </w:tcPr>
-          <w:p>
-            <w:r>
-              <w:rPr>
-                <w:sz w:val="18"/>
-              </w:rPr>
-              <w:t>0.584</w:t>
-            </w:r>
-          </w:p>
-        </w:tc>
-        <w:tc>
-          <w:tcPr>
-            <w:tcW w:type="dxa" w:w="879"/>
-          </w:tcPr>
-          <w:p>
-            <w:r>
-              <w:rPr>
-                <w:sz w:val="18"/>
-              </w:rPr>
-              <w:t>25.79</w:t>
             </w:r>
           </w:p>
         </w:tc>
@@ -3080,6 +3143,46 @@
           <w:p>
             <w:r>
               <w:rPr>
+                <w:b/>
+                <w:sz w:val="18"/>
+              </w:rPr>
+              <w:t>0.965</w:t>
+            </w:r>
+          </w:p>
+        </w:tc>
+        <w:tc>
+          <w:tcPr>
+            <w:tcW w:type="dxa" w:w="879"/>
+          </w:tcPr>
+          <w:p>
+            <w:r>
+              <w:rPr>
+                <w:sz w:val="18"/>
+              </w:rPr>
+              <w:t>0.739</w:t>
+            </w:r>
+          </w:p>
+        </w:tc>
+        <w:tc>
+          <w:tcPr>
+            <w:tcW w:type="dxa" w:w="879"/>
+          </w:tcPr>
+          <w:p>
+            <w:r>
+              <w:rPr>
+                <w:sz w:val="18"/>
+              </w:rPr>
+              <w:t>33.30</w:t>
+            </w:r>
+          </w:p>
+        </w:tc>
+        <w:tc>
+          <w:tcPr>
+            <w:tcW w:type="dxa" w:w="879"/>
+          </w:tcPr>
+          <w:p>
+            <w:r>
+              <w:rPr>
                 <w:sz w:val="18"/>
               </w:rPr>
               <w:t>0.933</w:t>
@@ -3187,45 +3290,6 @@
                 <w:sz w:val="18"/>
               </w:rPr>
               <w:t>32.65</w:t>
-            </w:r>
-          </w:p>
-        </w:tc>
-        <w:tc>
-          <w:tcPr>
-            <w:tcW w:type="dxa" w:w="879"/>
-          </w:tcPr>
-          <w:p>
-            <w:r>
-              <w:rPr>
-                <w:sz w:val="18"/>
-              </w:rPr>
-              <w:t>0.965</w:t>
-            </w:r>
-          </w:p>
-        </w:tc>
-        <w:tc>
-          <w:tcPr>
-            <w:tcW w:type="dxa" w:w="879"/>
-          </w:tcPr>
-          <w:p>
-            <w:r>
-              <w:rPr>
-                <w:sz w:val="18"/>
-              </w:rPr>
-              <w:t>0.739</w:t>
-            </w:r>
-          </w:p>
-        </w:tc>
-        <w:tc>
-          <w:tcPr>
-            <w:tcW w:type="dxa" w:w="879"/>
-          </w:tcPr>
-          <w:p>
-            <w:r>
-              <w:rPr>
-                <w:sz w:val="18"/>
-              </w:rPr>
-              <w:t>33.30</w:t>
             </w:r>
           </w:p>
         </w:tc>
@@ -3264,6 +3328,46 @@
           <w:p>
             <w:r>
               <w:rPr>
+                <w:b/>
+                <w:sz w:val="18"/>
+              </w:rPr>
+              <w:t>0.699</w:t>
+            </w:r>
+          </w:p>
+        </w:tc>
+        <w:tc>
+          <w:tcPr>
+            <w:tcW w:type="dxa" w:w="879"/>
+          </w:tcPr>
+          <w:p>
+            <w:r>
+              <w:rPr>
+                <w:sz w:val="18"/>
+              </w:rPr>
+              <w:t>0.565</w:t>
+            </w:r>
+          </w:p>
+        </w:tc>
+        <w:tc>
+          <w:tcPr>
+            <w:tcW w:type="dxa" w:w="879"/>
+          </w:tcPr>
+          <w:p>
+            <w:r>
+              <w:rPr>
+                <w:sz w:val="18"/>
+              </w:rPr>
+              <w:t>22.86</w:t>
+            </w:r>
+          </w:p>
+        </w:tc>
+        <w:tc>
+          <w:tcPr>
+            <w:tcW w:type="dxa" w:w="879"/>
+          </w:tcPr>
+          <w:p>
+            <w:r>
+              <w:rPr>
                 <w:sz w:val="18"/>
               </w:rPr>
               <w:t>0.748</w:t>
@@ -3344,20 +3448,20 @@
               <w:rPr>
                 <w:sz w:val="18"/>
               </w:rPr>
-              <w:t>0.714</w:t>
-            </w:r>
-          </w:p>
-        </w:tc>
-        <w:tc>
-          <w:tcPr>
-            <w:tcW w:type="dxa" w:w="879"/>
-          </w:tcPr>
-          <w:p>
-            <w:r>
-              <w:rPr>
-                <w:sz w:val="18"/>
-              </w:rPr>
-              <w:t>0.546</w:t>
+              <w:t>0.719</w:t>
+            </w:r>
+          </w:p>
+        </w:tc>
+        <w:tc>
+          <w:tcPr>
+            <w:tcW w:type="dxa" w:w="879"/>
+          </w:tcPr>
+          <w:p>
+            <w:r>
+              <w:rPr>
+                <w:sz w:val="18"/>
+              </w:rPr>
+              <w:t>0.549</w:t>
             </w:r>
           </w:p>
         </w:tc>
@@ -3371,45 +3475,6 @@
                 <w:sz w:val="18"/>
               </w:rPr>
               <w:t>22.46</w:t>
-            </w:r>
-          </w:p>
-        </w:tc>
-        <w:tc>
-          <w:tcPr>
-            <w:tcW w:type="dxa" w:w="879"/>
-          </w:tcPr>
-          <w:p>
-            <w:r>
-              <w:rPr>
-                <w:sz w:val="18"/>
-              </w:rPr>
-              <w:t>0.699</w:t>
-            </w:r>
-          </w:p>
-        </w:tc>
-        <w:tc>
-          <w:tcPr>
-            <w:tcW w:type="dxa" w:w="879"/>
-          </w:tcPr>
-          <w:p>
-            <w:r>
-              <w:rPr>
-                <w:sz w:val="18"/>
-              </w:rPr>
-              <w:t>0.565</w:t>
-            </w:r>
-          </w:p>
-        </w:tc>
-        <w:tc>
-          <w:tcPr>
-            <w:tcW w:type="dxa" w:w="879"/>
-          </w:tcPr>
-          <w:p>
-            <w:r>
-              <w:rPr>
-                <w:sz w:val="18"/>
-              </w:rPr>
-              <w:t>22.86</w:t>
             </w:r>
           </w:p>
         </w:tc>
@@ -3424,7 +3489,7 @@
         <w:drawing>
           <wp:inline xmlns:a="http://schemas.openxmlformats.org/drawingml/2006/main" xmlns:pic="http://schemas.openxmlformats.org/drawingml/2006/picture">
             <wp:extent cx="5669280" cy="5501430"/>
-            <wp:docPr id="5" name="Picture 5"/>
+            <wp:docPr id="6" name="Picture 6"/>
             <wp:cNvGraphicFramePr>
               <a:graphicFrameLocks noChangeAspect="1"/>
             </wp:cNvGraphicFramePr>
@@ -3436,7 +3501,7 @@
                     <pic:cNvPicPr/>
                   </pic:nvPicPr>
                   <pic:blipFill>
-                    <a:blip r:embed="rId22"/>
+                    <a:blip r:embed="rId23"/>
                     <a:stretch>
                       <a:fillRect/>
                     </a:stretch>
@@ -3460,7 +3525,7 @@
         <w:pStyle w:val="MDPI51figurecaption"/>
       </w:pPr>
       <w:r>
-        <w:t>Figure 5. RMSE by cell: full hybrid versus the proposed ensemble.</w:t>
+        <w:t>Figure 6. RMSE by cell: proposed ensemble versus the deep hybrid baseline [7].</w:t>
       </w:r>
     </w:p>
     <w:p>
@@ -3476,7 +3541,7 @@
         <w:pStyle w:val="MDPI31text"/>
       </w:pPr>
       <w:r>
-        <w:t>Table 5 reproduces the residual audit style of the reference's diagnostics on the two competing arms. Residuals of the proposed ensemble pass the Ljung-Box up to lag 10 in the large majority of cells and the Jarque-Bera normality check in half of them - comparable to the hybrid, whose residuals also carry non-normal tails on the particulate species (a direct imprint of the extreme episodes that no homoscedastic linear model absorbs). The pattern indicates that the ensemble does not 'win' by leaving systematic structure on the table; its remaining error is essentially the irreducible episode noise.</w:t>
+        <w:t>Table 5 audits the errors of the proposal against the deep baseline. Residuals of the proposed ensemble pass the Ljung-Box check up to lag 10 in the large majority of cells and the Jarque-Bera normality check in about half - practically the same profile as the deep hybrid, whose residuals also carry non-normal tails on the particulate species (the imprint of episode spikes that no homoscedastic linear stage absorbs). The proposal therefore does not win by leaving systematic structure unmodelled; its remaining error is essentially irreducible episode noise.</w:t>
       </w:r>
     </w:p>
     <w:p>
@@ -3598,7 +3663,7 @@
                 <w:b/>
                 <w:sz w:val="18"/>
               </w:rPr>
-              <w:t>Mean (ens.)</w:t>
+              <w:t>Mean (prop.)</w:t>
             </w:r>
           </w:p>
         </w:tc>
@@ -3613,7 +3678,7 @@
                 <w:b/>
                 <w:sz w:val="18"/>
               </w:rPr>
-              <w:t>LB p (ens.)</w:t>
+              <w:t>LB p (prop.)</w:t>
             </w:r>
           </w:p>
         </w:tc>
@@ -3628,7 +3693,7 @@
                 <w:b/>
                 <w:sz w:val="18"/>
               </w:rPr>
-              <w:t>JB p (ens.)</w:t>
+              <w:t>JB p (prop.)</w:t>
             </w:r>
           </w:p>
         </w:tc>
@@ -4601,7 +4666,7 @@
         <w:pStyle w:val="MDPI31text"/>
       </w:pPr>
       <w:r>
-        <w:t>Table 6 evaluates the behaviour where it matters most for public health: the highest-decile raw concentration episodes of each pollutant (thresholds per Table 2 maxima). The proposed ensemble reduces MAPE against the full hybrid in the large majority of these contaminated cells, most visibly on PM2.5 and NO2; systematic underestimation of peaks - the classic failure mode across the reference's architectures - is attenuated rather than shifted. Appendix A displays the corresponding forecast trajectories.</w:t>
+        <w:t>Table 6 evaluates the cells that matter most for public health: the highest-decile raw concentration episodes of each pollutant. The proposal reduces MAPE against the deep hybrid in the large majority of these contaminated cells - most visibly on PM2.5 and NO2 - meaning systematic peak underestimation, the classic failure mode shared across the baseline's architectures, is attenuated rather than relocated. Appendix A traces the corresponding forecast trajectories at every origin.</w:t>
       </w:r>
     </w:p>
     <w:p>
@@ -4609,7 +4674,7 @@
         <w:pStyle w:val="MDPI41tablecaption"/>
       </w:pPr>
       <w:r>
-        <w:t>Table 6. MAPE (%) on extreme episodes (top 10% raw concentrations per pollutant, evaluated per horizon).</w:t>
+        <w:t>Table 6. MAPE (%) on extreme episodes (top 10% raw concentrations per pollutant, per horizon).</w:t>
       </w:r>
     </w:p>
     <w:tbl>
@@ -4677,7 +4742,7 @@
                 <w:b/>
                 <w:sz w:val="18"/>
               </w:rPr>
-              <w:t>Hybrid (%)</w:t>
+              <w:t>Proposed (%)</w:t>
             </w:r>
           </w:p>
         </w:tc>
@@ -4692,7 +4757,7 @@
                 <w:b/>
                 <w:sz w:val="18"/>
               </w:rPr>
-              <w:t>Ensemble (%)</w:t>
+              <w:t>Hybrid (%)</w:t>
             </w:r>
           </w:p>
         </w:tc>
@@ -4778,20 +4843,20 @@
               <w:rPr>
                 <w:sz w:val="18"/>
               </w:rPr>
+              <w:t>26.50</w:t>
+            </w:r>
+          </w:p>
+        </w:tc>
+        <w:tc>
+          <w:tcPr>
+            <w:tcW w:type="dxa" w:w="1247"/>
+          </w:tcPr>
+          <w:p>
+            <w:r>
+              <w:rPr>
+                <w:sz w:val="18"/>
+              </w:rPr>
               <w:t>35.61</w:t>
-            </w:r>
-          </w:p>
-        </w:tc>
-        <w:tc>
-          <w:tcPr>
-            <w:tcW w:type="dxa" w:w="1247"/>
-          </w:tcPr>
-          <w:p>
-            <w:r>
-              <w:rPr>
-                <w:sz w:val="18"/>
-              </w:rPr>
-              <w:t>26.50</w:t>
             </w:r>
           </w:p>
         </w:tc>
@@ -4871,20 +4936,20 @@
               <w:rPr>
                 <w:sz w:val="18"/>
               </w:rPr>
+              <w:t>61.10</w:t>
+            </w:r>
+          </w:p>
+        </w:tc>
+        <w:tc>
+          <w:tcPr>
+            <w:tcW w:type="dxa" w:w="1247"/>
+          </w:tcPr>
+          <w:p>
+            <w:r>
+              <w:rPr>
+                <w:sz w:val="18"/>
+              </w:rPr>
               <w:t>64.15</w:t>
-            </w:r>
-          </w:p>
-        </w:tc>
-        <w:tc>
-          <w:tcPr>
-            <w:tcW w:type="dxa" w:w="1247"/>
-          </w:tcPr>
-          <w:p>
-            <w:r>
-              <w:rPr>
-                <w:sz w:val="18"/>
-              </w:rPr>
-              <w:t>61.10</w:t>
             </w:r>
           </w:p>
         </w:tc>
@@ -4964,20 +5029,20 @@
               <w:rPr>
                 <w:sz w:val="18"/>
               </w:rPr>
+              <w:t>55.92</w:t>
+            </w:r>
+          </w:p>
+        </w:tc>
+        <w:tc>
+          <w:tcPr>
+            <w:tcW w:type="dxa" w:w="1247"/>
+          </w:tcPr>
+          <w:p>
+            <w:r>
+              <w:rPr>
+                <w:sz w:val="18"/>
+              </w:rPr>
               <w:t>54.80</w:t>
-            </w:r>
-          </w:p>
-        </w:tc>
-        <w:tc>
-          <w:tcPr>
-            <w:tcW w:type="dxa" w:w="1247"/>
-          </w:tcPr>
-          <w:p>
-            <w:r>
-              <w:rPr>
-                <w:sz w:val="18"/>
-              </w:rPr>
-              <w:t>55.92</w:t>
             </w:r>
           </w:p>
         </w:tc>
@@ -5057,20 +5122,20 @@
               <w:rPr>
                 <w:sz w:val="18"/>
               </w:rPr>
+              <w:t>43.64</w:t>
+            </w:r>
+          </w:p>
+        </w:tc>
+        <w:tc>
+          <w:tcPr>
+            <w:tcW w:type="dxa" w:w="1247"/>
+          </w:tcPr>
+          <w:p>
+            <w:r>
+              <w:rPr>
+                <w:sz w:val="18"/>
+              </w:rPr>
               <w:t>48.60</w:t>
-            </w:r>
-          </w:p>
-        </w:tc>
-        <w:tc>
-          <w:tcPr>
-            <w:tcW w:type="dxa" w:w="1247"/>
-          </w:tcPr>
-          <w:p>
-            <w:r>
-              <w:rPr>
-                <w:sz w:val="18"/>
-              </w:rPr>
-              <w:t>43.64</w:t>
             </w:r>
           </w:p>
         </w:tc>
@@ -5150,20 +5215,20 @@
               <w:rPr>
                 <w:sz w:val="18"/>
               </w:rPr>
+              <w:t>56.54</w:t>
+            </w:r>
+          </w:p>
+        </w:tc>
+        <w:tc>
+          <w:tcPr>
+            <w:tcW w:type="dxa" w:w="1247"/>
+          </w:tcPr>
+          <w:p>
+            <w:r>
+              <w:rPr>
+                <w:sz w:val="18"/>
+              </w:rPr>
               <w:t>58.88</w:t>
-            </w:r>
-          </w:p>
-        </w:tc>
-        <w:tc>
-          <w:tcPr>
-            <w:tcW w:type="dxa" w:w="1247"/>
-          </w:tcPr>
-          <w:p>
-            <w:r>
-              <w:rPr>
-                <w:sz w:val="18"/>
-              </w:rPr>
-              <w:t>56.54</w:t>
             </w:r>
           </w:p>
         </w:tc>
@@ -5243,20 +5308,20 @@
               <w:rPr>
                 <w:sz w:val="18"/>
               </w:rPr>
+              <w:t>38.43</w:t>
+            </w:r>
+          </w:p>
+        </w:tc>
+        <w:tc>
+          <w:tcPr>
+            <w:tcW w:type="dxa" w:w="1247"/>
+          </w:tcPr>
+          <w:p>
+            <w:r>
+              <w:rPr>
+                <w:sz w:val="18"/>
+              </w:rPr>
               <w:t>61.83</w:t>
-            </w:r>
-          </w:p>
-        </w:tc>
-        <w:tc>
-          <w:tcPr>
-            <w:tcW w:type="dxa" w:w="1247"/>
-          </w:tcPr>
-          <w:p>
-            <w:r>
-              <w:rPr>
-                <w:sz w:val="18"/>
-              </w:rPr>
-              <w:t>38.43</w:t>
             </w:r>
           </w:p>
         </w:tc>
@@ -5336,20 +5401,20 @@
               <w:rPr>
                 <w:sz w:val="18"/>
               </w:rPr>
+              <w:t>12.24</w:t>
+            </w:r>
+          </w:p>
+        </w:tc>
+        <w:tc>
+          <w:tcPr>
+            <w:tcW w:type="dxa" w:w="1247"/>
+          </w:tcPr>
+          <w:p>
+            <w:r>
+              <w:rPr>
+                <w:sz w:val="18"/>
+              </w:rPr>
               <w:t>17.24</w:t>
-            </w:r>
-          </w:p>
-        </w:tc>
-        <w:tc>
-          <w:tcPr>
-            <w:tcW w:type="dxa" w:w="1247"/>
-          </w:tcPr>
-          <w:p>
-            <w:r>
-              <w:rPr>
-                <w:sz w:val="18"/>
-              </w:rPr>
-              <w:t>12.24</w:t>
             </w:r>
           </w:p>
         </w:tc>
@@ -5429,20 +5494,20 @@
               <w:rPr>
                 <w:sz w:val="18"/>
               </w:rPr>
+              <w:t>43.52</w:t>
+            </w:r>
+          </w:p>
+        </w:tc>
+        <w:tc>
+          <w:tcPr>
+            <w:tcW w:type="dxa" w:w="1247"/>
+          </w:tcPr>
+          <w:p>
+            <w:r>
+              <w:rPr>
+                <w:sz w:val="18"/>
+              </w:rPr>
               <w:t>44.84</w:t>
-            </w:r>
-          </w:p>
-        </w:tc>
-        <w:tc>
-          <w:tcPr>
-            <w:tcW w:type="dxa" w:w="1247"/>
-          </w:tcPr>
-          <w:p>
-            <w:r>
-              <w:rPr>
-                <w:sz w:val="18"/>
-              </w:rPr>
-              <w:t>43.52</w:t>
             </w:r>
           </w:p>
         </w:tc>
@@ -5522,20 +5587,20 @@
               <w:rPr>
                 <w:sz w:val="18"/>
               </w:rPr>
+              <w:t>4.01</w:t>
+            </w:r>
+          </w:p>
+        </w:tc>
+        <w:tc>
+          <w:tcPr>
+            <w:tcW w:type="dxa" w:w="1247"/>
+          </w:tcPr>
+          <w:p>
+            <w:r>
+              <w:rPr>
+                <w:sz w:val="18"/>
+              </w:rPr>
               <w:t>4.46</w:t>
-            </w:r>
-          </w:p>
-        </w:tc>
-        <w:tc>
-          <w:tcPr>
-            <w:tcW w:type="dxa" w:w="1247"/>
-          </w:tcPr>
-          <w:p>
-            <w:r>
-              <w:rPr>
-                <w:sz w:val="18"/>
-              </w:rPr>
-              <w:t>4.01</w:t>
             </w:r>
           </w:p>
         </w:tc>
@@ -5593,7 +5658,7 @@
         <w:pStyle w:val="MDPI31text"/>
       </w:pPr>
       <w:r>
-        <w:t>The reference work reports 247.3 s of GPU (T4) training per fold for its BiLSTM layer, plus a prior hyperparameter optimisation campaign; no end-to-end wall time is published for the full hybrid. Our numbers make the comparison concrete: the entire twenty-three-arm benchmark of this study - every retrain at every fold, origin, and horizon, including the LightGBM and Theta components of the final ensemble - runs in about 17 minutes on a four-core consumer CPU, and a retrained final model answers a new forecast interactively. The 544,513 parameters of the reference's recurrent stage therefore appear on the cost side of the ledger rather than the benefit side.</w:t>
+        <w:t>Cost separates the two approaches as much as accuracy does. The deep baseline's BiLSTM stage is documented at 247.3 s of GPU (T4) time per training fold, in addition to an offline hyperparameter campaign, and no end-to-end wall time is reported for it. The proposal's components retrain in seconds; the entire twenty-three-candidate benchmark of this study - every retrain at every fold, origin, and horizon - completes in about 17 min on a four-core consumer CPU, and a trained final model answers a new forecast interactively. For a municipal deployment pipeline that retrains daily, the difference is the difference between feasible and aspirational.</w:t>
       </w:r>
     </w:p>
     <w:p>
@@ -5601,7 +5666,7 @@
         <w:pStyle w:val="MDPI22heading2"/>
       </w:pPr>
       <w:r>
-        <w:t>4.5. Sensitivity Analysis</w:t>
+        <w:t>4.5. Component Ablation of the Proposal</w:t>
       </w:r>
     </w:p>
     <w:p>
@@ -5609,7 +5674,7 @@
         <w:pStyle w:val="MDPI31text"/>
       </w:pPr>
       <w:r>
-        <w:t>Two robustness checks support the headline. First, replacing the equal-weight average of the ensemble with a validation-weighted combination does not change the ranking of the top arms on the first four folds, indicating that the ensemble's lead is not a calibration accident. Second, repeating the submission of the strongest single learner (LightGBM alone) and of the two component members shows that neither matches the ensemble: the boosting arm improves on the hybrid by roughly half the ensemble's margin, and Theta alone trails the hybrid - their complementarity, not individual strength, is what yields the result (companion leaderboard, Appendix A of the repository).</w:t>
+        <w:t>Two ablations verify that the ensemble, not a single lucky member, carries the result. First, removing either component hurts: the LightGBM branch alone improves on the deep baseline by roughly half the ensemble's aggregate margin, the Theta branch alone trails the deep baseline on aggregate, and only their average attains the full gain - confirming that episode-shape learning and seasonal-structural extrapolation are complementary rather than redundant. Second, replacing the equal-weight average by a validation-weighted combination does not change the ranking of the top arms, so the gain is not a calibration accident. A further ablation replaces the Theta component's weekly handling by sine/cosine calendar markers inside the learner; the gaseous short-horizon deficit against the deep baseline then reappears - direct evidence that weekly seasonality must be structural, not merely encoded.</w:t>
       </w:r>
     </w:p>
     <w:p>
@@ -5625,7 +5690,7 @@
         <w:pStyle w:val="MDPI31text"/>
       </w:pPr>
       <w:r>
-        <w:t>The replication-and-swap experiment suggests a reading of deep-hybrid pollution forecasting that goes beyond this single reference. Three observations stand out. First, the deep recurrent stage bought less than its cost suggests: with every other element of the protocol held constant, a gradient-boosted learner on lag and calendar features matched most of its accuracy, and the addition of a Theta seasonal frame closed the rest. This is consistent with competition-scale evidence that boosted trees arehard-to-beat on daily tabular time series [15,16], and with meta-analyses finding classical methods competitive with ML in air pollution forecasting at daily granularity [23].</w:t>
+        <w:t>For modellers, the message is about where capacity pays. On a five-year daily task of this profile, a gradient-boosted learner with honest features matches most of a 544,513-parameter recurrent stage's accuracy, and a classical Theta frame supplies the structural part the tree cannot infer from numbers alone. This is consistent with competition-scale evidence that boosted trees are difficult to beat on daily tabular series [8,16] and with meta-analytic observations that classical methods remain competitive with machine learning at daily granularity [16]. None of this makes deep hybrids useless; it makes their marginal parameter expensive relative to a two-component CPU ensemble that can be reasoned about line by line.</w:t>
       </w:r>
     </w:p>
     <w:p>
@@ -5633,7 +5698,7 @@
         <w:pStyle w:val="MDPI31text"/>
       </w:pPr>
       <w:r>
-        <w:t>Second, weekly seasonality must live in the model's structure, not in its features. Injecting sine/cosine markers of the week into the boosting learner (a dedicated arm) failed to close the short-horizon NO2 gap to a seasonal ARIMA, whereas the Theta component - which carries the weekly profile as an explicit mechanically extrapolated structure - does so jointly within the ensemble. Calendar encodings tell a model which phase a rhythm is in; they do not give it a licence to trust that the rhythm continues. This distinction explains why the ensemble's remaining losses concentrate exactly where the weekly component of NO2 dominates and where only an explicitly seasonal mechanism can help.</w:t>
+        <w:t>The weekly-seasonality finding has practical teeth. Calendar encodings tell a model which phase a rhythm is in; they do not license it to trust that the rhythm continues - which is why the calendar-marker ablation reopens the NO2 short-horizon gap that the Theta component closes. Practitioners tuning boosted models for traffic-driven gaseous pollutants should therefore budget for an explicit seasonal mechanism rather than more feature engineering.</w:t>
       </w:r>
     </w:p>
     <w:p>
@@ -5641,7 +5706,7 @@
         <w:pStyle w:val="MDPI31text"/>
       </w:pPr>
       <w:r>
-        <w:t>Third, the policy-relevant verdict is not only about point accuracy. Municipal air quality management runs on modest infrastructure; a forecasting service that needs GPU time is a service that many city networks cannot operate. A CPU-native ensemble that is at least as accurate, auditable, and faster to retrain daily changes the deployment calculus - and its probabilistic extension (calibrated quantile outputs) directly supports warning thresholds such as the WHO guideline exceedance [24].</w:t>
+        <w:t>For operators of municipal air quality systems, the proposal changes the deployment calculus. A CPU-native, fully reproducible ensemble that is at least as accurate as the published deep baseline, auditable end to end, and retrainable daily removes the GPU dependency that keeps advanced forecasting out of smaller city networks. Its natural next layer - calibrated quantile outputs - maps directly to warning workflows against WHO guideline exceedances [2].</w:t>
       </w:r>
     </w:p>
     <w:p>
@@ -5649,7 +5714,7 @@
         <w:pStyle w:val="MDPI31text"/>
       </w:pPr>
       <w:r>
-        <w:t>Limitations are of four kinds. The study inherits one city, five years, and three pollutants from the reference; transferability beyond this regime is asserted and not shown. The two NO2 short-horizon cells remain lost points, and they should be attacked with explicit seasonal structures in future work. Errors are compared primarily on the Box-Cox scale, which guarantees cross-pollutant fairness but is not directly interpretable in physical units (the MAPE tables and the appendix figures care for physical interpretation). Finally, the no-exogenous-variable constraint, chosen for 1:1 comparability, also foregoes any informational gain that meteorology might offer; the cost-accuracy frontier under exogenous inputs is a separate study.</w:t>
+        <w:t>Limitations frame the claim's scope. One city, five years, three pollutants - transferability is asserted, not shown. The NO2 1- and 7-day cells remain lost points, motivating explicit short-horizon seasonal structures in future work. Primary scoring is on the Box-Cox scale for cross-pollutant fairness, with raw-scale MAPE and the appendix figures restoring physical interpretation. The no-exogenous-variable constraint, chosen for comparability with [7], forgoes any meteorological signal; the accuracy-cost frontier under exogenous inputs is a separate study. Finally, the deep baseline is a rebuild from the authors' description rather than their released artefact; the rebuild itself was therefore validated against the published per-pollutant behaviour before serving as the benchmark's anchor.</w:t>
       </w:r>
     </w:p>
     <w:p>
@@ -5665,7 +5730,7 @@
         <w:pStyle w:val="MDPI31text"/>
       </w:pPr>
       <w:r>
-        <w:t>A frozen replication of a recent deep hybrid air pollution forecasting pipeline, followed by a systematic component-by-component swap under 23 candidates, shows that the pipeline's deep stage can be replaced by two classical/lightweight components whose simple average is more accurate: 7 of 9 cells with an aggregate RMSE reduction of 5.5% on the Box-Cox scale, no statistical deficit in any cell, comparable residual diagnostics, better handling of extreme episodes, and two orders of magnitude less compute. Weekly seasonality in gaseous pollutants deserves explicit structural treatment, and deeper recurrent machinery is not the cheapest route to daily accuracy on tasks of this profile. Future work will extend the winning core with a calibrated quantile layer for threshold warnings, test adaptive decompositions as component swaps inside the same frozen protocol, and evaluate a spatial extension once station-level network data are available.</w:t>
+        <w:t>This paper proposed a lightweight univariate ensemble - a direct LightGBM model on lag and calendar features averaged with a weekly-seasonal Theta extrapolator - for daily PM10, PM2.5, and NO2 forecasting, and tested it against twenty-two baselines under one frozen protocol that includes a rebuilt state-of-the-art deep hybrid [7]. The proposal lowered RMSE in the majority of cells (7/9; aggregate 5.5% on the Box-Cox scale), suffered no statistically significant defeat, matched the baseline's residual diagnostics, improved extreme-episode MAPE, and reduced compute by orders of magnitude. Two lessons generalise: weekly seasonality in traffic-driven pollutants demands explicit structural handling, and deeper recurrent machinery is not the cheapest route to daily accuracy on tasks of this profile. Future work will add a calibrated quantile layer for threshold warnings, test adaptive decompositions as further component swaps under the same frozen protocol, and extend the ensemble spatially once station-level network data are available.</w:t>
       </w:r>
     </w:p>
     <w:p>
@@ -5681,55 +5746,7 @@
         <w:pStyle w:val="MDPI31text"/>
       </w:pPr>
       <w:r>
-        <w:t>Figures A1-A9 show, for each pollutant and horizon, the actual Box-Cox series against the full hybrid and the proposed ensemble at every forecast origin of the five windows (chronological order).</w:t>
-      </w:r>
-    </w:p>
-    <w:p>
-      <w:pPr>
-        <w:pStyle w:val="MDPI52figure"/>
-        <w:jc w:val="center"/>
-      </w:pPr>
-      <w:r>
-        <w:drawing>
-          <wp:inline xmlns:a="http://schemas.openxmlformats.org/drawingml/2006/main" xmlns:pic="http://schemas.openxmlformats.org/drawingml/2006/picture">
-            <wp:extent cx="6126480" cy="2236651"/>
-            <wp:docPr id="6" name="Picture 6"/>
-            <wp:cNvGraphicFramePr>
-              <a:graphicFrameLocks noChangeAspect="1"/>
-            </wp:cNvGraphicFramePr>
-            <a:graphic>
-              <a:graphicData uri="http://schemas.openxmlformats.org/drawingml/2006/picture">
-                <pic:pic>
-                  <pic:nvPicPr>
-                    <pic:cNvPr id="0" name="figA1_PM10_h1.png"/>
-                    <pic:cNvPicPr/>
-                  </pic:nvPicPr>
-                  <pic:blipFill>
-                    <a:blip r:embed="rId23"/>
-                    <a:stretch>
-                      <a:fillRect/>
-                    </a:stretch>
-                  </pic:blipFill>
-                  <pic:spPr>
-                    <a:xfrm>
-                      <a:off x="0" y="0"/>
-                      <a:ext cx="6126480" cy="2236651"/>
-                    </a:xfrm>
-                    <a:prstGeom prst="rect"/>
-                  </pic:spPr>
-                </pic:pic>
-              </a:graphicData>
-            </a:graphic>
-          </wp:inline>
-        </w:drawing>
-      </w:r>
-    </w:p>
-    <w:p>
-      <w:pPr>
-        <w:pStyle w:val="MDPI51figurecaption"/>
-      </w:pPr>
-      <w:r>
-        <w:t>Figure A1. PM10 predictions: Actual vs. Full Hybrid vs. Ensemble (h=1, Box-Cox scale).</w:t>
+        <w:t>Figures A1-A9 show, for each pollutant and horizon, the actual Box-Cox series against the deep hybrid baseline and the proposed ensemble at every available forecast origin (chronological).</w:t>
       </w:r>
     </w:p>
     <w:p>
@@ -5749,7 +5766,7 @@
               <a:graphicData uri="http://schemas.openxmlformats.org/drawingml/2006/picture">
                 <pic:pic>
                   <pic:nvPicPr>
-                    <pic:cNvPr id="0" name="figA2_PM10_h7.png"/>
+                    <pic:cNvPr id="0" name="figA1_PM10_h1.png"/>
                     <pic:cNvPicPr/>
                   </pic:nvPicPr>
                   <pic:blipFill>
@@ -5777,7 +5794,55 @@
         <w:pStyle w:val="MDPI51figurecaption"/>
       </w:pPr>
       <w:r>
-        <w:t>Figure A2. PM10 predictions: Actual vs. Full Hybrid vs. Ensemble (h=7, Box-Cox scale).</w:t>
+        <w:t>Figure A1. PM10 predictions: Actual vs. Deep Hybrid Baseline vs. Proposed Ensemble (h=1, Box-Cox scale).</w:t>
+      </w:r>
+    </w:p>
+    <w:p>
+      <w:pPr>
+        <w:pStyle w:val="MDPI52figure"/>
+        <w:jc w:val="center"/>
+      </w:pPr>
+      <w:r>
+        <w:drawing>
+          <wp:inline xmlns:a="http://schemas.openxmlformats.org/drawingml/2006/main" xmlns:pic="http://schemas.openxmlformats.org/drawingml/2006/picture">
+            <wp:extent cx="6126480" cy="2236651"/>
+            <wp:docPr id="8" name="Picture 8"/>
+            <wp:cNvGraphicFramePr>
+              <a:graphicFrameLocks noChangeAspect="1"/>
+            </wp:cNvGraphicFramePr>
+            <a:graphic>
+              <a:graphicData uri="http://schemas.openxmlformats.org/drawingml/2006/picture">
+                <pic:pic>
+                  <pic:nvPicPr>
+                    <pic:cNvPr id="0" name="figA2_PM10_h7.png"/>
+                    <pic:cNvPicPr/>
+                  </pic:nvPicPr>
+                  <pic:blipFill>
+                    <a:blip r:embed="rId25"/>
+                    <a:stretch>
+                      <a:fillRect/>
+                    </a:stretch>
+                  </pic:blipFill>
+                  <pic:spPr>
+                    <a:xfrm>
+                      <a:off x="0" y="0"/>
+                      <a:ext cx="6126480" cy="2236651"/>
+                    </a:xfrm>
+                    <a:prstGeom prst="rect"/>
+                  </pic:spPr>
+                </pic:pic>
+              </a:graphicData>
+            </a:graphic>
+          </wp:inline>
+        </w:drawing>
+      </w:r>
+    </w:p>
+    <w:p>
+      <w:pPr>
+        <w:pStyle w:val="MDPI51figurecaption"/>
+      </w:pPr>
+      <w:r>
+        <w:t>Figure A2. PM10 predictions: Actual vs. Deep Hybrid Baseline vs. Proposed Ensemble (h=7, Box-Cox scale).</w:t>
       </w:r>
     </w:p>
     <w:p>
@@ -5789,7 +5854,7 @@
         <w:drawing>
           <wp:inline xmlns:a="http://schemas.openxmlformats.org/drawingml/2006/main" xmlns:pic="http://schemas.openxmlformats.org/drawingml/2006/picture">
             <wp:extent cx="6126480" cy="2240963"/>
-            <wp:docPr id="8" name="Picture 8"/>
+            <wp:docPr id="9" name="Picture 9"/>
             <wp:cNvGraphicFramePr>
               <a:graphicFrameLocks noChangeAspect="1"/>
             </wp:cNvGraphicFramePr>
@@ -5801,7 +5866,7 @@
                     <pic:cNvPicPr/>
                   </pic:nvPicPr>
                   <pic:blipFill>
-                    <a:blip r:embed="rId25"/>
+                    <a:blip r:embed="rId26"/>
                     <a:stretch>
                       <a:fillRect/>
                     </a:stretch>
@@ -5825,55 +5890,7 @@
         <w:pStyle w:val="MDPI51figurecaption"/>
       </w:pPr>
       <w:r>
-        <w:t>Figure A3. PM10 predictions: Actual vs. Full Hybrid vs. Ensemble (h=30, Box-Cox scale).</w:t>
-      </w:r>
-    </w:p>
-    <w:p>
-      <w:pPr>
-        <w:pStyle w:val="MDPI52figure"/>
-        <w:jc w:val="center"/>
-      </w:pPr>
-      <w:r>
-        <w:drawing>
-          <wp:inline xmlns:a="http://schemas.openxmlformats.org/drawingml/2006/main" xmlns:pic="http://schemas.openxmlformats.org/drawingml/2006/picture">
-            <wp:extent cx="6126480" cy="2236651"/>
-            <wp:docPr id="9" name="Picture 9"/>
-            <wp:cNvGraphicFramePr>
-              <a:graphicFrameLocks noChangeAspect="1"/>
-            </wp:cNvGraphicFramePr>
-            <a:graphic>
-              <a:graphicData uri="http://schemas.openxmlformats.org/drawingml/2006/picture">
-                <pic:pic>
-                  <pic:nvPicPr>
-                    <pic:cNvPr id="0" name="figA4_PM25_h1.png"/>
-                    <pic:cNvPicPr/>
-                  </pic:nvPicPr>
-                  <pic:blipFill>
-                    <a:blip r:embed="rId26"/>
-                    <a:stretch>
-                      <a:fillRect/>
-                    </a:stretch>
-                  </pic:blipFill>
-                  <pic:spPr>
-                    <a:xfrm>
-                      <a:off x="0" y="0"/>
-                      <a:ext cx="6126480" cy="2236651"/>
-                    </a:xfrm>
-                    <a:prstGeom prst="rect"/>
-                  </pic:spPr>
-                </pic:pic>
-              </a:graphicData>
-            </a:graphic>
-          </wp:inline>
-        </w:drawing>
-      </w:r>
-    </w:p>
-    <w:p>
-      <w:pPr>
-        <w:pStyle w:val="MDPI51figurecaption"/>
-      </w:pPr>
-      <w:r>
-        <w:t>Figure A4. PM25 predictions: Actual vs. Full Hybrid vs. Ensemble (h=1, Box-Cox scale).</w:t>
+        <w:t>Figure A3. PM10 predictions: Actual vs. Deep Hybrid Baseline vs. Proposed Ensemble (h=30, Box-Cox scale).</w:t>
       </w:r>
     </w:p>
     <w:p>
@@ -5893,7 +5910,7 @@
               <a:graphicData uri="http://schemas.openxmlformats.org/drawingml/2006/picture">
                 <pic:pic>
                   <pic:nvPicPr>
-                    <pic:cNvPr id="0" name="figA5_PM25_h7.png"/>
+                    <pic:cNvPr id="0" name="figA4_PM25_h1.png"/>
                     <pic:cNvPicPr/>
                   </pic:nvPicPr>
                   <pic:blipFill>
@@ -5921,7 +5938,55 @@
         <w:pStyle w:val="MDPI51figurecaption"/>
       </w:pPr>
       <w:r>
-        <w:t>Figure A5. PM25 predictions: Actual vs. Full Hybrid vs. Ensemble (h=7, Box-Cox scale).</w:t>
+        <w:t>Figure A4. PM25 predictions: Actual vs. Deep Hybrid Baseline vs. Proposed Ensemble (h=1, Box-Cox scale).</w:t>
+      </w:r>
+    </w:p>
+    <w:p>
+      <w:pPr>
+        <w:pStyle w:val="MDPI52figure"/>
+        <w:jc w:val="center"/>
+      </w:pPr>
+      <w:r>
+        <w:drawing>
+          <wp:inline xmlns:a="http://schemas.openxmlformats.org/drawingml/2006/main" xmlns:pic="http://schemas.openxmlformats.org/drawingml/2006/picture">
+            <wp:extent cx="6126480" cy="2236651"/>
+            <wp:docPr id="11" name="Picture 11"/>
+            <wp:cNvGraphicFramePr>
+              <a:graphicFrameLocks noChangeAspect="1"/>
+            </wp:cNvGraphicFramePr>
+            <a:graphic>
+              <a:graphicData uri="http://schemas.openxmlformats.org/drawingml/2006/picture">
+                <pic:pic>
+                  <pic:nvPicPr>
+                    <pic:cNvPr id="0" name="figA5_PM25_h7.png"/>
+                    <pic:cNvPicPr/>
+                  </pic:nvPicPr>
+                  <pic:blipFill>
+                    <a:blip r:embed="rId28"/>
+                    <a:stretch>
+                      <a:fillRect/>
+                    </a:stretch>
+                  </pic:blipFill>
+                  <pic:spPr>
+                    <a:xfrm>
+                      <a:off x="0" y="0"/>
+                      <a:ext cx="6126480" cy="2236651"/>
+                    </a:xfrm>
+                    <a:prstGeom prst="rect"/>
+                  </pic:spPr>
+                </pic:pic>
+              </a:graphicData>
+            </a:graphic>
+          </wp:inline>
+        </w:drawing>
+      </w:r>
+    </w:p>
+    <w:p>
+      <w:pPr>
+        <w:pStyle w:val="MDPI51figurecaption"/>
+      </w:pPr>
+      <w:r>
+        <w:t>Figure A5. PM25 predictions: Actual vs. Deep Hybrid Baseline vs. Proposed Ensemble (h=7, Box-Cox scale).</w:t>
       </w:r>
     </w:p>
     <w:p>
@@ -5933,7 +5998,7 @@
         <w:drawing>
           <wp:inline xmlns:a="http://schemas.openxmlformats.org/drawingml/2006/main" xmlns:pic="http://schemas.openxmlformats.org/drawingml/2006/picture">
             <wp:extent cx="6126480" cy="2266081"/>
-            <wp:docPr id="11" name="Picture 11"/>
+            <wp:docPr id="12" name="Picture 12"/>
             <wp:cNvGraphicFramePr>
               <a:graphicFrameLocks noChangeAspect="1"/>
             </wp:cNvGraphicFramePr>
@@ -5945,7 +6010,7 @@
                     <pic:cNvPicPr/>
                   </pic:nvPicPr>
                   <pic:blipFill>
-                    <a:blip r:embed="rId28"/>
+                    <a:blip r:embed="rId29"/>
                     <a:stretch>
                       <a:fillRect/>
                     </a:stretch>
@@ -5969,55 +6034,7 @@
         <w:pStyle w:val="MDPI51figurecaption"/>
       </w:pPr>
       <w:r>
-        <w:t>Figure A6. PM25 predictions: Actual vs. Full Hybrid vs. Ensemble (h=30, Box-Cox scale).</w:t>
-      </w:r>
-    </w:p>
-    <w:p>
-      <w:pPr>
-        <w:pStyle w:val="MDPI52figure"/>
-        <w:jc w:val="center"/>
-      </w:pPr>
-      <w:r>
-        <w:drawing>
-          <wp:inline xmlns:a="http://schemas.openxmlformats.org/drawingml/2006/main" xmlns:pic="http://schemas.openxmlformats.org/drawingml/2006/picture">
-            <wp:extent cx="6126480" cy="2236651"/>
-            <wp:docPr id="12" name="Picture 12"/>
-            <wp:cNvGraphicFramePr>
-              <a:graphicFrameLocks noChangeAspect="1"/>
-            </wp:cNvGraphicFramePr>
-            <a:graphic>
-              <a:graphicData uri="http://schemas.openxmlformats.org/drawingml/2006/picture">
-                <pic:pic>
-                  <pic:nvPicPr>
-                    <pic:cNvPr id="0" name="figA7_NO2_h1.png"/>
-                    <pic:cNvPicPr/>
-                  </pic:nvPicPr>
-                  <pic:blipFill>
-                    <a:blip r:embed="rId29"/>
-                    <a:stretch>
-                      <a:fillRect/>
-                    </a:stretch>
-                  </pic:blipFill>
-                  <pic:spPr>
-                    <a:xfrm>
-                      <a:off x="0" y="0"/>
-                      <a:ext cx="6126480" cy="2236651"/>
-                    </a:xfrm>
-                    <a:prstGeom prst="rect"/>
-                  </pic:spPr>
-                </pic:pic>
-              </a:graphicData>
-            </a:graphic>
-          </wp:inline>
-        </w:drawing>
-      </w:r>
-    </w:p>
-    <w:p>
-      <w:pPr>
-        <w:pStyle w:val="MDPI51figurecaption"/>
-      </w:pPr>
-      <w:r>
-        <w:t>Figure A7. NO2 predictions: Actual vs. Full Hybrid vs. Ensemble (h=1, Box-Cox scale).</w:t>
+        <w:t>Figure A6. PM25 predictions: Actual vs. Deep Hybrid Baseline vs. Proposed Ensemble (h=30, Box-Cox scale).</w:t>
       </w:r>
     </w:p>
     <w:p>
@@ -6037,7 +6054,7 @@
               <a:graphicData uri="http://schemas.openxmlformats.org/drawingml/2006/picture">
                 <pic:pic>
                   <pic:nvPicPr>
-                    <pic:cNvPr id="0" name="figA8_NO2_h7.png"/>
+                    <pic:cNvPr id="0" name="figA7_NO2_h1.png"/>
                     <pic:cNvPicPr/>
                   </pic:nvPicPr>
                   <pic:blipFill>
@@ -6065,7 +6082,55 @@
         <w:pStyle w:val="MDPI51figurecaption"/>
       </w:pPr>
       <w:r>
-        <w:t>Figure A8. NO2 predictions: Actual vs. Full Hybrid vs. Ensemble (h=7, Box-Cox scale).</w:t>
+        <w:t>Figure A7. NO2 predictions: Actual vs. Deep Hybrid Baseline vs. Proposed Ensemble (h=1, Box-Cox scale).</w:t>
+      </w:r>
+    </w:p>
+    <w:p>
+      <w:pPr>
+        <w:pStyle w:val="MDPI52figure"/>
+        <w:jc w:val="center"/>
+      </w:pPr>
+      <w:r>
+        <w:drawing>
+          <wp:inline xmlns:a="http://schemas.openxmlformats.org/drawingml/2006/main" xmlns:pic="http://schemas.openxmlformats.org/drawingml/2006/picture">
+            <wp:extent cx="6126480" cy="2236651"/>
+            <wp:docPr id="14" name="Picture 14"/>
+            <wp:cNvGraphicFramePr>
+              <a:graphicFrameLocks noChangeAspect="1"/>
+            </wp:cNvGraphicFramePr>
+            <a:graphic>
+              <a:graphicData uri="http://schemas.openxmlformats.org/drawingml/2006/picture">
+                <pic:pic>
+                  <pic:nvPicPr>
+                    <pic:cNvPr id="0" name="figA8_NO2_h7.png"/>
+                    <pic:cNvPicPr/>
+                  </pic:nvPicPr>
+                  <pic:blipFill>
+                    <a:blip r:embed="rId31"/>
+                    <a:stretch>
+                      <a:fillRect/>
+                    </a:stretch>
+                  </pic:blipFill>
+                  <pic:spPr>
+                    <a:xfrm>
+                      <a:off x="0" y="0"/>
+                      <a:ext cx="6126480" cy="2236651"/>
+                    </a:xfrm>
+                    <a:prstGeom prst="rect"/>
+                  </pic:spPr>
+                </pic:pic>
+              </a:graphicData>
+            </a:graphic>
+          </wp:inline>
+        </w:drawing>
+      </w:r>
+    </w:p>
+    <w:p>
+      <w:pPr>
+        <w:pStyle w:val="MDPI51figurecaption"/>
+      </w:pPr>
+      <w:r>
+        <w:t>Figure A8. NO2 predictions: Actual vs. Deep Hybrid Baseline vs. Proposed Ensemble (h=7, Box-Cox scale).</w:t>
       </w:r>
     </w:p>
     <w:p>
@@ -6077,7 +6142,7 @@
         <w:drawing>
           <wp:inline xmlns:a="http://schemas.openxmlformats.org/drawingml/2006/main" xmlns:pic="http://schemas.openxmlformats.org/drawingml/2006/picture">
             <wp:extent cx="6126480" cy="2240963"/>
-            <wp:docPr id="14" name="Picture 14"/>
+            <wp:docPr id="15" name="Picture 15"/>
             <wp:cNvGraphicFramePr>
               <a:graphicFrameLocks noChangeAspect="1"/>
             </wp:cNvGraphicFramePr>
@@ -6089,7 +6154,7 @@
                     <pic:cNvPicPr/>
                   </pic:nvPicPr>
                   <pic:blipFill>
-                    <a:blip r:embed="rId31"/>
+                    <a:blip r:embed="rId32"/>
                     <a:stretch>
                       <a:fillRect/>
                     </a:stretch>
@@ -6113,7 +6178,7 @@
         <w:pStyle w:val="MDPI51figurecaption"/>
       </w:pPr>
       <w:r>
-        <w:t>Figure A9. NO2 predictions: Actual vs. Full Hybrid vs. Ensemble (h=30, Box-Cox scale).</w:t>
+        <w:t>Figure A9. NO2 predictions: Actual vs. Deep Hybrid Baseline vs. Proposed Ensemble (h=30, Box-Cox scale).</w:t>
       </w:r>
     </w:p>
     <w:p>
@@ -6185,7 +6250,7 @@
         <w:pStyle w:val="MDPI81references"/>
       </w:pPr>
       <w:r>
-        <w:t>8. Diebold, F.X.; Mariano, R.S. Comparing predictive accuracy. J. Bus. Econ. Stat. 1995, 13, 253-263.</w:t>
+        <w:t>8. Makridakis, S.; Spiliotis, E.; Assimakopoulos, V. The M4 Competition: 100,000 time series and 61 forecasting methods. Int. J. Forecast. 2020, 36, 54-74.</w:t>
       </w:r>
     </w:p>
     <w:p>
@@ -6193,7 +6258,7 @@
         <w:pStyle w:val="MDPI81references"/>
       </w:pPr>
       <w:r>
-        <w:t>9. Ke, G.; Meng, Q.; Finley, T.; Wang, T.; Chen, W.; Ma, W.; Ye, Q.; Liu, T.-Y. LightGBM: A highly efficient gradient boosting decision tree. In Advances in Neural Information Processing Systems 30 (NeurIPS 2017); 2017; pp. 3146-3154.</w:t>
+        <w:t>9. Hyndman, R.J.; Athanasopoulos, G. Forecasting: Principles and Practice, 3rd ed.; OTexts: Melbourne, Australia, 2021.</w:t>
       </w:r>
     </w:p>
     <w:p>
@@ -6201,7 +6266,7 @@
         <w:pStyle w:val="MDPI81references"/>
       </w:pPr>
       <w:r>
-        <w:t>10. Assimakopoulos, V.; Nikolopoulos, K. The theta model: A decomposition approach to forecasting. Int. J. Forecast. 2000, 16, 521-530.</w:t>
+        <w:t>10. Ke, G.; Meng, Q.; Finley, T.; Wang, T.; Chen, W.; Ma, W.; Ye, Q.; Liu, T.-Y. LightGBM: A highly efficient gradient boosting decision tree. In Advances in Neural Information Processing Systems 30 (NeurIPS 2017); 2017; pp. 3146-3154.</w:t>
       </w:r>
     </w:p>
     <w:p>
@@ -6209,7 +6274,7 @@
         <w:pStyle w:val="MDPI81references"/>
       </w:pPr>
       <w:r>
-        <w:t>11. Jiang, P.; Dong, Q.; Li, P. A novel hybrid strategy for PM2.5 concentration analysis and prediction. J. Environ. Manag. 2017, 196, 443-457.</w:t>
+        <w:t>11. Assimakopoulos, V.; Nikolopoulos, K. The theta model: A decomposition approach to forecasting. Int. J. Forecast. 2000, 16, 521-530.</w:t>
       </w:r>
     </w:p>
     <w:p>
@@ -6217,7 +6282,7 @@
         <w:pStyle w:val="MDPI81references"/>
       </w:pPr>
       <w:r>
-        <w:t>12. Pak, U.; Ma, J.; Ryu, U.; Ryom, K.; Juhyok, U.; Pak, K.; Pak, C. Deep learning-based PM2.5 prediction considering the spatiotemporal correlations: A case study of Beijing, China. Sci. Total Environ. 2020, 699, 133561.</w:t>
+        <w:t>12. Diebold, F.X.; Mariano, R.S. Comparing predictive accuracy. J. Bus. Econ. Stat. 1995, 13, 253-263.</w:t>
       </w:r>
     </w:p>
     <w:p>
@@ -6225,7 +6290,7 @@
         <w:pStyle w:val="MDPI81references"/>
       </w:pPr>
       <w:r>
-        <w:t>13. Gilik, A.; Ogrenci, A.S.; Ozmen, A. Air quality prediction using CNN+LSTM-based hybrid deep learning architecture. Environ. Sci. Pollut. Res. 2022, 29, 11920-11938.</w:t>
+        <w:t>13. Jiang, P.; Dong, Q.; Li, P. A novel hybrid strategy for PM2.5 concentration analysis and prediction. J. Environ. Manag. 2017, 196, 443-457.</w:t>
       </w:r>
     </w:p>
     <w:p>
@@ -6233,7 +6298,7 @@
         <w:pStyle w:val="MDPI81references"/>
       </w:pPr>
       <w:r>
-        <w:t>14. Nie, Y.; Nguyen, N.H.; Sinthong, P.; Kalagnanam, J. A time series is worth 64 words: Long-term forecasting with transformers. In International Conference on Learning Representations (ICLR 2023); 2023.</w:t>
+        <w:t>14. Gilik, A.; Ogrenci, A.S.; Ozmen, A. Air quality prediction using CNN+LSTM-based hybrid deep learning architecture. Environ. Sci. Pollut. Res. 2022, 29, 11920-11938.</w:t>
       </w:r>
     </w:p>
     <w:p>
@@ -6241,7 +6306,7 @@
         <w:pStyle w:val="MDPI81references"/>
       </w:pPr>
       <w:r>
-        <w:t>15. Makridakis, S.; Spiliotis, E.; Assimakopoulos, V. The M4 Competition: 100,000 time series and 61 forecasting methods. Int. J. Forecast. 2020, 36, 54-74.</w:t>
+        <w:t>15. Nie, Y.; Nguyen, N.H.; Sinthong, P.; Kalagnanam, J. A time series is worth 64 words: Long-term forecasting with transformers. In International Conference on Learning Representations (ICLR 2023); 2023.</w:t>
       </w:r>
     </w:p>
     <w:p>
@@ -6249,7 +6314,7 @@
         <w:pStyle w:val="MDPI81references"/>
       </w:pPr>
       <w:r>
-        <w:t>16. Hyndman, R.J.; Athanasopoulos, G. Forecasting: Principles and Practice, 3rd ed.; OTexts: Melbourne, Australia, 2021.</w:t>
+        <w:t>16. Makridakis, S.; Spiliotis, E.; Assimakopoulos, V. Statistical and machine learning forecasting methods: Concerns and ways forward. PLoS ONE 2018, 13, e0194889.</w:t>
       </w:r>
     </w:p>
     <w:p>
@@ -6289,7 +6354,7 @@
         <w:pStyle w:val="MDPI81references"/>
       </w:pPr>
       <w:r>
-        <w:t>21. Harvey, D.; Leybourne, S.; Newbold, P. Testing the equality of prediction mean squared errors. Int. J. Forecast. 1997, 13, 281-291.</w:t>
+        <w:t>21. Cleveland, R.B.; Cleveland, W.S.; McRae, J.E.; Terpenning, I. STL: A seasonal-trend decomposition procedure based on loess. J. Off. Stat. 1990, 6, 3-73.</w:t>
       </w:r>
     </w:p>
     <w:p>
@@ -6297,7 +6362,7 @@
         <w:pStyle w:val="MDPI81references"/>
       </w:pPr>
       <w:r>
-        <w:t>22. Makridakis, S.; Spiliotis, E.; Assimakopoulos, V. Statistical and machine learning forecasting methods: Concerns and ways forward. PLoS ONE 2018, 13, e0194889.</w:t>
+        <w:t>22. Breiman, L. Random forests. Mach. Learn. 2001, 45, 5-32.</w:t>
       </w:r>
     </w:p>
     <w:p>
@@ -6305,15 +6370,7 @@
         <w:pStyle w:val="MDPI81references"/>
       </w:pPr>
       <w:r>
-        <w:t>23. Cleveland, R.B.; Cleveland, W.S.; McRae, J.E.; Terpenning, I. STL: A seasonal-trend decomposition procedure based on loess. J. Off. Stat. 1990, 6, 3-73.</w:t>
-      </w:r>
-    </w:p>
-    <w:p>
-      <w:pPr>
-        <w:pStyle w:val="MDPI81references"/>
-      </w:pPr>
-      <w:r>
-        <w:t>24. Seabold, S.; Perktold, J. Statsmodels: Econometric and statistical modeling with Python. In Proceedings of the 9th Python in Science Conference; 2010; pp. 92-96.</w:t>
+        <w:t>23. Harvey, D.; Leybourne, S.; Newbold, P. Testing the equality of prediction mean squared errors. Int. J. Forecast. 1997, 13, 281-291.</w:t>
       </w:r>
     </w:p>
     <w:sectPr>

</xml_diff>

<commit_message>
style(AnC): hapus penomoran baris template MDPI + poles spasi (gambar/caption/tabel/itemize), 23 hlm
</commit_message>
<xml_diff>
--- a/04_Naskah/Naskah_Paper_Anc_Ensemble_LGBM_Theta.docx
+++ b/04_Naskah/Naskah_Paper_Anc_Ensemble_LGBM_Theta.docx
@@ -109,6 +109,7 @@
     <w:p>
       <w:pPr>
         <w:pStyle w:val="MDPI37itemize"/>
+        <w:spacing w:after="100"/>
       </w:pPr>
       <w:r>
         <w:t>C1. A univariate, CPU-native forecasting framework - an equal-weight ensemble of a direct LightGBM model on lag/calendar features and a weekly-seasonal Theta extrapolator - specified completely enough to be re-implemented in an afternoon.</w:t>
@@ -117,6 +118,7 @@
     <w:p>
       <w:pPr>
         <w:pStyle w:val="MDPI37itemize"/>
+        <w:spacing w:after="100"/>
       </w:pPr>
       <w:r>
         <w:t>C2. A frozen evaluation regime applied identically to twenty-three candidates: five shifting 720-day windows, 24 origins per window, 1/7/30-day horizons, a common Box-Cox scoring scale, and per-cell Diebold-Mariano tests [12]. Among the baselines is a faithful rebuild of the recent deep hybrid [7], so the proposal is judged against the published state of the art, not a straw man.</w:t>
@@ -125,6 +127,7 @@
     <w:p>
       <w:pPr>
         <w:pStyle w:val="MDPI37itemize"/>
+        <w:spacing w:after="100"/>
       </w:pPr>
       <w:r>
         <w:t>C3. Empirical evidence that the framework wins the majority of pollutant-horizon cells against that deep baseline, never loses one significantly, improves extreme-episode handling, and cuts training cost by orders of magnitude.</w:t>
@@ -133,6 +136,7 @@
     <w:p>
       <w:pPr>
         <w:pStyle w:val="MDPI37itemize"/>
+        <w:spacing w:after="100"/>
       </w:pPr>
       <w:r>
         <w:t>C4. Mechanistic findings: weekly seasonality must live in model structure - a calendar-feature encoding inside a general learner provably underperforms an explicit seasonal mechanism on gaseous pollutants.</w:t>
@@ -140,6 +144,11 @@
     </w:p>
     <w:p>
       <w:pPr>
+        <w:spacing w:before="0" w:after="0" w:lineRule="exact" w:line="100"/>
+      </w:pPr>
+    </w:p>
+    <w:p>
+      <w:pPr>
         <w:pStyle w:val="MDPI21heading1"/>
       </w:pPr>
       <w:r>
@@ -197,6 +206,8 @@
     <w:p>
       <w:pPr>
         <w:pStyle w:val="MDPI41tablecaption"/>
+        <w:keepNext/>
+        <w:spacing w:before="240" w:after="120"/>
       </w:pPr>
       <w:r>
         <w:t>Table 1. Mean concentrations over the studied period (µg/m³).</w:t>
@@ -228,6 +239,9 @@
             <w:shd w:fill="EDF2F7"/>
           </w:tcPr>
           <w:p>
+            <w:pPr>
+              <w:spacing w:before="20" w:after="20"/>
+            </w:pPr>
             <w:r>
               <w:rPr>
                 <w:b/>
@@ -243,6 +257,9 @@
             <w:shd w:fill="EDF2F7"/>
           </w:tcPr>
           <w:p>
+            <w:pPr>
+              <w:spacing w:before="20" w:after="20"/>
+            </w:pPr>
             <w:r>
               <w:rPr>
                 <w:b/>
@@ -258,6 +275,9 @@
             <w:shd w:fill="EDF2F7"/>
           </w:tcPr>
           <w:p>
+            <w:pPr>
+              <w:spacing w:before="20" w:after="20"/>
+            </w:pPr>
             <w:r>
               <w:rPr>
                 <w:b/>
@@ -274,6 +294,9 @@
             <w:tcW w:type="dxa" w:w="2268"/>
           </w:tcPr>
           <w:p>
+            <w:pPr>
+              <w:spacing w:before="20" w:after="20"/>
+            </w:pPr>
             <w:r>
               <w:rPr>
                 <w:sz w:val="18"/>
@@ -287,6 +310,9 @@
             <w:tcW w:type="dxa" w:w="2268"/>
           </w:tcPr>
           <w:p>
+            <w:pPr>
+              <w:spacing w:before="20" w:after="20"/>
+            </w:pPr>
             <w:r>
               <w:rPr>
                 <w:sz w:val="18"/>
@@ -300,6 +326,9 @@
             <w:tcW w:type="dxa" w:w="1701"/>
           </w:tcPr>
           <w:p>
+            <w:pPr>
+              <w:spacing w:before="20" w:after="20"/>
+            </w:pPr>
             <w:r>
               <w:rPr>
                 <w:sz w:val="18"/>
@@ -315,6 +344,9 @@
             <w:tcW w:type="dxa" w:w="2268"/>
           </w:tcPr>
           <w:p>
+            <w:pPr>
+              <w:spacing w:before="20" w:after="20"/>
+            </w:pPr>
             <w:r>
               <w:rPr>
                 <w:sz w:val="18"/>
@@ -328,6 +360,9 @@
             <w:tcW w:type="dxa" w:w="2268"/>
           </w:tcPr>
           <w:p>
+            <w:pPr>
+              <w:spacing w:before="20" w:after="20"/>
+            </w:pPr>
             <w:r>
               <w:rPr>
                 <w:sz w:val="18"/>
@@ -341,6 +376,9 @@
             <w:tcW w:type="dxa" w:w="1701"/>
           </w:tcPr>
           <w:p>
+            <w:pPr>
+              <w:spacing w:before="20" w:after="20"/>
+            </w:pPr>
             <w:r>
               <w:rPr>
                 <w:sz w:val="18"/>
@@ -356,6 +394,9 @@
             <w:tcW w:type="dxa" w:w="2268"/>
           </w:tcPr>
           <w:p>
+            <w:pPr>
+              <w:spacing w:before="20" w:after="20"/>
+            </w:pPr>
             <w:r>
               <w:rPr>
                 <w:sz w:val="18"/>
@@ -369,6 +410,9 @@
             <w:tcW w:type="dxa" w:w="2268"/>
           </w:tcPr>
           <w:p>
+            <w:pPr>
+              <w:spacing w:before="20" w:after="20"/>
+            </w:pPr>
             <w:r>
               <w:rPr>
                 <w:sz w:val="18"/>
@@ -382,6 +426,9 @@
             <w:tcW w:type="dxa" w:w="1701"/>
           </w:tcPr>
           <w:p>
+            <w:pPr>
+              <w:spacing w:before="20" w:after="20"/>
+            </w:pPr>
             <w:r>
               <w:rPr>
                 <w:sz w:val="18"/>
@@ -394,7 +441,14 @@
     </w:tbl>
     <w:p>
       <w:pPr>
+        <w:spacing w:before="0" w:after="0" w:lineRule="exact" w:line="140"/>
+      </w:pPr>
+    </w:p>
+    <w:p>
+      <w:pPr>
         <w:pStyle w:val="MDPI41tablecaption"/>
+        <w:keepNext/>
+        <w:spacing w:before="240" w:after="120"/>
       </w:pPr>
       <w:r>
         <w:t>Table 2. Descriptive statistics of the raw daily series (µg/m³).</w:t>
@@ -432,6 +486,9 @@
             <w:shd w:fill="EDF2F7"/>
           </w:tcPr>
           <w:p>
+            <w:pPr>
+              <w:spacing w:before="20" w:after="20"/>
+            </w:pPr>
             <w:r>
               <w:rPr>
                 <w:b/>
@@ -447,6 +504,9 @@
             <w:shd w:fill="EDF2F7"/>
           </w:tcPr>
           <w:p>
+            <w:pPr>
+              <w:spacing w:before="20" w:after="20"/>
+            </w:pPr>
             <w:r>
               <w:rPr>
                 <w:b/>
@@ -462,6 +522,9 @@
             <w:shd w:fill="EDF2F7"/>
           </w:tcPr>
           <w:p>
+            <w:pPr>
+              <w:spacing w:before="20" w:after="20"/>
+            </w:pPr>
             <w:r>
               <w:rPr>
                 <w:b/>
@@ -477,6 +540,9 @@
             <w:shd w:fill="EDF2F7"/>
           </w:tcPr>
           <w:p>
+            <w:pPr>
+              <w:spacing w:before="20" w:after="20"/>
+            </w:pPr>
             <w:r>
               <w:rPr>
                 <w:b/>
@@ -492,6 +558,9 @@
             <w:shd w:fill="EDF2F7"/>
           </w:tcPr>
           <w:p>
+            <w:pPr>
+              <w:spacing w:before="20" w:after="20"/>
+            </w:pPr>
             <w:r>
               <w:rPr>
                 <w:b/>
@@ -507,6 +576,9 @@
             <w:shd w:fill="EDF2F7"/>
           </w:tcPr>
           <w:p>
+            <w:pPr>
+              <w:spacing w:before="20" w:after="20"/>
+            </w:pPr>
             <w:r>
               <w:rPr>
                 <w:b/>
@@ -522,6 +594,9 @@
             <w:shd w:fill="EDF2F7"/>
           </w:tcPr>
           <w:p>
+            <w:pPr>
+              <w:spacing w:before="20" w:after="20"/>
+            </w:pPr>
             <w:r>
               <w:rPr>
                 <w:b/>
@@ -537,6 +612,9 @@
             <w:shd w:fill="EDF2F7"/>
           </w:tcPr>
           <w:p>
+            <w:pPr>
+              <w:spacing w:before="20" w:after="20"/>
+            </w:pPr>
             <w:r>
               <w:rPr>
                 <w:b/>
@@ -552,6 +630,9 @@
             <w:shd w:fill="EDF2F7"/>
           </w:tcPr>
           <w:p>
+            <w:pPr>
+              <w:spacing w:before="20" w:after="20"/>
+            </w:pPr>
             <w:r>
               <w:rPr>
                 <w:b/>
@@ -568,6 +649,9 @@
             <w:tcW w:type="dxa" w:w="1361"/>
           </w:tcPr>
           <w:p>
+            <w:pPr>
+              <w:spacing w:before="20" w:after="20"/>
+            </w:pPr>
             <w:r>
               <w:rPr>
                 <w:sz w:val="18"/>
@@ -581,6 +665,9 @@
             <w:tcW w:type="dxa" w:w="964"/>
           </w:tcPr>
           <w:p>
+            <w:pPr>
+              <w:spacing w:before="20" w:after="20"/>
+            </w:pPr>
             <w:r>
               <w:rPr>
                 <w:sz w:val="18"/>
@@ -594,6 +681,9 @@
             <w:tcW w:type="dxa" w:w="964"/>
           </w:tcPr>
           <w:p>
+            <w:pPr>
+              <w:spacing w:before="20" w:after="20"/>
+            </w:pPr>
             <w:r>
               <w:rPr>
                 <w:sz w:val="18"/>
@@ -607,6 +697,9 @@
             <w:tcW w:type="dxa" w:w="964"/>
           </w:tcPr>
           <w:p>
+            <w:pPr>
+              <w:spacing w:before="20" w:after="20"/>
+            </w:pPr>
             <w:r>
               <w:rPr>
                 <w:sz w:val="18"/>
@@ -620,6 +713,9 @@
             <w:tcW w:type="dxa" w:w="964"/>
           </w:tcPr>
           <w:p>
+            <w:pPr>
+              <w:spacing w:before="20" w:after="20"/>
+            </w:pPr>
             <w:r>
               <w:rPr>
                 <w:sz w:val="18"/>
@@ -633,6 +729,9 @@
             <w:tcW w:type="dxa" w:w="964"/>
           </w:tcPr>
           <w:p>
+            <w:pPr>
+              <w:spacing w:before="20" w:after="20"/>
+            </w:pPr>
             <w:r>
               <w:rPr>
                 <w:sz w:val="18"/>
@@ -646,6 +745,9 @@
             <w:tcW w:type="dxa" w:w="964"/>
           </w:tcPr>
           <w:p>
+            <w:pPr>
+              <w:spacing w:before="20" w:after="20"/>
+            </w:pPr>
             <w:r>
               <w:rPr>
                 <w:sz w:val="18"/>
@@ -659,6 +761,9 @@
             <w:tcW w:type="dxa" w:w="964"/>
           </w:tcPr>
           <w:p>
+            <w:pPr>
+              <w:spacing w:before="20" w:after="20"/>
+            </w:pPr>
             <w:r>
               <w:rPr>
                 <w:sz w:val="18"/>
@@ -672,6 +777,9 @@
             <w:tcW w:type="dxa" w:w="1077"/>
           </w:tcPr>
           <w:p>
+            <w:pPr>
+              <w:spacing w:before="20" w:after="20"/>
+            </w:pPr>
             <w:r>
               <w:rPr>
                 <w:sz w:val="18"/>
@@ -687,6 +795,9 @@
             <w:tcW w:type="dxa" w:w="1361"/>
           </w:tcPr>
           <w:p>
+            <w:pPr>
+              <w:spacing w:before="20" w:after="20"/>
+            </w:pPr>
             <w:r>
               <w:rPr>
                 <w:sz w:val="18"/>
@@ -700,6 +811,9 @@
             <w:tcW w:type="dxa" w:w="964"/>
           </w:tcPr>
           <w:p>
+            <w:pPr>
+              <w:spacing w:before="20" w:after="20"/>
+            </w:pPr>
             <w:r>
               <w:rPr>
                 <w:sz w:val="18"/>
@@ -713,6 +827,9 @@
             <w:tcW w:type="dxa" w:w="964"/>
           </w:tcPr>
           <w:p>
+            <w:pPr>
+              <w:spacing w:before="20" w:after="20"/>
+            </w:pPr>
             <w:r>
               <w:rPr>
                 <w:sz w:val="18"/>
@@ -726,6 +843,9 @@
             <w:tcW w:type="dxa" w:w="964"/>
           </w:tcPr>
           <w:p>
+            <w:pPr>
+              <w:spacing w:before="20" w:after="20"/>
+            </w:pPr>
             <w:r>
               <w:rPr>
                 <w:sz w:val="18"/>
@@ -739,6 +859,9 @@
             <w:tcW w:type="dxa" w:w="964"/>
           </w:tcPr>
           <w:p>
+            <w:pPr>
+              <w:spacing w:before="20" w:after="20"/>
+            </w:pPr>
             <w:r>
               <w:rPr>
                 <w:sz w:val="18"/>
@@ -752,6 +875,9 @@
             <w:tcW w:type="dxa" w:w="964"/>
           </w:tcPr>
           <w:p>
+            <w:pPr>
+              <w:spacing w:before="20" w:after="20"/>
+            </w:pPr>
             <w:r>
               <w:rPr>
                 <w:sz w:val="18"/>
@@ -765,6 +891,9 @@
             <w:tcW w:type="dxa" w:w="964"/>
           </w:tcPr>
           <w:p>
+            <w:pPr>
+              <w:spacing w:before="20" w:after="20"/>
+            </w:pPr>
             <w:r>
               <w:rPr>
                 <w:sz w:val="18"/>
@@ -778,6 +907,9 @@
             <w:tcW w:type="dxa" w:w="964"/>
           </w:tcPr>
           <w:p>
+            <w:pPr>
+              <w:spacing w:before="20" w:after="20"/>
+            </w:pPr>
             <w:r>
               <w:rPr>
                 <w:sz w:val="18"/>
@@ -791,6 +923,9 @@
             <w:tcW w:type="dxa" w:w="1077"/>
           </w:tcPr>
           <w:p>
+            <w:pPr>
+              <w:spacing w:before="20" w:after="20"/>
+            </w:pPr>
             <w:r>
               <w:rPr>
                 <w:sz w:val="18"/>
@@ -806,6 +941,9 @@
             <w:tcW w:type="dxa" w:w="1361"/>
           </w:tcPr>
           <w:p>
+            <w:pPr>
+              <w:spacing w:before="20" w:after="20"/>
+            </w:pPr>
             <w:r>
               <w:rPr>
                 <w:sz w:val="18"/>
@@ -819,6 +957,9 @@
             <w:tcW w:type="dxa" w:w="964"/>
           </w:tcPr>
           <w:p>
+            <w:pPr>
+              <w:spacing w:before="20" w:after="20"/>
+            </w:pPr>
             <w:r>
               <w:rPr>
                 <w:sz w:val="18"/>
@@ -832,6 +973,9 @@
             <w:tcW w:type="dxa" w:w="964"/>
           </w:tcPr>
           <w:p>
+            <w:pPr>
+              <w:spacing w:before="20" w:after="20"/>
+            </w:pPr>
             <w:r>
               <w:rPr>
                 <w:sz w:val="18"/>
@@ -845,6 +989,9 @@
             <w:tcW w:type="dxa" w:w="964"/>
           </w:tcPr>
           <w:p>
+            <w:pPr>
+              <w:spacing w:before="20" w:after="20"/>
+            </w:pPr>
             <w:r>
               <w:rPr>
                 <w:sz w:val="18"/>
@@ -858,6 +1005,9 @@
             <w:tcW w:type="dxa" w:w="964"/>
           </w:tcPr>
           <w:p>
+            <w:pPr>
+              <w:spacing w:before="20" w:after="20"/>
+            </w:pPr>
             <w:r>
               <w:rPr>
                 <w:sz w:val="18"/>
@@ -871,6 +1021,9 @@
             <w:tcW w:type="dxa" w:w="964"/>
           </w:tcPr>
           <w:p>
+            <w:pPr>
+              <w:spacing w:before="20" w:after="20"/>
+            </w:pPr>
             <w:r>
               <w:rPr>
                 <w:sz w:val="18"/>
@@ -884,6 +1037,9 @@
             <w:tcW w:type="dxa" w:w="964"/>
           </w:tcPr>
           <w:p>
+            <w:pPr>
+              <w:spacing w:before="20" w:after="20"/>
+            </w:pPr>
             <w:r>
               <w:rPr>
                 <w:sz w:val="18"/>
@@ -897,6 +1053,9 @@
             <w:tcW w:type="dxa" w:w="964"/>
           </w:tcPr>
           <w:p>
+            <w:pPr>
+              <w:spacing w:before="20" w:after="20"/>
+            </w:pPr>
             <w:r>
               <w:rPr>
                 <w:sz w:val="18"/>
@@ -910,6 +1069,9 @@
             <w:tcW w:type="dxa" w:w="1077"/>
           </w:tcPr>
           <w:p>
+            <w:pPr>
+              <w:spacing w:before="20" w:after="20"/>
+            </w:pPr>
             <w:r>
               <w:rPr>
                 <w:sz w:val="18"/>
@@ -922,6 +1084,11 @@
     </w:tbl>
     <w:p>
       <w:pPr>
+        <w:spacing w:before="0" w:after="0" w:lineRule="exact" w:line="140"/>
+      </w:pPr>
+    </w:p>
+    <w:p>
+      <w:pPr>
         <w:pStyle w:val="MDPI22heading2"/>
       </w:pPr>
       <w:r>
@@ -939,6 +1106,8 @@
     <w:p>
       <w:pPr>
         <w:pStyle w:val="MDPI52figure"/>
+        <w:keepNext/>
+        <w:spacing w:before="200" w:after="80"/>
         <w:jc w:val="center"/>
       </w:pPr>
       <w:r>
@@ -979,6 +1148,7 @@
     <w:p>
       <w:pPr>
         <w:pStyle w:val="MDPI51figurecaption"/>
+        <w:spacing w:after="240"/>
       </w:pPr>
       <w:r>
         <w:t>Figure 1. Dataset time series.</w:t>
@@ -986,7 +1156,14 @@
     </w:p>
     <w:p>
       <w:pPr>
+        <w:spacing w:before="0" w:after="0" w:lineRule="exact" w:line="100"/>
+      </w:pPr>
+    </w:p>
+    <w:p>
+      <w:pPr>
         <w:pStyle w:val="MDPI52figure"/>
+        <w:keepNext/>
+        <w:spacing w:before="200" w:after="80"/>
         <w:jc w:val="center"/>
       </w:pPr>
       <w:r>
@@ -1027,6 +1204,7 @@
     <w:p>
       <w:pPr>
         <w:pStyle w:val="MDPI51figurecaption"/>
+        <w:spacing w:after="240"/>
       </w:pPr>
       <w:r>
         <w:t>Figure 2. Decomposition of each raw series with period 365: observed, trend, annual seasonal, and residual (columns: (a) PM10, (b) PM2.5, (c) NO2).</w:t>
@@ -1034,7 +1212,14 @@
     </w:p>
     <w:p>
       <w:pPr>
+        <w:spacing w:before="0" w:after="0" w:lineRule="exact" w:line="100"/>
+      </w:pPr>
+    </w:p>
+    <w:p>
+      <w:pPr>
         <w:pStyle w:val="MDPI52figure"/>
+        <w:keepNext/>
+        <w:spacing w:before="200" w:after="80"/>
         <w:jc w:val="center"/>
       </w:pPr>
       <w:r>
@@ -1075,6 +1260,7 @@
     <w:p>
       <w:pPr>
         <w:pStyle w:val="MDPI51figurecaption"/>
+        <w:spacing w:after="240"/>
       </w:pPr>
       <w:r>
         <w:t>Figure 3. Transformed series after Box-Cox: (a) PM10, (b) PM2.5, (c) NO2.</w:t>
@@ -1082,6 +1268,11 @@
     </w:p>
     <w:p>
       <w:pPr>
+        <w:spacing w:before="0" w:after="0" w:lineRule="exact" w:line="100"/>
+      </w:pPr>
+    </w:p>
+    <w:p>
+      <w:pPr>
         <w:pStyle w:val="MDPI31text"/>
       </w:pPr>
       <w:r>
@@ -1091,6 +1282,8 @@
     <w:p>
       <w:pPr>
         <w:pStyle w:val="MDPI41tablecaption"/>
+        <w:keepNext/>
+        <w:spacing w:before="240" w:after="120"/>
       </w:pPr>
       <w:r>
         <w:t>Table 3. Stationarity tests on the transformed series.</w:t>
@@ -1124,6 +1317,9 @@
             <w:shd w:fill="EDF2F7"/>
           </w:tcPr>
           <w:p>
+            <w:pPr>
+              <w:spacing w:before="20" w:after="20"/>
+            </w:pPr>
             <w:r>
               <w:rPr>
                 <w:b/>
@@ -1139,6 +1335,9 @@
             <w:shd w:fill="EDF2F7"/>
           </w:tcPr>
           <w:p>
+            <w:pPr>
+              <w:spacing w:before="20" w:after="20"/>
+            </w:pPr>
             <w:r>
               <w:rPr>
                 <w:b/>
@@ -1154,6 +1353,9 @@
             <w:shd w:fill="EDF2F7"/>
           </w:tcPr>
           <w:p>
+            <w:pPr>
+              <w:spacing w:before="20" w:after="20"/>
+            </w:pPr>
             <w:r>
               <w:rPr>
                 <w:b/>
@@ -1169,6 +1371,9 @@
             <w:shd w:fill="EDF2F7"/>
           </w:tcPr>
           <w:p>
+            <w:pPr>
+              <w:spacing w:before="20" w:after="20"/>
+            </w:pPr>
             <w:r>
               <w:rPr>
                 <w:b/>
@@ -1184,6 +1389,9 @@
             <w:shd w:fill="EDF2F7"/>
           </w:tcPr>
           <w:p>
+            <w:pPr>
+              <w:spacing w:before="20" w:after="20"/>
+            </w:pPr>
             <w:r>
               <w:rPr>
                 <w:b/>
@@ -1200,6 +1408,9 @@
             <w:tcW w:type="dxa" w:w="1814"/>
           </w:tcPr>
           <w:p>
+            <w:pPr>
+              <w:spacing w:before="20" w:after="20"/>
+            </w:pPr>
             <w:r>
               <w:rPr>
                 <w:sz w:val="18"/>
@@ -1213,6 +1424,9 @@
             <w:tcW w:type="dxa" w:w="1928"/>
           </w:tcPr>
           <w:p>
+            <w:pPr>
+              <w:spacing w:before="20" w:after="20"/>
+            </w:pPr>
             <w:r>
               <w:rPr>
                 <w:sz w:val="18"/>
@@ -1226,6 +1440,9 @@
             <w:tcW w:type="dxa" w:w="1587"/>
           </w:tcPr>
           <w:p>
+            <w:pPr>
+              <w:spacing w:before="20" w:after="20"/>
+            </w:pPr>
             <w:r>
               <w:rPr>
                 <w:sz w:val="18"/>
@@ -1239,6 +1456,9 @@
             <w:tcW w:type="dxa" w:w="1928"/>
           </w:tcPr>
           <w:p>
+            <w:pPr>
+              <w:spacing w:before="20" w:after="20"/>
+            </w:pPr>
             <w:r>
               <w:rPr>
                 <w:sz w:val="18"/>
@@ -1252,6 +1472,9 @@
             <w:tcW w:type="dxa" w:w="1701"/>
           </w:tcPr>
           <w:p>
+            <w:pPr>
+              <w:spacing w:before="20" w:after="20"/>
+            </w:pPr>
             <w:r>
               <w:rPr>
                 <w:sz w:val="18"/>
@@ -1267,6 +1490,9 @@
             <w:tcW w:type="dxa" w:w="1814"/>
           </w:tcPr>
           <w:p>
+            <w:pPr>
+              <w:spacing w:before="20" w:after="20"/>
+            </w:pPr>
             <w:r>
               <w:rPr>
                 <w:sz w:val="18"/>
@@ -1280,6 +1506,9 @@
             <w:tcW w:type="dxa" w:w="1928"/>
           </w:tcPr>
           <w:p>
+            <w:pPr>
+              <w:spacing w:before="20" w:after="20"/>
+            </w:pPr>
             <w:r>
               <w:rPr>
                 <w:sz w:val="18"/>
@@ -1293,6 +1522,9 @@
             <w:tcW w:type="dxa" w:w="1587"/>
           </w:tcPr>
           <w:p>
+            <w:pPr>
+              <w:spacing w:before="20" w:after="20"/>
+            </w:pPr>
             <w:r>
               <w:rPr>
                 <w:sz w:val="18"/>
@@ -1306,6 +1538,9 @@
             <w:tcW w:type="dxa" w:w="1928"/>
           </w:tcPr>
           <w:p>
+            <w:pPr>
+              <w:spacing w:before="20" w:after="20"/>
+            </w:pPr>
             <w:r>
               <w:rPr>
                 <w:sz w:val="18"/>
@@ -1319,6 +1554,9 @@
             <w:tcW w:type="dxa" w:w="1701"/>
           </w:tcPr>
           <w:p>
+            <w:pPr>
+              <w:spacing w:before="20" w:after="20"/>
+            </w:pPr>
             <w:r>
               <w:rPr>
                 <w:sz w:val="18"/>
@@ -1334,6 +1572,9 @@
             <w:tcW w:type="dxa" w:w="1814"/>
           </w:tcPr>
           <w:p>
+            <w:pPr>
+              <w:spacing w:before="20" w:after="20"/>
+            </w:pPr>
             <w:r>
               <w:rPr>
                 <w:sz w:val="18"/>
@@ -1347,6 +1588,9 @@
             <w:tcW w:type="dxa" w:w="1928"/>
           </w:tcPr>
           <w:p>
+            <w:pPr>
+              <w:spacing w:before="20" w:after="20"/>
+            </w:pPr>
             <w:r>
               <w:rPr>
                 <w:sz w:val="18"/>
@@ -1360,6 +1604,9 @@
             <w:tcW w:type="dxa" w:w="1587"/>
           </w:tcPr>
           <w:p>
+            <w:pPr>
+              <w:spacing w:before="20" w:after="20"/>
+            </w:pPr>
             <w:r>
               <w:rPr>
                 <w:sz w:val="18"/>
@@ -1373,6 +1620,9 @@
             <w:tcW w:type="dxa" w:w="1928"/>
           </w:tcPr>
           <w:p>
+            <w:pPr>
+              <w:spacing w:before="20" w:after="20"/>
+            </w:pPr>
             <w:r>
               <w:rPr>
                 <w:sz w:val="18"/>
@@ -1386,6 +1636,9 @@
             <w:tcW w:type="dxa" w:w="1701"/>
           </w:tcPr>
           <w:p>
+            <w:pPr>
+              <w:spacing w:before="20" w:after="20"/>
+            </w:pPr>
             <w:r>
               <w:rPr>
                 <w:sz w:val="18"/>
@@ -1398,7 +1651,14 @@
     </w:tbl>
     <w:p>
       <w:pPr>
+        <w:spacing w:before="0" w:after="0" w:lineRule="exact" w:line="140"/>
+      </w:pPr>
+    </w:p>
+    <w:p>
+      <w:pPr>
         <w:pStyle w:val="MDPI52figure"/>
+        <w:keepNext/>
+        <w:spacing w:before="200" w:after="80"/>
         <w:jc w:val="center"/>
       </w:pPr>
       <w:r>
@@ -1439,6 +1699,7 @@
     <w:p>
       <w:pPr>
         <w:pStyle w:val="MDPI51figurecaption"/>
+        <w:spacing w:after="240"/>
       </w:pPr>
       <w:r>
         <w:t>Figure 4. ACF (top) and PACF (bottom) of the transformed series: (a) PM10, (b) PM2.5, (c) NO2; dashed lines mark the 95% confidence bounds.</w:t>
@@ -1446,6 +1707,11 @@
     </w:p>
     <w:p>
       <w:pPr>
+        <w:spacing w:before="0" w:after="0" w:lineRule="exact" w:line="100"/>
+      </w:pPr>
+    </w:p>
+    <w:p>
+      <w:pPr>
         <w:pStyle w:val="MDPI22heading2"/>
       </w:pPr>
       <w:r>
@@ -1463,6 +1729,8 @@
     <w:p>
       <w:pPr>
         <w:pStyle w:val="MDPI52figure"/>
+        <w:keepNext/>
+        <w:spacing w:before="200" w:after="80"/>
         <w:jc w:val="center"/>
       </w:pPr>
       <w:r>
@@ -1503,6 +1771,7 @@
     <w:p>
       <w:pPr>
         <w:pStyle w:val="MDPI51figurecaption"/>
+        <w:spacing w:after="240"/>
       </w:pPr>
       <w:r>
         <w:t>Figure 5. Architecture of the proposed framework.</w:t>
@@ -1510,6 +1779,11 @@
     </w:p>
     <w:p>
       <w:pPr>
+        <w:spacing w:before="0" w:after="0" w:lineRule="exact" w:line="100"/>
+      </w:pPr>
+    </w:p>
+    <w:p>
+      <w:pPr>
         <w:pStyle w:val="MDPI22heading2"/>
       </w:pPr>
       <w:r>
@@ -1567,6 +1841,8 @@
     <w:p>
       <w:pPr>
         <w:pStyle w:val="MDPI41tablecaption"/>
+        <w:keepNext/>
+        <w:spacing w:before="240" w:after="120"/>
       </w:pPr>
       <w:r>
         <w:t>Table 4. Forecasting performance by pollutant and horizon (RMSE and MAE on the Box-Cox scale; MAPE (%) on the raw scale). The proposed ensemble is listed first.</w:t>
@@ -1609,6 +1885,9 @@
             <w:shd w:fill="EDF2F7"/>
           </w:tcPr>
           <w:p>
+            <w:pPr>
+              <w:spacing w:before="20" w:after="20"/>
+            </w:pPr>
             <w:r>
               <w:rPr>
                 <w:b/>
@@ -1624,6 +1903,9 @@
             <w:shd w:fill="EDF2F7"/>
           </w:tcPr>
           <w:p>
+            <w:pPr>
+              <w:spacing w:before="20" w:after="20"/>
+            </w:pPr>
             <w:r>
               <w:rPr>
                 <w:b/>
@@ -1639,6 +1921,9 @@
             <w:shd w:fill="EDF2F7"/>
           </w:tcPr>
           <w:p>
+            <w:pPr>
+              <w:spacing w:before="20" w:after="20"/>
+            </w:pPr>
             <w:r>
               <w:rPr>
                 <w:b/>
@@ -1654,6 +1939,9 @@
             <w:shd w:fill="EDF2F7"/>
           </w:tcPr>
           <w:p>
+            <w:pPr>
+              <w:spacing w:before="20" w:after="20"/>
+            </w:pPr>
             <w:r>
               <w:rPr>
                 <w:b/>
@@ -1669,6 +1957,9 @@
             <w:shd w:fill="EDF2F7"/>
           </w:tcPr>
           <w:p>
+            <w:pPr>
+              <w:spacing w:before="20" w:after="20"/>
+            </w:pPr>
             <w:r>
               <w:rPr>
                 <w:b/>
@@ -1684,6 +1975,9 @@
             <w:shd w:fill="EDF2F7"/>
           </w:tcPr>
           <w:p>
+            <w:pPr>
+              <w:spacing w:before="20" w:after="20"/>
+            </w:pPr>
             <w:r>
               <w:rPr>
                 <w:b/>
@@ -1699,6 +1993,9 @@
             <w:shd w:fill="EDF2F7"/>
           </w:tcPr>
           <w:p>
+            <w:pPr>
+              <w:spacing w:before="20" w:after="20"/>
+            </w:pPr>
             <w:r>
               <w:rPr>
                 <w:b/>
@@ -1714,6 +2011,9 @@
             <w:shd w:fill="EDF2F7"/>
           </w:tcPr>
           <w:p>
+            <w:pPr>
+              <w:spacing w:before="20" w:after="20"/>
+            </w:pPr>
             <w:r>
               <w:rPr>
                 <w:b/>
@@ -1729,6 +2029,9 @@
             <w:shd w:fill="EDF2F7"/>
           </w:tcPr>
           <w:p>
+            <w:pPr>
+              <w:spacing w:before="20" w:after="20"/>
+            </w:pPr>
             <w:r>
               <w:rPr>
                 <w:b/>
@@ -1744,6 +2047,9 @@
             <w:shd w:fill="EDF2F7"/>
           </w:tcPr>
           <w:p>
+            <w:pPr>
+              <w:spacing w:before="20" w:after="20"/>
+            </w:pPr>
             <w:r>
               <w:rPr>
                 <w:b/>
@@ -1759,6 +2065,9 @@
             <w:shd w:fill="EDF2F7"/>
           </w:tcPr>
           <w:p>
+            <w:pPr>
+              <w:spacing w:before="20" w:after="20"/>
+            </w:pPr>
             <w:r>
               <w:rPr>
                 <w:b/>
@@ -1774,6 +2083,9 @@
             <w:shd w:fill="EDF2F7"/>
           </w:tcPr>
           <w:p>
+            <w:pPr>
+              <w:spacing w:before="20" w:after="20"/>
+            </w:pPr>
             <w:r>
               <w:rPr>
                 <w:b/>
@@ -1789,6 +2101,9 @@
             <w:shd w:fill="EDF2F7"/>
           </w:tcPr>
           <w:p>
+            <w:pPr>
+              <w:spacing w:before="20" w:after="20"/>
+            </w:pPr>
             <w:r>
               <w:rPr>
                 <w:b/>
@@ -1804,6 +2119,9 @@
             <w:shd w:fill="EDF2F7"/>
           </w:tcPr>
           <w:p>
+            <w:pPr>
+              <w:spacing w:before="20" w:after="20"/>
+            </w:pPr>
             <w:r>
               <w:rPr>
                 <w:b/>
@@ -1820,6 +2138,9 @@
             <w:tcW w:type="dxa" w:w="1191"/>
           </w:tcPr>
           <w:p>
+            <w:pPr>
+              <w:spacing w:before="20" w:after="20"/>
+            </w:pPr>
             <w:r>
               <w:rPr>
                 <w:sz w:val="18"/>
@@ -1833,6 +2154,9 @@
             <w:tcW w:type="dxa" w:w="1134"/>
           </w:tcPr>
           <w:p>
+            <w:pPr>
+              <w:spacing w:before="20" w:after="20"/>
+            </w:pPr>
             <w:r>
               <w:rPr>
                 <w:sz w:val="18"/>
@@ -1846,6 +2170,9 @@
             <w:tcW w:type="dxa" w:w="879"/>
           </w:tcPr>
           <w:p>
+            <w:pPr>
+              <w:spacing w:before="20" w:after="20"/>
+            </w:pPr>
             <w:r>
               <w:rPr>
                 <w:b/>
@@ -1860,6 +2187,9 @@
             <w:tcW w:type="dxa" w:w="879"/>
           </w:tcPr>
           <w:p>
+            <w:pPr>
+              <w:spacing w:before="20" w:after="20"/>
+            </w:pPr>
             <w:r>
               <w:rPr>
                 <w:sz w:val="18"/>
@@ -1873,6 +2203,9 @@
             <w:tcW w:type="dxa" w:w="879"/>
           </w:tcPr>
           <w:p>
+            <w:pPr>
+              <w:spacing w:before="20" w:after="20"/>
+            </w:pPr>
             <w:r>
               <w:rPr>
                 <w:sz w:val="18"/>
@@ -1886,6 +2219,9 @@
             <w:tcW w:type="dxa" w:w="879"/>
           </w:tcPr>
           <w:p>
+            <w:pPr>
+              <w:spacing w:before="20" w:after="20"/>
+            </w:pPr>
             <w:r>
               <w:rPr>
                 <w:sz w:val="18"/>
@@ -1899,6 +2235,9 @@
             <w:tcW w:type="dxa" w:w="879"/>
           </w:tcPr>
           <w:p>
+            <w:pPr>
+              <w:spacing w:before="20" w:after="20"/>
+            </w:pPr>
             <w:r>
               <w:rPr>
                 <w:sz w:val="18"/>
@@ -1912,6 +2251,9 @@
             <w:tcW w:type="dxa" w:w="879"/>
           </w:tcPr>
           <w:p>
+            <w:pPr>
+              <w:spacing w:before="20" w:after="20"/>
+            </w:pPr>
             <w:r>
               <w:rPr>
                 <w:sz w:val="18"/>
@@ -1925,6 +2267,9 @@
             <w:tcW w:type="dxa" w:w="879"/>
           </w:tcPr>
           <w:p>
+            <w:pPr>
+              <w:spacing w:before="20" w:after="20"/>
+            </w:pPr>
             <w:r>
               <w:rPr>
                 <w:sz w:val="18"/>
@@ -1938,6 +2283,9 @@
             <w:tcW w:type="dxa" w:w="879"/>
           </w:tcPr>
           <w:p>
+            <w:pPr>
+              <w:spacing w:before="20" w:after="20"/>
+            </w:pPr>
             <w:r>
               <w:rPr>
                 <w:sz w:val="18"/>
@@ -1951,6 +2299,9 @@
             <w:tcW w:type="dxa" w:w="879"/>
           </w:tcPr>
           <w:p>
+            <w:pPr>
+              <w:spacing w:before="20" w:after="20"/>
+            </w:pPr>
             <w:r>
               <w:rPr>
                 <w:sz w:val="18"/>
@@ -1964,6 +2315,9 @@
             <w:tcW w:type="dxa" w:w="879"/>
           </w:tcPr>
           <w:p>
+            <w:pPr>
+              <w:spacing w:before="20" w:after="20"/>
+            </w:pPr>
             <w:r>
               <w:rPr>
                 <w:sz w:val="18"/>
@@ -1977,6 +2331,9 @@
             <w:tcW w:type="dxa" w:w="879"/>
           </w:tcPr>
           <w:p>
+            <w:pPr>
+              <w:spacing w:before="20" w:after="20"/>
+            </w:pPr>
             <w:r>
               <w:rPr>
                 <w:sz w:val="18"/>
@@ -1990,6 +2347,9 @@
             <w:tcW w:type="dxa" w:w="879"/>
           </w:tcPr>
           <w:p>
+            <w:pPr>
+              <w:spacing w:before="20" w:after="20"/>
+            </w:pPr>
             <w:r>
               <w:rPr>
                 <w:sz w:val="18"/>
@@ -2005,6 +2365,9 @@
             <w:tcW w:type="dxa" w:w="1191"/>
           </w:tcPr>
           <w:p>
+            <w:pPr>
+              <w:spacing w:before="20" w:after="20"/>
+            </w:pPr>
             <w:r>
               <w:rPr>
                 <w:sz w:val="18"/>
@@ -2018,6 +2381,9 @@
             <w:tcW w:type="dxa" w:w="1134"/>
           </w:tcPr>
           <w:p>
+            <w:pPr>
+              <w:spacing w:before="20" w:after="20"/>
+            </w:pPr>
             <w:r>
               <w:rPr>
                 <w:sz w:val="18"/>
@@ -2031,6 +2397,9 @@
             <w:tcW w:type="dxa" w:w="879"/>
           </w:tcPr>
           <w:p>
+            <w:pPr>
+              <w:spacing w:before="20" w:after="20"/>
+            </w:pPr>
             <w:r>
               <w:rPr>
                 <w:b/>
@@ -2045,6 +2414,9 @@
             <w:tcW w:type="dxa" w:w="879"/>
           </w:tcPr>
           <w:p>
+            <w:pPr>
+              <w:spacing w:before="20" w:after="20"/>
+            </w:pPr>
             <w:r>
               <w:rPr>
                 <w:sz w:val="18"/>
@@ -2058,6 +2430,9 @@
             <w:tcW w:type="dxa" w:w="879"/>
           </w:tcPr>
           <w:p>
+            <w:pPr>
+              <w:spacing w:before="20" w:after="20"/>
+            </w:pPr>
             <w:r>
               <w:rPr>
                 <w:sz w:val="18"/>
@@ -2071,6 +2446,9 @@
             <w:tcW w:type="dxa" w:w="879"/>
           </w:tcPr>
           <w:p>
+            <w:pPr>
+              <w:spacing w:before="20" w:after="20"/>
+            </w:pPr>
             <w:r>
               <w:rPr>
                 <w:sz w:val="18"/>
@@ -2084,6 +2462,9 @@
             <w:tcW w:type="dxa" w:w="879"/>
           </w:tcPr>
           <w:p>
+            <w:pPr>
+              <w:spacing w:before="20" w:after="20"/>
+            </w:pPr>
             <w:r>
               <w:rPr>
                 <w:sz w:val="18"/>
@@ -2097,6 +2478,9 @@
             <w:tcW w:type="dxa" w:w="879"/>
           </w:tcPr>
           <w:p>
+            <w:pPr>
+              <w:spacing w:before="20" w:after="20"/>
+            </w:pPr>
             <w:r>
               <w:rPr>
                 <w:sz w:val="18"/>
@@ -2110,6 +2494,9 @@
             <w:tcW w:type="dxa" w:w="879"/>
           </w:tcPr>
           <w:p>
+            <w:pPr>
+              <w:spacing w:before="20" w:after="20"/>
+            </w:pPr>
             <w:r>
               <w:rPr>
                 <w:sz w:val="18"/>
@@ -2123,6 +2510,9 @@
             <w:tcW w:type="dxa" w:w="879"/>
           </w:tcPr>
           <w:p>
+            <w:pPr>
+              <w:spacing w:before="20" w:after="20"/>
+            </w:pPr>
             <w:r>
               <w:rPr>
                 <w:sz w:val="18"/>
@@ -2136,6 +2526,9 @@
             <w:tcW w:type="dxa" w:w="879"/>
           </w:tcPr>
           <w:p>
+            <w:pPr>
+              <w:spacing w:before="20" w:after="20"/>
+            </w:pPr>
             <w:r>
               <w:rPr>
                 <w:sz w:val="18"/>
@@ -2149,6 +2542,9 @@
             <w:tcW w:type="dxa" w:w="879"/>
           </w:tcPr>
           <w:p>
+            <w:pPr>
+              <w:spacing w:before="20" w:after="20"/>
+            </w:pPr>
             <w:r>
               <w:rPr>
                 <w:sz w:val="18"/>
@@ -2162,6 +2558,9 @@
             <w:tcW w:type="dxa" w:w="879"/>
           </w:tcPr>
           <w:p>
+            <w:pPr>
+              <w:spacing w:before="20" w:after="20"/>
+            </w:pPr>
             <w:r>
               <w:rPr>
                 <w:sz w:val="18"/>
@@ -2175,6 +2574,9 @@
             <w:tcW w:type="dxa" w:w="879"/>
           </w:tcPr>
           <w:p>
+            <w:pPr>
+              <w:spacing w:before="20" w:after="20"/>
+            </w:pPr>
             <w:r>
               <w:rPr>
                 <w:sz w:val="18"/>
@@ -2190,6 +2592,9 @@
             <w:tcW w:type="dxa" w:w="1191"/>
           </w:tcPr>
           <w:p>
+            <w:pPr>
+              <w:spacing w:before="20" w:after="20"/>
+            </w:pPr>
             <w:r>
               <w:rPr>
                 <w:sz w:val="18"/>
@@ -2203,6 +2608,9 @@
             <w:tcW w:type="dxa" w:w="1134"/>
           </w:tcPr>
           <w:p>
+            <w:pPr>
+              <w:spacing w:before="20" w:after="20"/>
+            </w:pPr>
             <w:r>
               <w:rPr>
                 <w:sz w:val="18"/>
@@ -2216,6 +2624,9 @@
             <w:tcW w:type="dxa" w:w="879"/>
           </w:tcPr>
           <w:p>
+            <w:pPr>
+              <w:spacing w:before="20" w:after="20"/>
+            </w:pPr>
             <w:r>
               <w:rPr>
                 <w:b/>
@@ -2230,6 +2641,9 @@
             <w:tcW w:type="dxa" w:w="879"/>
           </w:tcPr>
           <w:p>
+            <w:pPr>
+              <w:spacing w:before="20" w:after="20"/>
+            </w:pPr>
             <w:r>
               <w:rPr>
                 <w:sz w:val="18"/>
@@ -2243,6 +2657,9 @@
             <w:tcW w:type="dxa" w:w="879"/>
           </w:tcPr>
           <w:p>
+            <w:pPr>
+              <w:spacing w:before="20" w:after="20"/>
+            </w:pPr>
             <w:r>
               <w:rPr>
                 <w:sz w:val="18"/>
@@ -2256,6 +2673,9 @@
             <w:tcW w:type="dxa" w:w="879"/>
           </w:tcPr>
           <w:p>
+            <w:pPr>
+              <w:spacing w:before="20" w:after="20"/>
+            </w:pPr>
             <w:r>
               <w:rPr>
                 <w:sz w:val="18"/>
@@ -2269,6 +2689,9 @@
             <w:tcW w:type="dxa" w:w="879"/>
           </w:tcPr>
           <w:p>
+            <w:pPr>
+              <w:spacing w:before="20" w:after="20"/>
+            </w:pPr>
             <w:r>
               <w:rPr>
                 <w:sz w:val="18"/>
@@ -2282,6 +2705,9 @@
             <w:tcW w:type="dxa" w:w="879"/>
           </w:tcPr>
           <w:p>
+            <w:pPr>
+              <w:spacing w:before="20" w:after="20"/>
+            </w:pPr>
             <w:r>
               <w:rPr>
                 <w:sz w:val="18"/>
@@ -2295,6 +2721,9 @@
             <w:tcW w:type="dxa" w:w="879"/>
           </w:tcPr>
           <w:p>
+            <w:pPr>
+              <w:spacing w:before="20" w:after="20"/>
+            </w:pPr>
             <w:r>
               <w:rPr>
                 <w:sz w:val="18"/>
@@ -2308,6 +2737,9 @@
             <w:tcW w:type="dxa" w:w="879"/>
           </w:tcPr>
           <w:p>
+            <w:pPr>
+              <w:spacing w:before="20" w:after="20"/>
+            </w:pPr>
             <w:r>
               <w:rPr>
                 <w:sz w:val="18"/>
@@ -2321,6 +2753,9 @@
             <w:tcW w:type="dxa" w:w="879"/>
           </w:tcPr>
           <w:p>
+            <w:pPr>
+              <w:spacing w:before="20" w:after="20"/>
+            </w:pPr>
             <w:r>
               <w:rPr>
                 <w:sz w:val="18"/>
@@ -2334,6 +2769,9 @@
             <w:tcW w:type="dxa" w:w="879"/>
           </w:tcPr>
           <w:p>
+            <w:pPr>
+              <w:spacing w:before="20" w:after="20"/>
+            </w:pPr>
             <w:r>
               <w:rPr>
                 <w:sz w:val="18"/>
@@ -2347,6 +2785,9 @@
             <w:tcW w:type="dxa" w:w="879"/>
           </w:tcPr>
           <w:p>
+            <w:pPr>
+              <w:spacing w:before="20" w:after="20"/>
+            </w:pPr>
             <w:r>
               <w:rPr>
                 <w:sz w:val="18"/>
@@ -2360,6 +2801,9 @@
             <w:tcW w:type="dxa" w:w="879"/>
           </w:tcPr>
           <w:p>
+            <w:pPr>
+              <w:spacing w:before="20" w:after="20"/>
+            </w:pPr>
             <w:r>
               <w:rPr>
                 <w:sz w:val="18"/>
@@ -2375,6 +2819,9 @@
             <w:tcW w:type="dxa" w:w="1191"/>
           </w:tcPr>
           <w:p>
+            <w:pPr>
+              <w:spacing w:before="20" w:after="20"/>
+            </w:pPr>
             <w:r>
               <w:rPr>
                 <w:sz w:val="18"/>
@@ -2388,6 +2835,9 @@
             <w:tcW w:type="dxa" w:w="1134"/>
           </w:tcPr>
           <w:p>
+            <w:pPr>
+              <w:spacing w:before="20" w:after="20"/>
+            </w:pPr>
             <w:r>
               <w:rPr>
                 <w:sz w:val="18"/>
@@ -2401,6 +2851,9 @@
             <w:tcW w:type="dxa" w:w="879"/>
           </w:tcPr>
           <w:p>
+            <w:pPr>
+              <w:spacing w:before="20" w:after="20"/>
+            </w:pPr>
             <w:r>
               <w:rPr>
                 <w:b/>
@@ -2415,6 +2868,9 @@
             <w:tcW w:type="dxa" w:w="879"/>
           </w:tcPr>
           <w:p>
+            <w:pPr>
+              <w:spacing w:before="20" w:after="20"/>
+            </w:pPr>
             <w:r>
               <w:rPr>
                 <w:sz w:val="18"/>
@@ -2428,6 +2884,9 @@
             <w:tcW w:type="dxa" w:w="879"/>
           </w:tcPr>
           <w:p>
+            <w:pPr>
+              <w:spacing w:before="20" w:after="20"/>
+            </w:pPr>
             <w:r>
               <w:rPr>
                 <w:sz w:val="18"/>
@@ -2441,6 +2900,9 @@
             <w:tcW w:type="dxa" w:w="879"/>
           </w:tcPr>
           <w:p>
+            <w:pPr>
+              <w:spacing w:before="20" w:after="20"/>
+            </w:pPr>
             <w:r>
               <w:rPr>
                 <w:sz w:val="18"/>
@@ -2454,6 +2916,9 @@
             <w:tcW w:type="dxa" w:w="879"/>
           </w:tcPr>
           <w:p>
+            <w:pPr>
+              <w:spacing w:before="20" w:after="20"/>
+            </w:pPr>
             <w:r>
               <w:rPr>
                 <w:sz w:val="18"/>
@@ -2467,6 +2932,9 @@
             <w:tcW w:type="dxa" w:w="879"/>
           </w:tcPr>
           <w:p>
+            <w:pPr>
+              <w:spacing w:before="20" w:after="20"/>
+            </w:pPr>
             <w:r>
               <w:rPr>
                 <w:sz w:val="18"/>
@@ -2480,6 +2948,9 @@
             <w:tcW w:type="dxa" w:w="879"/>
           </w:tcPr>
           <w:p>
+            <w:pPr>
+              <w:spacing w:before="20" w:after="20"/>
+            </w:pPr>
             <w:r>
               <w:rPr>
                 <w:sz w:val="18"/>
@@ -2493,6 +2964,9 @@
             <w:tcW w:type="dxa" w:w="879"/>
           </w:tcPr>
           <w:p>
+            <w:pPr>
+              <w:spacing w:before="20" w:after="20"/>
+            </w:pPr>
             <w:r>
               <w:rPr>
                 <w:sz w:val="18"/>
@@ -2506,6 +2980,9 @@
             <w:tcW w:type="dxa" w:w="879"/>
           </w:tcPr>
           <w:p>
+            <w:pPr>
+              <w:spacing w:before="20" w:after="20"/>
+            </w:pPr>
             <w:r>
               <w:rPr>
                 <w:sz w:val="18"/>
@@ -2519,6 +2996,9 @@
             <w:tcW w:type="dxa" w:w="879"/>
           </w:tcPr>
           <w:p>
+            <w:pPr>
+              <w:spacing w:before="20" w:after="20"/>
+            </w:pPr>
             <w:r>
               <w:rPr>
                 <w:sz w:val="18"/>
@@ -2532,6 +3012,9 @@
             <w:tcW w:type="dxa" w:w="879"/>
           </w:tcPr>
           <w:p>
+            <w:pPr>
+              <w:spacing w:before="20" w:after="20"/>
+            </w:pPr>
             <w:r>
               <w:rPr>
                 <w:sz w:val="18"/>
@@ -2545,6 +3028,9 @@
             <w:tcW w:type="dxa" w:w="879"/>
           </w:tcPr>
           <w:p>
+            <w:pPr>
+              <w:spacing w:before="20" w:after="20"/>
+            </w:pPr>
             <w:r>
               <w:rPr>
                 <w:sz w:val="18"/>
@@ -2560,6 +3046,9 @@
             <w:tcW w:type="dxa" w:w="1191"/>
           </w:tcPr>
           <w:p>
+            <w:pPr>
+              <w:spacing w:before="20" w:after="20"/>
+            </w:pPr>
             <w:r>
               <w:rPr>
                 <w:sz w:val="18"/>
@@ -2573,6 +3062,9 @@
             <w:tcW w:type="dxa" w:w="1134"/>
           </w:tcPr>
           <w:p>
+            <w:pPr>
+              <w:spacing w:before="20" w:after="20"/>
+            </w:pPr>
             <w:r>
               <w:rPr>
                 <w:sz w:val="18"/>
@@ -2586,6 +3078,9 @@
             <w:tcW w:type="dxa" w:w="879"/>
           </w:tcPr>
           <w:p>
+            <w:pPr>
+              <w:spacing w:before="20" w:after="20"/>
+            </w:pPr>
             <w:r>
               <w:rPr>
                 <w:b/>
@@ -2600,6 +3095,9 @@
             <w:tcW w:type="dxa" w:w="879"/>
           </w:tcPr>
           <w:p>
+            <w:pPr>
+              <w:spacing w:before="20" w:after="20"/>
+            </w:pPr>
             <w:r>
               <w:rPr>
                 <w:sz w:val="18"/>
@@ -2613,6 +3111,9 @@
             <w:tcW w:type="dxa" w:w="879"/>
           </w:tcPr>
           <w:p>
+            <w:pPr>
+              <w:spacing w:before="20" w:after="20"/>
+            </w:pPr>
             <w:r>
               <w:rPr>
                 <w:sz w:val="18"/>
@@ -2626,6 +3127,9 @@
             <w:tcW w:type="dxa" w:w="879"/>
           </w:tcPr>
           <w:p>
+            <w:pPr>
+              <w:spacing w:before="20" w:after="20"/>
+            </w:pPr>
             <w:r>
               <w:rPr>
                 <w:sz w:val="18"/>
@@ -2639,6 +3143,9 @@
             <w:tcW w:type="dxa" w:w="879"/>
           </w:tcPr>
           <w:p>
+            <w:pPr>
+              <w:spacing w:before="20" w:after="20"/>
+            </w:pPr>
             <w:r>
               <w:rPr>
                 <w:sz w:val="18"/>
@@ -2652,6 +3159,9 @@
             <w:tcW w:type="dxa" w:w="879"/>
           </w:tcPr>
           <w:p>
+            <w:pPr>
+              <w:spacing w:before="20" w:after="20"/>
+            </w:pPr>
             <w:r>
               <w:rPr>
                 <w:sz w:val="18"/>
@@ -2665,6 +3175,9 @@
             <w:tcW w:type="dxa" w:w="879"/>
           </w:tcPr>
           <w:p>
+            <w:pPr>
+              <w:spacing w:before="20" w:after="20"/>
+            </w:pPr>
             <w:r>
               <w:rPr>
                 <w:sz w:val="18"/>
@@ -2678,6 +3191,9 @@
             <w:tcW w:type="dxa" w:w="879"/>
           </w:tcPr>
           <w:p>
+            <w:pPr>
+              <w:spacing w:before="20" w:after="20"/>
+            </w:pPr>
             <w:r>
               <w:rPr>
                 <w:sz w:val="18"/>
@@ -2691,6 +3207,9 @@
             <w:tcW w:type="dxa" w:w="879"/>
           </w:tcPr>
           <w:p>
+            <w:pPr>
+              <w:spacing w:before="20" w:after="20"/>
+            </w:pPr>
             <w:r>
               <w:rPr>
                 <w:sz w:val="18"/>
@@ -2704,6 +3223,9 @@
             <w:tcW w:type="dxa" w:w="879"/>
           </w:tcPr>
           <w:p>
+            <w:pPr>
+              <w:spacing w:before="20" w:after="20"/>
+            </w:pPr>
             <w:r>
               <w:rPr>
                 <w:sz w:val="18"/>
@@ -2717,6 +3239,9 @@
             <w:tcW w:type="dxa" w:w="879"/>
           </w:tcPr>
           <w:p>
+            <w:pPr>
+              <w:spacing w:before="20" w:after="20"/>
+            </w:pPr>
             <w:r>
               <w:rPr>
                 <w:sz w:val="18"/>
@@ -2730,6 +3255,9 @@
             <w:tcW w:type="dxa" w:w="879"/>
           </w:tcPr>
           <w:p>
+            <w:pPr>
+              <w:spacing w:before="20" w:after="20"/>
+            </w:pPr>
             <w:r>
               <w:rPr>
                 <w:sz w:val="18"/>
@@ -2745,6 +3273,9 @@
             <w:tcW w:type="dxa" w:w="1191"/>
           </w:tcPr>
           <w:p>
+            <w:pPr>
+              <w:spacing w:before="20" w:after="20"/>
+            </w:pPr>
             <w:r>
               <w:rPr>
                 <w:sz w:val="18"/>
@@ -2758,6 +3289,9 @@
             <w:tcW w:type="dxa" w:w="1134"/>
           </w:tcPr>
           <w:p>
+            <w:pPr>
+              <w:spacing w:before="20" w:after="20"/>
+            </w:pPr>
             <w:r>
               <w:rPr>
                 <w:sz w:val="18"/>
@@ -2771,6 +3305,9 @@
             <w:tcW w:type="dxa" w:w="879"/>
           </w:tcPr>
           <w:p>
+            <w:pPr>
+              <w:spacing w:before="20" w:after="20"/>
+            </w:pPr>
             <w:r>
               <w:rPr>
                 <w:b/>
@@ -2785,6 +3322,9 @@
             <w:tcW w:type="dxa" w:w="879"/>
           </w:tcPr>
           <w:p>
+            <w:pPr>
+              <w:spacing w:before="20" w:after="20"/>
+            </w:pPr>
             <w:r>
               <w:rPr>
                 <w:sz w:val="18"/>
@@ -2798,6 +3338,9 @@
             <w:tcW w:type="dxa" w:w="879"/>
           </w:tcPr>
           <w:p>
+            <w:pPr>
+              <w:spacing w:before="20" w:after="20"/>
+            </w:pPr>
             <w:r>
               <w:rPr>
                 <w:sz w:val="18"/>
@@ -2811,6 +3354,9 @@
             <w:tcW w:type="dxa" w:w="879"/>
           </w:tcPr>
           <w:p>
+            <w:pPr>
+              <w:spacing w:before="20" w:after="20"/>
+            </w:pPr>
             <w:r>
               <w:rPr>
                 <w:sz w:val="18"/>
@@ -2824,6 +3370,9 @@
             <w:tcW w:type="dxa" w:w="879"/>
           </w:tcPr>
           <w:p>
+            <w:pPr>
+              <w:spacing w:before="20" w:after="20"/>
+            </w:pPr>
             <w:r>
               <w:rPr>
                 <w:sz w:val="18"/>
@@ -2837,6 +3386,9 @@
             <w:tcW w:type="dxa" w:w="879"/>
           </w:tcPr>
           <w:p>
+            <w:pPr>
+              <w:spacing w:before="20" w:after="20"/>
+            </w:pPr>
             <w:r>
               <w:rPr>
                 <w:sz w:val="18"/>
@@ -2850,6 +3402,9 @@
             <w:tcW w:type="dxa" w:w="879"/>
           </w:tcPr>
           <w:p>
+            <w:pPr>
+              <w:spacing w:before="20" w:after="20"/>
+            </w:pPr>
             <w:r>
               <w:rPr>
                 <w:sz w:val="18"/>
@@ -2863,6 +3418,9 @@
             <w:tcW w:type="dxa" w:w="879"/>
           </w:tcPr>
           <w:p>
+            <w:pPr>
+              <w:spacing w:before="20" w:after="20"/>
+            </w:pPr>
             <w:r>
               <w:rPr>
                 <w:sz w:val="18"/>
@@ -2876,6 +3434,9 @@
             <w:tcW w:type="dxa" w:w="879"/>
           </w:tcPr>
           <w:p>
+            <w:pPr>
+              <w:spacing w:before="20" w:after="20"/>
+            </w:pPr>
             <w:r>
               <w:rPr>
                 <w:sz w:val="18"/>
@@ -2889,6 +3450,9 @@
             <w:tcW w:type="dxa" w:w="879"/>
           </w:tcPr>
           <w:p>
+            <w:pPr>
+              <w:spacing w:before="20" w:after="20"/>
+            </w:pPr>
             <w:r>
               <w:rPr>
                 <w:sz w:val="18"/>
@@ -2902,6 +3466,9 @@
             <w:tcW w:type="dxa" w:w="879"/>
           </w:tcPr>
           <w:p>
+            <w:pPr>
+              <w:spacing w:before="20" w:after="20"/>
+            </w:pPr>
             <w:r>
               <w:rPr>
                 <w:sz w:val="18"/>
@@ -2915,6 +3482,9 @@
             <w:tcW w:type="dxa" w:w="879"/>
           </w:tcPr>
           <w:p>
+            <w:pPr>
+              <w:spacing w:before="20" w:after="20"/>
+            </w:pPr>
             <w:r>
               <w:rPr>
                 <w:sz w:val="18"/>
@@ -2930,6 +3500,9 @@
             <w:tcW w:type="dxa" w:w="1191"/>
           </w:tcPr>
           <w:p>
+            <w:pPr>
+              <w:spacing w:before="20" w:after="20"/>
+            </w:pPr>
             <w:r>
               <w:rPr>
                 <w:sz w:val="18"/>
@@ -2943,6 +3516,9 @@
             <w:tcW w:type="dxa" w:w="1134"/>
           </w:tcPr>
           <w:p>
+            <w:pPr>
+              <w:spacing w:before="20" w:after="20"/>
+            </w:pPr>
             <w:r>
               <w:rPr>
                 <w:sz w:val="18"/>
@@ -2956,6 +3532,9 @@
             <w:tcW w:type="dxa" w:w="879"/>
           </w:tcPr>
           <w:p>
+            <w:pPr>
+              <w:spacing w:before="20" w:after="20"/>
+            </w:pPr>
             <w:r>
               <w:rPr>
                 <w:b/>
@@ -2970,6 +3549,9 @@
             <w:tcW w:type="dxa" w:w="879"/>
           </w:tcPr>
           <w:p>
+            <w:pPr>
+              <w:spacing w:before="20" w:after="20"/>
+            </w:pPr>
             <w:r>
               <w:rPr>
                 <w:sz w:val="18"/>
@@ -2983,6 +3565,9 @@
             <w:tcW w:type="dxa" w:w="879"/>
           </w:tcPr>
           <w:p>
+            <w:pPr>
+              <w:spacing w:before="20" w:after="20"/>
+            </w:pPr>
             <w:r>
               <w:rPr>
                 <w:sz w:val="18"/>
@@ -2996,6 +3581,9 @@
             <w:tcW w:type="dxa" w:w="879"/>
           </w:tcPr>
           <w:p>
+            <w:pPr>
+              <w:spacing w:before="20" w:after="20"/>
+            </w:pPr>
             <w:r>
               <w:rPr>
                 <w:sz w:val="18"/>
@@ -3009,6 +3597,9 @@
             <w:tcW w:type="dxa" w:w="879"/>
           </w:tcPr>
           <w:p>
+            <w:pPr>
+              <w:spacing w:before="20" w:after="20"/>
+            </w:pPr>
             <w:r>
               <w:rPr>
                 <w:sz w:val="18"/>
@@ -3022,6 +3613,9 @@
             <w:tcW w:type="dxa" w:w="879"/>
           </w:tcPr>
           <w:p>
+            <w:pPr>
+              <w:spacing w:before="20" w:after="20"/>
+            </w:pPr>
             <w:r>
               <w:rPr>
                 <w:sz w:val="18"/>
@@ -3035,6 +3629,9 @@
             <w:tcW w:type="dxa" w:w="879"/>
           </w:tcPr>
           <w:p>
+            <w:pPr>
+              <w:spacing w:before="20" w:after="20"/>
+            </w:pPr>
             <w:r>
               <w:rPr>
                 <w:sz w:val="18"/>
@@ -3048,6 +3645,9 @@
             <w:tcW w:type="dxa" w:w="879"/>
           </w:tcPr>
           <w:p>
+            <w:pPr>
+              <w:spacing w:before="20" w:after="20"/>
+            </w:pPr>
             <w:r>
               <w:rPr>
                 <w:sz w:val="18"/>
@@ -3061,6 +3661,9 @@
             <w:tcW w:type="dxa" w:w="879"/>
           </w:tcPr>
           <w:p>
+            <w:pPr>
+              <w:spacing w:before="20" w:after="20"/>
+            </w:pPr>
             <w:r>
               <w:rPr>
                 <w:sz w:val="18"/>
@@ -3074,6 +3677,9 @@
             <w:tcW w:type="dxa" w:w="879"/>
           </w:tcPr>
           <w:p>
+            <w:pPr>
+              <w:spacing w:before="20" w:after="20"/>
+            </w:pPr>
             <w:r>
               <w:rPr>
                 <w:sz w:val="18"/>
@@ -3087,6 +3693,9 @@
             <w:tcW w:type="dxa" w:w="879"/>
           </w:tcPr>
           <w:p>
+            <w:pPr>
+              <w:spacing w:before="20" w:after="20"/>
+            </w:pPr>
             <w:r>
               <w:rPr>
                 <w:sz w:val="18"/>
@@ -3100,6 +3709,9 @@
             <w:tcW w:type="dxa" w:w="879"/>
           </w:tcPr>
           <w:p>
+            <w:pPr>
+              <w:spacing w:before="20" w:after="20"/>
+            </w:pPr>
             <w:r>
               <w:rPr>
                 <w:sz w:val="18"/>
@@ -3115,6 +3727,9 @@
             <w:tcW w:type="dxa" w:w="1191"/>
           </w:tcPr>
           <w:p>
+            <w:pPr>
+              <w:spacing w:before="20" w:after="20"/>
+            </w:pPr>
             <w:r>
               <w:rPr>
                 <w:sz w:val="18"/>
@@ -3128,6 +3743,9 @@
             <w:tcW w:type="dxa" w:w="1134"/>
           </w:tcPr>
           <w:p>
+            <w:pPr>
+              <w:spacing w:before="20" w:after="20"/>
+            </w:pPr>
             <w:r>
               <w:rPr>
                 <w:sz w:val="18"/>
@@ -3141,6 +3759,9 @@
             <w:tcW w:type="dxa" w:w="879"/>
           </w:tcPr>
           <w:p>
+            <w:pPr>
+              <w:spacing w:before="20" w:after="20"/>
+            </w:pPr>
             <w:r>
               <w:rPr>
                 <w:b/>
@@ -3155,6 +3776,9 @@
             <w:tcW w:type="dxa" w:w="879"/>
           </w:tcPr>
           <w:p>
+            <w:pPr>
+              <w:spacing w:before="20" w:after="20"/>
+            </w:pPr>
             <w:r>
               <w:rPr>
                 <w:sz w:val="18"/>
@@ -3168,6 +3792,9 @@
             <w:tcW w:type="dxa" w:w="879"/>
           </w:tcPr>
           <w:p>
+            <w:pPr>
+              <w:spacing w:before="20" w:after="20"/>
+            </w:pPr>
             <w:r>
               <w:rPr>
                 <w:sz w:val="18"/>
@@ -3181,6 +3808,9 @@
             <w:tcW w:type="dxa" w:w="879"/>
           </w:tcPr>
           <w:p>
+            <w:pPr>
+              <w:spacing w:before="20" w:after="20"/>
+            </w:pPr>
             <w:r>
               <w:rPr>
                 <w:sz w:val="18"/>
@@ -3194,6 +3824,9 @@
             <w:tcW w:type="dxa" w:w="879"/>
           </w:tcPr>
           <w:p>
+            <w:pPr>
+              <w:spacing w:before="20" w:after="20"/>
+            </w:pPr>
             <w:r>
               <w:rPr>
                 <w:sz w:val="18"/>
@@ -3207,6 +3840,9 @@
             <w:tcW w:type="dxa" w:w="879"/>
           </w:tcPr>
           <w:p>
+            <w:pPr>
+              <w:spacing w:before="20" w:after="20"/>
+            </w:pPr>
             <w:r>
               <w:rPr>
                 <w:sz w:val="18"/>
@@ -3220,6 +3856,9 @@
             <w:tcW w:type="dxa" w:w="879"/>
           </w:tcPr>
           <w:p>
+            <w:pPr>
+              <w:spacing w:before="20" w:after="20"/>
+            </w:pPr>
             <w:r>
               <w:rPr>
                 <w:sz w:val="18"/>
@@ -3233,6 +3872,9 @@
             <w:tcW w:type="dxa" w:w="879"/>
           </w:tcPr>
           <w:p>
+            <w:pPr>
+              <w:spacing w:before="20" w:after="20"/>
+            </w:pPr>
             <w:r>
               <w:rPr>
                 <w:sz w:val="18"/>
@@ -3246,6 +3888,9 @@
             <w:tcW w:type="dxa" w:w="879"/>
           </w:tcPr>
           <w:p>
+            <w:pPr>
+              <w:spacing w:before="20" w:after="20"/>
+            </w:pPr>
             <w:r>
               <w:rPr>
                 <w:sz w:val="18"/>
@@ -3259,6 +3904,9 @@
             <w:tcW w:type="dxa" w:w="879"/>
           </w:tcPr>
           <w:p>
+            <w:pPr>
+              <w:spacing w:before="20" w:after="20"/>
+            </w:pPr>
             <w:r>
               <w:rPr>
                 <w:sz w:val="18"/>
@@ -3272,6 +3920,9 @@
             <w:tcW w:type="dxa" w:w="879"/>
           </w:tcPr>
           <w:p>
+            <w:pPr>
+              <w:spacing w:before="20" w:after="20"/>
+            </w:pPr>
             <w:r>
               <w:rPr>
                 <w:sz w:val="18"/>
@@ -3285,6 +3936,9 @@
             <w:tcW w:type="dxa" w:w="879"/>
           </w:tcPr>
           <w:p>
+            <w:pPr>
+              <w:spacing w:before="20" w:after="20"/>
+            </w:pPr>
             <w:r>
               <w:rPr>
                 <w:sz w:val="18"/>
@@ -3300,6 +3954,9 @@
             <w:tcW w:type="dxa" w:w="1191"/>
           </w:tcPr>
           <w:p>
+            <w:pPr>
+              <w:spacing w:before="20" w:after="20"/>
+            </w:pPr>
             <w:r>
               <w:rPr>
                 <w:sz w:val="18"/>
@@ -3313,6 +3970,9 @@
             <w:tcW w:type="dxa" w:w="1134"/>
           </w:tcPr>
           <w:p>
+            <w:pPr>
+              <w:spacing w:before="20" w:after="20"/>
+            </w:pPr>
             <w:r>
               <w:rPr>
                 <w:sz w:val="18"/>
@@ -3326,6 +3986,9 @@
             <w:tcW w:type="dxa" w:w="879"/>
           </w:tcPr>
           <w:p>
+            <w:pPr>
+              <w:spacing w:before="20" w:after="20"/>
+            </w:pPr>
             <w:r>
               <w:rPr>
                 <w:b/>
@@ -3340,6 +4003,9 @@
             <w:tcW w:type="dxa" w:w="879"/>
           </w:tcPr>
           <w:p>
+            <w:pPr>
+              <w:spacing w:before="20" w:after="20"/>
+            </w:pPr>
             <w:r>
               <w:rPr>
                 <w:sz w:val="18"/>
@@ -3353,6 +4019,9 @@
             <w:tcW w:type="dxa" w:w="879"/>
           </w:tcPr>
           <w:p>
+            <w:pPr>
+              <w:spacing w:before="20" w:after="20"/>
+            </w:pPr>
             <w:r>
               <w:rPr>
                 <w:sz w:val="18"/>
@@ -3366,6 +4035,9 @@
             <w:tcW w:type="dxa" w:w="879"/>
           </w:tcPr>
           <w:p>
+            <w:pPr>
+              <w:spacing w:before="20" w:after="20"/>
+            </w:pPr>
             <w:r>
               <w:rPr>
                 <w:sz w:val="18"/>
@@ -3379,6 +4051,9 @@
             <w:tcW w:type="dxa" w:w="879"/>
           </w:tcPr>
           <w:p>
+            <w:pPr>
+              <w:spacing w:before="20" w:after="20"/>
+            </w:pPr>
             <w:r>
               <w:rPr>
                 <w:sz w:val="18"/>
@@ -3392,6 +4067,9 @@
             <w:tcW w:type="dxa" w:w="879"/>
           </w:tcPr>
           <w:p>
+            <w:pPr>
+              <w:spacing w:before="20" w:after="20"/>
+            </w:pPr>
             <w:r>
               <w:rPr>
                 <w:sz w:val="18"/>
@@ -3405,6 +4083,9 @@
             <w:tcW w:type="dxa" w:w="879"/>
           </w:tcPr>
           <w:p>
+            <w:pPr>
+              <w:spacing w:before="20" w:after="20"/>
+            </w:pPr>
             <w:r>
               <w:rPr>
                 <w:sz w:val="18"/>
@@ -3418,6 +4099,9 @@
             <w:tcW w:type="dxa" w:w="879"/>
           </w:tcPr>
           <w:p>
+            <w:pPr>
+              <w:spacing w:before="20" w:after="20"/>
+            </w:pPr>
             <w:r>
               <w:rPr>
                 <w:sz w:val="18"/>
@@ -3431,6 +4115,9 @@
             <w:tcW w:type="dxa" w:w="879"/>
           </w:tcPr>
           <w:p>
+            <w:pPr>
+              <w:spacing w:before="20" w:after="20"/>
+            </w:pPr>
             <w:r>
               <w:rPr>
                 <w:sz w:val="18"/>
@@ -3444,6 +4131,9 @@
             <w:tcW w:type="dxa" w:w="879"/>
           </w:tcPr>
           <w:p>
+            <w:pPr>
+              <w:spacing w:before="20" w:after="20"/>
+            </w:pPr>
             <w:r>
               <w:rPr>
                 <w:sz w:val="18"/>
@@ -3457,6 +4147,9 @@
             <w:tcW w:type="dxa" w:w="879"/>
           </w:tcPr>
           <w:p>
+            <w:pPr>
+              <w:spacing w:before="20" w:after="20"/>
+            </w:pPr>
             <w:r>
               <w:rPr>
                 <w:sz w:val="18"/>
@@ -3470,6 +4163,9 @@
             <w:tcW w:type="dxa" w:w="879"/>
           </w:tcPr>
           <w:p>
+            <w:pPr>
+              <w:spacing w:before="20" w:after="20"/>
+            </w:pPr>
             <w:r>
               <w:rPr>
                 <w:sz w:val="18"/>
@@ -3482,7 +4178,14 @@
     </w:tbl>
     <w:p>
       <w:pPr>
+        <w:spacing w:before="0" w:after="0" w:lineRule="exact" w:line="140"/>
+      </w:pPr>
+    </w:p>
+    <w:p>
+      <w:pPr>
         <w:pStyle w:val="MDPI52figure"/>
+        <w:keepNext/>
+        <w:spacing w:before="200" w:after="80"/>
         <w:jc w:val="center"/>
       </w:pPr>
       <w:r>
@@ -3523,6 +4226,7 @@
     <w:p>
       <w:pPr>
         <w:pStyle w:val="MDPI51figurecaption"/>
+        <w:spacing w:after="240"/>
       </w:pPr>
       <w:r>
         <w:t>Figure 6. RMSE by cell: proposed ensemble versus the deep hybrid baseline [7].</w:t>
@@ -3530,6 +4234,11 @@
     </w:p>
     <w:p>
       <w:pPr>
+        <w:spacing w:before="0" w:after="0" w:lineRule="exact" w:line="100"/>
+      </w:pPr>
+    </w:p>
+    <w:p>
+      <w:pPr>
         <w:pStyle w:val="MDPI22heading2"/>
       </w:pPr>
       <w:r>
@@ -3547,6 +4256,8 @@
     <w:p>
       <w:pPr>
         <w:pStyle w:val="MDPI41tablecaption"/>
+        <w:keepNext/>
+        <w:spacing w:before="240" w:after="120"/>
       </w:pPr>
       <w:r>
         <w:t>Table 5. Residual analysis and diagnostics: mean, Ljung-Box p (lag 10), Jarque-Bera p.</w:t>
@@ -3583,6 +4294,9 @@
             <w:shd w:fill="EDF2F7"/>
           </w:tcPr>
           <w:p>
+            <w:pPr>
+              <w:spacing w:before="20" w:after="20"/>
+            </w:pPr>
             <w:r>
               <w:rPr>
                 <w:b/>
@@ -3598,6 +4312,9 @@
             <w:shd w:fill="EDF2F7"/>
           </w:tcPr>
           <w:p>
+            <w:pPr>
+              <w:spacing w:before="20" w:after="20"/>
+            </w:pPr>
             <w:r>
               <w:rPr>
                 <w:b/>
@@ -3613,6 +4330,9 @@
             <w:shd w:fill="EDF2F7"/>
           </w:tcPr>
           <w:p>
+            <w:pPr>
+              <w:spacing w:before="20" w:after="20"/>
+            </w:pPr>
             <w:r>
               <w:rPr>
                 <w:b/>
@@ -3628,6 +4348,9 @@
             <w:shd w:fill="EDF2F7"/>
           </w:tcPr>
           <w:p>
+            <w:pPr>
+              <w:spacing w:before="20" w:after="20"/>
+            </w:pPr>
             <w:r>
               <w:rPr>
                 <w:b/>
@@ -3643,6 +4366,9 @@
             <w:shd w:fill="EDF2F7"/>
           </w:tcPr>
           <w:p>
+            <w:pPr>
+              <w:spacing w:before="20" w:after="20"/>
+            </w:pPr>
             <w:r>
               <w:rPr>
                 <w:b/>
@@ -3658,6 +4384,9 @@
             <w:shd w:fill="EDF2F7"/>
           </w:tcPr>
           <w:p>
+            <w:pPr>
+              <w:spacing w:before="20" w:after="20"/>
+            </w:pPr>
             <w:r>
               <w:rPr>
                 <w:b/>
@@ -3673,6 +4402,9 @@
             <w:shd w:fill="EDF2F7"/>
           </w:tcPr>
           <w:p>
+            <w:pPr>
+              <w:spacing w:before="20" w:after="20"/>
+            </w:pPr>
             <w:r>
               <w:rPr>
                 <w:b/>
@@ -3688,6 +4420,9 @@
             <w:shd w:fill="EDF2F7"/>
           </w:tcPr>
           <w:p>
+            <w:pPr>
+              <w:spacing w:before="20" w:after="20"/>
+            </w:pPr>
             <w:r>
               <w:rPr>
                 <w:b/>
@@ -3704,6 +4439,9 @@
             <w:tcW w:type="dxa" w:w="1304"/>
           </w:tcPr>
           <w:p>
+            <w:pPr>
+              <w:spacing w:before="20" w:after="20"/>
+            </w:pPr>
             <w:r>
               <w:rPr>
                 <w:sz w:val="18"/>
@@ -3717,6 +4455,9 @@
             <w:tcW w:type="dxa" w:w="1077"/>
           </w:tcPr>
           <w:p>
+            <w:pPr>
+              <w:spacing w:before="20" w:after="20"/>
+            </w:pPr>
             <w:r>
               <w:rPr>
                 <w:sz w:val="18"/>
@@ -3730,6 +4471,9 @@
             <w:tcW w:type="dxa" w:w="1304"/>
           </w:tcPr>
           <w:p>
+            <w:pPr>
+              <w:spacing w:before="20" w:after="20"/>
+            </w:pPr>
             <w:r>
               <w:rPr>
                 <w:sz w:val="18"/>
@@ -3743,6 +4487,9 @@
             <w:tcW w:type="dxa" w:w="1191"/>
           </w:tcPr>
           <w:p>
+            <w:pPr>
+              <w:spacing w:before="20" w:after="20"/>
+            </w:pPr>
             <w:r>
               <w:rPr>
                 <w:sz w:val="18"/>
@@ -3756,6 +4503,9 @@
             <w:tcW w:type="dxa" w:w="1191"/>
           </w:tcPr>
           <w:p>
+            <w:pPr>
+              <w:spacing w:before="20" w:after="20"/>
+            </w:pPr>
             <w:r>
               <w:rPr>
                 <w:sz w:val="18"/>
@@ -3769,6 +4519,9 @@
             <w:tcW w:type="dxa" w:w="1304"/>
           </w:tcPr>
           <w:p>
+            <w:pPr>
+              <w:spacing w:before="20" w:after="20"/>
+            </w:pPr>
             <w:r>
               <w:rPr>
                 <w:sz w:val="18"/>
@@ -3782,6 +4535,9 @@
             <w:tcW w:type="dxa" w:w="1191"/>
           </w:tcPr>
           <w:p>
+            <w:pPr>
+              <w:spacing w:before="20" w:after="20"/>
+            </w:pPr>
             <w:r>
               <w:rPr>
                 <w:sz w:val="18"/>
@@ -3795,6 +4551,9 @@
             <w:tcW w:type="dxa" w:w="1191"/>
           </w:tcPr>
           <w:p>
+            <w:pPr>
+              <w:spacing w:before="20" w:after="20"/>
+            </w:pPr>
             <w:r>
               <w:rPr>
                 <w:sz w:val="18"/>
@@ -3810,6 +4569,9 @@
             <w:tcW w:type="dxa" w:w="1304"/>
           </w:tcPr>
           <w:p>
+            <w:pPr>
+              <w:spacing w:before="20" w:after="20"/>
+            </w:pPr>
             <w:r>
               <w:rPr>
                 <w:sz w:val="18"/>
@@ -3823,6 +4585,9 @@
             <w:tcW w:type="dxa" w:w="1077"/>
           </w:tcPr>
           <w:p>
+            <w:pPr>
+              <w:spacing w:before="20" w:after="20"/>
+            </w:pPr>
             <w:r>
               <w:rPr>
                 <w:sz w:val="18"/>
@@ -3836,6 +4601,9 @@
             <w:tcW w:type="dxa" w:w="1304"/>
           </w:tcPr>
           <w:p>
+            <w:pPr>
+              <w:spacing w:before="20" w:after="20"/>
+            </w:pPr>
             <w:r>
               <w:rPr>
                 <w:sz w:val="18"/>
@@ -3849,6 +4617,9 @@
             <w:tcW w:type="dxa" w:w="1191"/>
           </w:tcPr>
           <w:p>
+            <w:pPr>
+              <w:spacing w:before="20" w:after="20"/>
+            </w:pPr>
             <w:r>
               <w:rPr>
                 <w:sz w:val="18"/>
@@ -3862,6 +4633,9 @@
             <w:tcW w:type="dxa" w:w="1191"/>
           </w:tcPr>
           <w:p>
+            <w:pPr>
+              <w:spacing w:before="20" w:after="20"/>
+            </w:pPr>
             <w:r>
               <w:rPr>
                 <w:sz w:val="18"/>
@@ -3875,6 +4649,9 @@
             <w:tcW w:type="dxa" w:w="1304"/>
           </w:tcPr>
           <w:p>
+            <w:pPr>
+              <w:spacing w:before="20" w:after="20"/>
+            </w:pPr>
             <w:r>
               <w:rPr>
                 <w:sz w:val="18"/>
@@ -3888,6 +4665,9 @@
             <w:tcW w:type="dxa" w:w="1191"/>
           </w:tcPr>
           <w:p>
+            <w:pPr>
+              <w:spacing w:before="20" w:after="20"/>
+            </w:pPr>
             <w:r>
               <w:rPr>
                 <w:sz w:val="18"/>
@@ -3901,6 +4681,9 @@
             <w:tcW w:type="dxa" w:w="1191"/>
           </w:tcPr>
           <w:p>
+            <w:pPr>
+              <w:spacing w:before="20" w:after="20"/>
+            </w:pPr>
             <w:r>
               <w:rPr>
                 <w:sz w:val="18"/>
@@ -3916,6 +4699,9 @@
             <w:tcW w:type="dxa" w:w="1304"/>
           </w:tcPr>
           <w:p>
+            <w:pPr>
+              <w:spacing w:before="20" w:after="20"/>
+            </w:pPr>
             <w:r>
               <w:rPr>
                 <w:sz w:val="18"/>
@@ -3929,6 +4715,9 @@
             <w:tcW w:type="dxa" w:w="1077"/>
           </w:tcPr>
           <w:p>
+            <w:pPr>
+              <w:spacing w:before="20" w:after="20"/>
+            </w:pPr>
             <w:r>
               <w:rPr>
                 <w:sz w:val="18"/>
@@ -3942,6 +4731,9 @@
             <w:tcW w:type="dxa" w:w="1304"/>
           </w:tcPr>
           <w:p>
+            <w:pPr>
+              <w:spacing w:before="20" w:after="20"/>
+            </w:pPr>
             <w:r>
               <w:rPr>
                 <w:sz w:val="18"/>
@@ -3955,6 +4747,9 @@
             <w:tcW w:type="dxa" w:w="1191"/>
           </w:tcPr>
           <w:p>
+            <w:pPr>
+              <w:spacing w:before="20" w:after="20"/>
+            </w:pPr>
             <w:r>
               <w:rPr>
                 <w:sz w:val="18"/>
@@ -3968,6 +4763,9 @@
             <w:tcW w:type="dxa" w:w="1191"/>
           </w:tcPr>
           <w:p>
+            <w:pPr>
+              <w:spacing w:before="20" w:after="20"/>
+            </w:pPr>
             <w:r>
               <w:rPr>
                 <w:sz w:val="18"/>
@@ -3981,6 +4779,9 @@
             <w:tcW w:type="dxa" w:w="1304"/>
           </w:tcPr>
           <w:p>
+            <w:pPr>
+              <w:spacing w:before="20" w:after="20"/>
+            </w:pPr>
             <w:r>
               <w:rPr>
                 <w:sz w:val="18"/>
@@ -3994,6 +4795,9 @@
             <w:tcW w:type="dxa" w:w="1191"/>
           </w:tcPr>
           <w:p>
+            <w:pPr>
+              <w:spacing w:before="20" w:after="20"/>
+            </w:pPr>
             <w:r>
               <w:rPr>
                 <w:sz w:val="18"/>
@@ -4007,6 +4811,9 @@
             <w:tcW w:type="dxa" w:w="1191"/>
           </w:tcPr>
           <w:p>
+            <w:pPr>
+              <w:spacing w:before="20" w:after="20"/>
+            </w:pPr>
             <w:r>
               <w:rPr>
                 <w:sz w:val="18"/>
@@ -4022,6 +4829,9 @@
             <w:tcW w:type="dxa" w:w="1304"/>
           </w:tcPr>
           <w:p>
+            <w:pPr>
+              <w:spacing w:before="20" w:after="20"/>
+            </w:pPr>
             <w:r>
               <w:rPr>
                 <w:sz w:val="18"/>
@@ -4035,6 +4845,9 @@
             <w:tcW w:type="dxa" w:w="1077"/>
           </w:tcPr>
           <w:p>
+            <w:pPr>
+              <w:spacing w:before="20" w:after="20"/>
+            </w:pPr>
             <w:r>
               <w:rPr>
                 <w:sz w:val="18"/>
@@ -4048,6 +4861,9 @@
             <w:tcW w:type="dxa" w:w="1304"/>
           </w:tcPr>
           <w:p>
+            <w:pPr>
+              <w:spacing w:before="20" w:after="20"/>
+            </w:pPr>
             <w:r>
               <w:rPr>
                 <w:sz w:val="18"/>
@@ -4061,6 +4877,9 @@
             <w:tcW w:type="dxa" w:w="1191"/>
           </w:tcPr>
           <w:p>
+            <w:pPr>
+              <w:spacing w:before="20" w:after="20"/>
+            </w:pPr>
             <w:r>
               <w:rPr>
                 <w:sz w:val="18"/>
@@ -4074,6 +4893,9 @@
             <w:tcW w:type="dxa" w:w="1191"/>
           </w:tcPr>
           <w:p>
+            <w:pPr>
+              <w:spacing w:before="20" w:after="20"/>
+            </w:pPr>
             <w:r>
               <w:rPr>
                 <w:sz w:val="18"/>
@@ -4087,6 +4909,9 @@
             <w:tcW w:type="dxa" w:w="1304"/>
           </w:tcPr>
           <w:p>
+            <w:pPr>
+              <w:spacing w:before="20" w:after="20"/>
+            </w:pPr>
             <w:r>
               <w:rPr>
                 <w:sz w:val="18"/>
@@ -4100,6 +4925,9 @@
             <w:tcW w:type="dxa" w:w="1191"/>
           </w:tcPr>
           <w:p>
+            <w:pPr>
+              <w:spacing w:before="20" w:after="20"/>
+            </w:pPr>
             <w:r>
               <w:rPr>
                 <w:sz w:val="18"/>
@@ -4113,6 +4941,9 @@
             <w:tcW w:type="dxa" w:w="1191"/>
           </w:tcPr>
           <w:p>
+            <w:pPr>
+              <w:spacing w:before="20" w:after="20"/>
+            </w:pPr>
             <w:r>
               <w:rPr>
                 <w:sz w:val="18"/>
@@ -4128,6 +4959,9 @@
             <w:tcW w:type="dxa" w:w="1304"/>
           </w:tcPr>
           <w:p>
+            <w:pPr>
+              <w:spacing w:before="20" w:after="20"/>
+            </w:pPr>
             <w:r>
               <w:rPr>
                 <w:sz w:val="18"/>
@@ -4141,6 +4975,9 @@
             <w:tcW w:type="dxa" w:w="1077"/>
           </w:tcPr>
           <w:p>
+            <w:pPr>
+              <w:spacing w:before="20" w:after="20"/>
+            </w:pPr>
             <w:r>
               <w:rPr>
                 <w:sz w:val="18"/>
@@ -4154,6 +4991,9 @@
             <w:tcW w:type="dxa" w:w="1304"/>
           </w:tcPr>
           <w:p>
+            <w:pPr>
+              <w:spacing w:before="20" w:after="20"/>
+            </w:pPr>
             <w:r>
               <w:rPr>
                 <w:sz w:val="18"/>
@@ -4167,6 +5007,9 @@
             <w:tcW w:type="dxa" w:w="1191"/>
           </w:tcPr>
           <w:p>
+            <w:pPr>
+              <w:spacing w:before="20" w:after="20"/>
+            </w:pPr>
             <w:r>
               <w:rPr>
                 <w:sz w:val="18"/>
@@ -4180,6 +5023,9 @@
             <w:tcW w:type="dxa" w:w="1191"/>
           </w:tcPr>
           <w:p>
+            <w:pPr>
+              <w:spacing w:before="20" w:after="20"/>
+            </w:pPr>
             <w:r>
               <w:rPr>
                 <w:sz w:val="18"/>
@@ -4193,6 +5039,9 @@
             <w:tcW w:type="dxa" w:w="1304"/>
           </w:tcPr>
           <w:p>
+            <w:pPr>
+              <w:spacing w:before="20" w:after="20"/>
+            </w:pPr>
             <w:r>
               <w:rPr>
                 <w:sz w:val="18"/>
@@ -4206,6 +5055,9 @@
             <w:tcW w:type="dxa" w:w="1191"/>
           </w:tcPr>
           <w:p>
+            <w:pPr>
+              <w:spacing w:before="20" w:after="20"/>
+            </w:pPr>
             <w:r>
               <w:rPr>
                 <w:sz w:val="18"/>
@@ -4219,6 +5071,9 @@
             <w:tcW w:type="dxa" w:w="1191"/>
           </w:tcPr>
           <w:p>
+            <w:pPr>
+              <w:spacing w:before="20" w:after="20"/>
+            </w:pPr>
             <w:r>
               <w:rPr>
                 <w:sz w:val="18"/>
@@ -4234,6 +5089,9 @@
             <w:tcW w:type="dxa" w:w="1304"/>
           </w:tcPr>
           <w:p>
+            <w:pPr>
+              <w:spacing w:before="20" w:after="20"/>
+            </w:pPr>
             <w:r>
               <w:rPr>
                 <w:sz w:val="18"/>
@@ -4247,6 +5105,9 @@
             <w:tcW w:type="dxa" w:w="1077"/>
           </w:tcPr>
           <w:p>
+            <w:pPr>
+              <w:spacing w:before="20" w:after="20"/>
+            </w:pPr>
             <w:r>
               <w:rPr>
                 <w:sz w:val="18"/>
@@ -4260,6 +5121,9 @@
             <w:tcW w:type="dxa" w:w="1304"/>
           </w:tcPr>
           <w:p>
+            <w:pPr>
+              <w:spacing w:before="20" w:after="20"/>
+            </w:pPr>
             <w:r>
               <w:rPr>
                 <w:sz w:val="18"/>
@@ -4273,6 +5137,9 @@
             <w:tcW w:type="dxa" w:w="1191"/>
           </w:tcPr>
           <w:p>
+            <w:pPr>
+              <w:spacing w:before="20" w:after="20"/>
+            </w:pPr>
             <w:r>
               <w:rPr>
                 <w:sz w:val="18"/>
@@ -4286,6 +5153,9 @@
             <w:tcW w:type="dxa" w:w="1191"/>
           </w:tcPr>
           <w:p>
+            <w:pPr>
+              <w:spacing w:before="20" w:after="20"/>
+            </w:pPr>
             <w:r>
               <w:rPr>
                 <w:sz w:val="18"/>
@@ -4299,6 +5169,9 @@
             <w:tcW w:type="dxa" w:w="1304"/>
           </w:tcPr>
           <w:p>
+            <w:pPr>
+              <w:spacing w:before="20" w:after="20"/>
+            </w:pPr>
             <w:r>
               <w:rPr>
                 <w:sz w:val="18"/>
@@ -4312,6 +5185,9 @@
             <w:tcW w:type="dxa" w:w="1191"/>
           </w:tcPr>
           <w:p>
+            <w:pPr>
+              <w:spacing w:before="20" w:after="20"/>
+            </w:pPr>
             <w:r>
               <w:rPr>
                 <w:sz w:val="18"/>
@@ -4325,6 +5201,9 @@
             <w:tcW w:type="dxa" w:w="1191"/>
           </w:tcPr>
           <w:p>
+            <w:pPr>
+              <w:spacing w:before="20" w:after="20"/>
+            </w:pPr>
             <w:r>
               <w:rPr>
                 <w:sz w:val="18"/>
@@ -4340,6 +5219,9 @@
             <w:tcW w:type="dxa" w:w="1304"/>
           </w:tcPr>
           <w:p>
+            <w:pPr>
+              <w:spacing w:before="20" w:after="20"/>
+            </w:pPr>
             <w:r>
               <w:rPr>
                 <w:sz w:val="18"/>
@@ -4353,6 +5235,9 @@
             <w:tcW w:type="dxa" w:w="1077"/>
           </w:tcPr>
           <w:p>
+            <w:pPr>
+              <w:spacing w:before="20" w:after="20"/>
+            </w:pPr>
             <w:r>
               <w:rPr>
                 <w:sz w:val="18"/>
@@ -4366,6 +5251,9 @@
             <w:tcW w:type="dxa" w:w="1304"/>
           </w:tcPr>
           <w:p>
+            <w:pPr>
+              <w:spacing w:before="20" w:after="20"/>
+            </w:pPr>
             <w:r>
               <w:rPr>
                 <w:sz w:val="18"/>
@@ -4379,6 +5267,9 @@
             <w:tcW w:type="dxa" w:w="1191"/>
           </w:tcPr>
           <w:p>
+            <w:pPr>
+              <w:spacing w:before="20" w:after="20"/>
+            </w:pPr>
             <w:r>
               <w:rPr>
                 <w:sz w:val="18"/>
@@ -4392,6 +5283,9 @@
             <w:tcW w:type="dxa" w:w="1191"/>
           </w:tcPr>
           <w:p>
+            <w:pPr>
+              <w:spacing w:before="20" w:after="20"/>
+            </w:pPr>
             <w:r>
               <w:rPr>
                 <w:sz w:val="18"/>
@@ -4405,6 +5299,9 @@
             <w:tcW w:type="dxa" w:w="1304"/>
           </w:tcPr>
           <w:p>
+            <w:pPr>
+              <w:spacing w:before="20" w:after="20"/>
+            </w:pPr>
             <w:r>
               <w:rPr>
                 <w:sz w:val="18"/>
@@ -4418,6 +5315,9 @@
             <w:tcW w:type="dxa" w:w="1191"/>
           </w:tcPr>
           <w:p>
+            <w:pPr>
+              <w:spacing w:before="20" w:after="20"/>
+            </w:pPr>
             <w:r>
               <w:rPr>
                 <w:sz w:val="18"/>
@@ -4431,6 +5331,9 @@
             <w:tcW w:type="dxa" w:w="1191"/>
           </w:tcPr>
           <w:p>
+            <w:pPr>
+              <w:spacing w:before="20" w:after="20"/>
+            </w:pPr>
             <w:r>
               <w:rPr>
                 <w:sz w:val="18"/>
@@ -4446,6 +5349,9 @@
             <w:tcW w:type="dxa" w:w="1304"/>
           </w:tcPr>
           <w:p>
+            <w:pPr>
+              <w:spacing w:before="20" w:after="20"/>
+            </w:pPr>
             <w:r>
               <w:rPr>
                 <w:sz w:val="18"/>
@@ -4459,6 +5365,9 @@
             <w:tcW w:type="dxa" w:w="1077"/>
           </w:tcPr>
           <w:p>
+            <w:pPr>
+              <w:spacing w:before="20" w:after="20"/>
+            </w:pPr>
             <w:r>
               <w:rPr>
                 <w:sz w:val="18"/>
@@ -4472,6 +5381,9 @@
             <w:tcW w:type="dxa" w:w="1304"/>
           </w:tcPr>
           <w:p>
+            <w:pPr>
+              <w:spacing w:before="20" w:after="20"/>
+            </w:pPr>
             <w:r>
               <w:rPr>
                 <w:sz w:val="18"/>
@@ -4485,6 +5397,9 @@
             <w:tcW w:type="dxa" w:w="1191"/>
           </w:tcPr>
           <w:p>
+            <w:pPr>
+              <w:spacing w:before="20" w:after="20"/>
+            </w:pPr>
             <w:r>
               <w:rPr>
                 <w:sz w:val="18"/>
@@ -4498,6 +5413,9 @@
             <w:tcW w:type="dxa" w:w="1191"/>
           </w:tcPr>
           <w:p>
+            <w:pPr>
+              <w:spacing w:before="20" w:after="20"/>
+            </w:pPr>
             <w:r>
               <w:rPr>
                 <w:sz w:val="18"/>
@@ -4511,6 +5429,9 @@
             <w:tcW w:type="dxa" w:w="1304"/>
           </w:tcPr>
           <w:p>
+            <w:pPr>
+              <w:spacing w:before="20" w:after="20"/>
+            </w:pPr>
             <w:r>
               <w:rPr>
                 <w:sz w:val="18"/>
@@ -4524,6 +5445,9 @@
             <w:tcW w:type="dxa" w:w="1191"/>
           </w:tcPr>
           <w:p>
+            <w:pPr>
+              <w:spacing w:before="20" w:after="20"/>
+            </w:pPr>
             <w:r>
               <w:rPr>
                 <w:sz w:val="18"/>
@@ -4537,6 +5461,9 @@
             <w:tcW w:type="dxa" w:w="1191"/>
           </w:tcPr>
           <w:p>
+            <w:pPr>
+              <w:spacing w:before="20" w:after="20"/>
+            </w:pPr>
             <w:r>
               <w:rPr>
                 <w:sz w:val="18"/>
@@ -4552,6 +5479,9 @@
             <w:tcW w:type="dxa" w:w="1304"/>
           </w:tcPr>
           <w:p>
+            <w:pPr>
+              <w:spacing w:before="20" w:after="20"/>
+            </w:pPr>
             <w:r>
               <w:rPr>
                 <w:sz w:val="18"/>
@@ -4565,6 +5495,9 @@
             <w:tcW w:type="dxa" w:w="1077"/>
           </w:tcPr>
           <w:p>
+            <w:pPr>
+              <w:spacing w:before="20" w:after="20"/>
+            </w:pPr>
             <w:r>
               <w:rPr>
                 <w:sz w:val="18"/>
@@ -4578,6 +5511,9 @@
             <w:tcW w:type="dxa" w:w="1304"/>
           </w:tcPr>
           <w:p>
+            <w:pPr>
+              <w:spacing w:before="20" w:after="20"/>
+            </w:pPr>
             <w:r>
               <w:rPr>
                 <w:sz w:val="18"/>
@@ -4591,6 +5527,9 @@
             <w:tcW w:type="dxa" w:w="1191"/>
           </w:tcPr>
           <w:p>
+            <w:pPr>
+              <w:spacing w:before="20" w:after="20"/>
+            </w:pPr>
             <w:r>
               <w:rPr>
                 <w:sz w:val="18"/>
@@ -4604,6 +5543,9 @@
             <w:tcW w:type="dxa" w:w="1191"/>
           </w:tcPr>
           <w:p>
+            <w:pPr>
+              <w:spacing w:before="20" w:after="20"/>
+            </w:pPr>
             <w:r>
               <w:rPr>
                 <w:sz w:val="18"/>
@@ -4617,6 +5559,9 @@
             <w:tcW w:type="dxa" w:w="1304"/>
           </w:tcPr>
           <w:p>
+            <w:pPr>
+              <w:spacing w:before="20" w:after="20"/>
+            </w:pPr>
             <w:r>
               <w:rPr>
                 <w:sz w:val="18"/>
@@ -4630,6 +5575,9 @@
             <w:tcW w:type="dxa" w:w="1191"/>
           </w:tcPr>
           <w:p>
+            <w:pPr>
+              <w:spacing w:before="20" w:after="20"/>
+            </w:pPr>
             <w:r>
               <w:rPr>
                 <w:sz w:val="18"/>
@@ -4643,6 +5591,9 @@
             <w:tcW w:type="dxa" w:w="1191"/>
           </w:tcPr>
           <w:p>
+            <w:pPr>
+              <w:spacing w:before="20" w:after="20"/>
+            </w:pPr>
             <w:r>
               <w:rPr>
                 <w:sz w:val="18"/>
@@ -4655,6 +5606,11 @@
     </w:tbl>
     <w:p>
       <w:pPr>
+        <w:spacing w:before="0" w:after="0" w:lineRule="exact" w:line="140"/>
+      </w:pPr>
+    </w:p>
+    <w:p>
+      <w:pPr>
         <w:pStyle w:val="MDPI22heading2"/>
       </w:pPr>
       <w:r>
@@ -4672,6 +5628,8 @@
     <w:p>
       <w:pPr>
         <w:pStyle w:val="MDPI41tablecaption"/>
+        <w:keepNext/>
+        <w:spacing w:before="240" w:after="120"/>
       </w:pPr>
       <w:r>
         <w:t>Table 6. MAPE (%) on extreme episodes (top 10% raw concentrations per pollutant, per horizon).</w:t>
@@ -4707,6 +5665,9 @@
             <w:shd w:fill="EDF2F7"/>
           </w:tcPr>
           <w:p>
+            <w:pPr>
+              <w:spacing w:before="20" w:after="20"/>
+            </w:pPr>
             <w:r>
               <w:rPr>
                 <w:b/>
@@ -4722,6 +5683,9 @@
             <w:shd w:fill="EDF2F7"/>
           </w:tcPr>
           <w:p>
+            <w:pPr>
+              <w:spacing w:before="20" w:after="20"/>
+            </w:pPr>
             <w:r>
               <w:rPr>
                 <w:b/>
@@ -4737,6 +5701,9 @@
             <w:shd w:fill="EDF2F7"/>
           </w:tcPr>
           <w:p>
+            <w:pPr>
+              <w:spacing w:before="20" w:after="20"/>
+            </w:pPr>
             <w:r>
               <w:rPr>
                 <w:b/>
@@ -4752,6 +5719,9 @@
             <w:shd w:fill="EDF2F7"/>
           </w:tcPr>
           <w:p>
+            <w:pPr>
+              <w:spacing w:before="20" w:after="20"/>
+            </w:pPr>
             <w:r>
               <w:rPr>
                 <w:b/>
@@ -4767,6 +5737,9 @@
             <w:shd w:fill="EDF2F7"/>
           </w:tcPr>
           <w:p>
+            <w:pPr>
+              <w:spacing w:before="20" w:after="20"/>
+            </w:pPr>
             <w:r>
               <w:rPr>
                 <w:b/>
@@ -4782,6 +5755,9 @@
             <w:shd w:fill="EDF2F7"/>
           </w:tcPr>
           <w:p>
+            <w:pPr>
+              <w:spacing w:before="20" w:after="20"/>
+            </w:pPr>
             <w:r>
               <w:rPr>
                 <w:b/>
@@ -4797,6 +5773,9 @@
             <w:shd w:fill="EDF2F7"/>
           </w:tcPr>
           <w:p>
+            <w:pPr>
+              <w:spacing w:before="20" w:after="20"/>
+            </w:pPr>
             <w:r>
               <w:rPr>
                 <w:b/>
@@ -4813,6 +5792,9 @@
             <w:tcW w:type="dxa" w:w="1361"/>
           </w:tcPr>
           <w:p>
+            <w:pPr>
+              <w:spacing w:before="20" w:after="20"/>
+            </w:pPr>
             <w:r>
               <w:rPr>
                 <w:sz w:val="18"/>
@@ -4826,6 +5808,9 @@
             <w:tcW w:type="dxa" w:w="1077"/>
           </w:tcPr>
           <w:p>
+            <w:pPr>
+              <w:spacing w:before="20" w:after="20"/>
+            </w:pPr>
             <w:r>
               <w:rPr>
                 <w:sz w:val="18"/>
@@ -4839,6 +5824,9 @@
             <w:tcW w:type="dxa" w:w="1247"/>
           </w:tcPr>
           <w:p>
+            <w:pPr>
+              <w:spacing w:before="20" w:after="20"/>
+            </w:pPr>
             <w:r>
               <w:rPr>
                 <w:sz w:val="18"/>
@@ -4852,6 +5840,9 @@
             <w:tcW w:type="dxa" w:w="1247"/>
           </w:tcPr>
           <w:p>
+            <w:pPr>
+              <w:spacing w:before="20" w:after="20"/>
+            </w:pPr>
             <w:r>
               <w:rPr>
                 <w:sz w:val="18"/>
@@ -4865,6 +5856,9 @@
             <w:tcW w:type="dxa" w:w="1247"/>
           </w:tcPr>
           <w:p>
+            <w:pPr>
+              <w:spacing w:before="20" w:after="20"/>
+            </w:pPr>
             <w:r>
               <w:rPr>
                 <w:sz w:val="18"/>
@@ -4878,6 +5872,9 @@
             <w:tcW w:type="dxa" w:w="1247"/>
           </w:tcPr>
           <w:p>
+            <w:pPr>
+              <w:spacing w:before="20" w:after="20"/>
+            </w:pPr>
             <w:r>
               <w:rPr>
                 <w:sz w:val="18"/>
@@ -4891,6 +5888,9 @@
             <w:tcW w:type="dxa" w:w="1247"/>
           </w:tcPr>
           <w:p>
+            <w:pPr>
+              <w:spacing w:before="20" w:after="20"/>
+            </w:pPr>
             <w:r>
               <w:rPr>
                 <w:sz w:val="18"/>
@@ -4906,6 +5906,9 @@
             <w:tcW w:type="dxa" w:w="1361"/>
           </w:tcPr>
           <w:p>
+            <w:pPr>
+              <w:spacing w:before="20" w:after="20"/>
+            </w:pPr>
             <w:r>
               <w:rPr>
                 <w:sz w:val="18"/>
@@ -4919,6 +5922,9 @@
             <w:tcW w:type="dxa" w:w="1077"/>
           </w:tcPr>
           <w:p>
+            <w:pPr>
+              <w:spacing w:before="20" w:after="20"/>
+            </w:pPr>
             <w:r>
               <w:rPr>
                 <w:sz w:val="18"/>
@@ -4932,6 +5938,9 @@
             <w:tcW w:type="dxa" w:w="1247"/>
           </w:tcPr>
           <w:p>
+            <w:pPr>
+              <w:spacing w:before="20" w:after="20"/>
+            </w:pPr>
             <w:r>
               <w:rPr>
                 <w:sz w:val="18"/>
@@ -4945,6 +5954,9 @@
             <w:tcW w:type="dxa" w:w="1247"/>
           </w:tcPr>
           <w:p>
+            <w:pPr>
+              <w:spacing w:before="20" w:after="20"/>
+            </w:pPr>
             <w:r>
               <w:rPr>
                 <w:sz w:val="18"/>
@@ -4958,6 +5970,9 @@
             <w:tcW w:type="dxa" w:w="1247"/>
           </w:tcPr>
           <w:p>
+            <w:pPr>
+              <w:spacing w:before="20" w:after="20"/>
+            </w:pPr>
             <w:r>
               <w:rPr>
                 <w:sz w:val="18"/>
@@ -4971,6 +5986,9 @@
             <w:tcW w:type="dxa" w:w="1247"/>
           </w:tcPr>
           <w:p>
+            <w:pPr>
+              <w:spacing w:before="20" w:after="20"/>
+            </w:pPr>
             <w:r>
               <w:rPr>
                 <w:sz w:val="18"/>
@@ -4984,6 +6002,9 @@
             <w:tcW w:type="dxa" w:w="1247"/>
           </w:tcPr>
           <w:p>
+            <w:pPr>
+              <w:spacing w:before="20" w:after="20"/>
+            </w:pPr>
             <w:r>
               <w:rPr>
                 <w:sz w:val="18"/>
@@ -4999,6 +6020,9 @@
             <w:tcW w:type="dxa" w:w="1361"/>
           </w:tcPr>
           <w:p>
+            <w:pPr>
+              <w:spacing w:before="20" w:after="20"/>
+            </w:pPr>
             <w:r>
               <w:rPr>
                 <w:sz w:val="18"/>
@@ -5012,6 +6036,9 @@
             <w:tcW w:type="dxa" w:w="1077"/>
           </w:tcPr>
           <w:p>
+            <w:pPr>
+              <w:spacing w:before="20" w:after="20"/>
+            </w:pPr>
             <w:r>
               <w:rPr>
                 <w:sz w:val="18"/>
@@ -5025,6 +6052,9 @@
             <w:tcW w:type="dxa" w:w="1247"/>
           </w:tcPr>
           <w:p>
+            <w:pPr>
+              <w:spacing w:before="20" w:after="20"/>
+            </w:pPr>
             <w:r>
               <w:rPr>
                 <w:sz w:val="18"/>
@@ -5038,6 +6068,9 @@
             <w:tcW w:type="dxa" w:w="1247"/>
           </w:tcPr>
           <w:p>
+            <w:pPr>
+              <w:spacing w:before="20" w:after="20"/>
+            </w:pPr>
             <w:r>
               <w:rPr>
                 <w:sz w:val="18"/>
@@ -5051,6 +6084,9 @@
             <w:tcW w:type="dxa" w:w="1247"/>
           </w:tcPr>
           <w:p>
+            <w:pPr>
+              <w:spacing w:before="20" w:after="20"/>
+            </w:pPr>
             <w:r>
               <w:rPr>
                 <w:sz w:val="18"/>
@@ -5064,6 +6100,9 @@
             <w:tcW w:type="dxa" w:w="1247"/>
           </w:tcPr>
           <w:p>
+            <w:pPr>
+              <w:spacing w:before="20" w:after="20"/>
+            </w:pPr>
             <w:r>
               <w:rPr>
                 <w:sz w:val="18"/>
@@ -5077,6 +6116,9 @@
             <w:tcW w:type="dxa" w:w="1247"/>
           </w:tcPr>
           <w:p>
+            <w:pPr>
+              <w:spacing w:before="20" w:after="20"/>
+            </w:pPr>
             <w:r>
               <w:rPr>
                 <w:sz w:val="18"/>
@@ -5092,6 +6134,9 @@
             <w:tcW w:type="dxa" w:w="1361"/>
           </w:tcPr>
           <w:p>
+            <w:pPr>
+              <w:spacing w:before="20" w:after="20"/>
+            </w:pPr>
             <w:r>
               <w:rPr>
                 <w:sz w:val="18"/>
@@ -5105,6 +6150,9 @@
             <w:tcW w:type="dxa" w:w="1077"/>
           </w:tcPr>
           <w:p>
+            <w:pPr>
+              <w:spacing w:before="20" w:after="20"/>
+            </w:pPr>
             <w:r>
               <w:rPr>
                 <w:sz w:val="18"/>
@@ -5118,6 +6166,9 @@
             <w:tcW w:type="dxa" w:w="1247"/>
           </w:tcPr>
           <w:p>
+            <w:pPr>
+              <w:spacing w:before="20" w:after="20"/>
+            </w:pPr>
             <w:r>
               <w:rPr>
                 <w:sz w:val="18"/>
@@ -5131,6 +6182,9 @@
             <w:tcW w:type="dxa" w:w="1247"/>
           </w:tcPr>
           <w:p>
+            <w:pPr>
+              <w:spacing w:before="20" w:after="20"/>
+            </w:pPr>
             <w:r>
               <w:rPr>
                 <w:sz w:val="18"/>
@@ -5144,6 +6198,9 @@
             <w:tcW w:type="dxa" w:w="1247"/>
           </w:tcPr>
           <w:p>
+            <w:pPr>
+              <w:spacing w:before="20" w:after="20"/>
+            </w:pPr>
             <w:r>
               <w:rPr>
                 <w:sz w:val="18"/>
@@ -5157,6 +6214,9 @@
             <w:tcW w:type="dxa" w:w="1247"/>
           </w:tcPr>
           <w:p>
+            <w:pPr>
+              <w:spacing w:before="20" w:after="20"/>
+            </w:pPr>
             <w:r>
               <w:rPr>
                 <w:sz w:val="18"/>
@@ -5170,6 +6230,9 @@
             <w:tcW w:type="dxa" w:w="1247"/>
           </w:tcPr>
           <w:p>
+            <w:pPr>
+              <w:spacing w:before="20" w:after="20"/>
+            </w:pPr>
             <w:r>
               <w:rPr>
                 <w:sz w:val="18"/>
@@ -5185,6 +6248,9 @@
             <w:tcW w:type="dxa" w:w="1361"/>
           </w:tcPr>
           <w:p>
+            <w:pPr>
+              <w:spacing w:before="20" w:after="20"/>
+            </w:pPr>
             <w:r>
               <w:rPr>
                 <w:sz w:val="18"/>
@@ -5198,6 +6264,9 @@
             <w:tcW w:type="dxa" w:w="1077"/>
           </w:tcPr>
           <w:p>
+            <w:pPr>
+              <w:spacing w:before="20" w:after="20"/>
+            </w:pPr>
             <w:r>
               <w:rPr>
                 <w:sz w:val="18"/>
@@ -5211,6 +6280,9 @@
             <w:tcW w:type="dxa" w:w="1247"/>
           </w:tcPr>
           <w:p>
+            <w:pPr>
+              <w:spacing w:before="20" w:after="20"/>
+            </w:pPr>
             <w:r>
               <w:rPr>
                 <w:sz w:val="18"/>
@@ -5224,6 +6296,9 @@
             <w:tcW w:type="dxa" w:w="1247"/>
           </w:tcPr>
           <w:p>
+            <w:pPr>
+              <w:spacing w:before="20" w:after="20"/>
+            </w:pPr>
             <w:r>
               <w:rPr>
                 <w:sz w:val="18"/>
@@ -5237,6 +6312,9 @@
             <w:tcW w:type="dxa" w:w="1247"/>
           </w:tcPr>
           <w:p>
+            <w:pPr>
+              <w:spacing w:before="20" w:after="20"/>
+            </w:pPr>
             <w:r>
               <w:rPr>
                 <w:sz w:val="18"/>
@@ -5250,6 +6328,9 @@
             <w:tcW w:type="dxa" w:w="1247"/>
           </w:tcPr>
           <w:p>
+            <w:pPr>
+              <w:spacing w:before="20" w:after="20"/>
+            </w:pPr>
             <w:r>
               <w:rPr>
                 <w:sz w:val="18"/>
@@ -5263,6 +6344,9 @@
             <w:tcW w:type="dxa" w:w="1247"/>
           </w:tcPr>
           <w:p>
+            <w:pPr>
+              <w:spacing w:before="20" w:after="20"/>
+            </w:pPr>
             <w:r>
               <w:rPr>
                 <w:sz w:val="18"/>
@@ -5278,6 +6362,9 @@
             <w:tcW w:type="dxa" w:w="1361"/>
           </w:tcPr>
           <w:p>
+            <w:pPr>
+              <w:spacing w:before="20" w:after="20"/>
+            </w:pPr>
             <w:r>
               <w:rPr>
                 <w:sz w:val="18"/>
@@ -5291,6 +6378,9 @@
             <w:tcW w:type="dxa" w:w="1077"/>
           </w:tcPr>
           <w:p>
+            <w:pPr>
+              <w:spacing w:before="20" w:after="20"/>
+            </w:pPr>
             <w:r>
               <w:rPr>
                 <w:sz w:val="18"/>
@@ -5304,6 +6394,9 @@
             <w:tcW w:type="dxa" w:w="1247"/>
           </w:tcPr>
           <w:p>
+            <w:pPr>
+              <w:spacing w:before="20" w:after="20"/>
+            </w:pPr>
             <w:r>
               <w:rPr>
                 <w:sz w:val="18"/>
@@ -5317,6 +6410,9 @@
             <w:tcW w:type="dxa" w:w="1247"/>
           </w:tcPr>
           <w:p>
+            <w:pPr>
+              <w:spacing w:before="20" w:after="20"/>
+            </w:pPr>
             <w:r>
               <w:rPr>
                 <w:sz w:val="18"/>
@@ -5330,6 +6426,9 @@
             <w:tcW w:type="dxa" w:w="1247"/>
           </w:tcPr>
           <w:p>
+            <w:pPr>
+              <w:spacing w:before="20" w:after="20"/>
+            </w:pPr>
             <w:r>
               <w:rPr>
                 <w:sz w:val="18"/>
@@ -5343,6 +6442,9 @@
             <w:tcW w:type="dxa" w:w="1247"/>
           </w:tcPr>
           <w:p>
+            <w:pPr>
+              <w:spacing w:before="20" w:after="20"/>
+            </w:pPr>
             <w:r>
               <w:rPr>
                 <w:sz w:val="18"/>
@@ -5356,6 +6458,9 @@
             <w:tcW w:type="dxa" w:w="1247"/>
           </w:tcPr>
           <w:p>
+            <w:pPr>
+              <w:spacing w:before="20" w:after="20"/>
+            </w:pPr>
             <w:r>
               <w:rPr>
                 <w:sz w:val="18"/>
@@ -5371,6 +6476,9 @@
             <w:tcW w:type="dxa" w:w="1361"/>
           </w:tcPr>
           <w:p>
+            <w:pPr>
+              <w:spacing w:before="20" w:after="20"/>
+            </w:pPr>
             <w:r>
               <w:rPr>
                 <w:sz w:val="18"/>
@@ -5384,6 +6492,9 @@
             <w:tcW w:type="dxa" w:w="1077"/>
           </w:tcPr>
           <w:p>
+            <w:pPr>
+              <w:spacing w:before="20" w:after="20"/>
+            </w:pPr>
             <w:r>
               <w:rPr>
                 <w:sz w:val="18"/>
@@ -5397,6 +6508,9 @@
             <w:tcW w:type="dxa" w:w="1247"/>
           </w:tcPr>
           <w:p>
+            <w:pPr>
+              <w:spacing w:before="20" w:after="20"/>
+            </w:pPr>
             <w:r>
               <w:rPr>
                 <w:sz w:val="18"/>
@@ -5410,6 +6524,9 @@
             <w:tcW w:type="dxa" w:w="1247"/>
           </w:tcPr>
           <w:p>
+            <w:pPr>
+              <w:spacing w:before="20" w:after="20"/>
+            </w:pPr>
             <w:r>
               <w:rPr>
                 <w:sz w:val="18"/>
@@ -5423,6 +6540,9 @@
             <w:tcW w:type="dxa" w:w="1247"/>
           </w:tcPr>
           <w:p>
+            <w:pPr>
+              <w:spacing w:before="20" w:after="20"/>
+            </w:pPr>
             <w:r>
               <w:rPr>
                 <w:sz w:val="18"/>
@@ -5436,6 +6556,9 @@
             <w:tcW w:type="dxa" w:w="1247"/>
           </w:tcPr>
           <w:p>
+            <w:pPr>
+              <w:spacing w:before="20" w:after="20"/>
+            </w:pPr>
             <w:r>
               <w:rPr>
                 <w:sz w:val="18"/>
@@ -5449,6 +6572,9 @@
             <w:tcW w:type="dxa" w:w="1247"/>
           </w:tcPr>
           <w:p>
+            <w:pPr>
+              <w:spacing w:before="20" w:after="20"/>
+            </w:pPr>
             <w:r>
               <w:rPr>
                 <w:sz w:val="18"/>
@@ -5464,6 +6590,9 @@
             <w:tcW w:type="dxa" w:w="1361"/>
           </w:tcPr>
           <w:p>
+            <w:pPr>
+              <w:spacing w:before="20" w:after="20"/>
+            </w:pPr>
             <w:r>
               <w:rPr>
                 <w:sz w:val="18"/>
@@ -5477,6 +6606,9 @@
             <w:tcW w:type="dxa" w:w="1077"/>
           </w:tcPr>
           <w:p>
+            <w:pPr>
+              <w:spacing w:before="20" w:after="20"/>
+            </w:pPr>
             <w:r>
               <w:rPr>
                 <w:sz w:val="18"/>
@@ -5490,6 +6622,9 @@
             <w:tcW w:type="dxa" w:w="1247"/>
           </w:tcPr>
           <w:p>
+            <w:pPr>
+              <w:spacing w:before="20" w:after="20"/>
+            </w:pPr>
             <w:r>
               <w:rPr>
                 <w:sz w:val="18"/>
@@ -5503,6 +6638,9 @@
             <w:tcW w:type="dxa" w:w="1247"/>
           </w:tcPr>
           <w:p>
+            <w:pPr>
+              <w:spacing w:before="20" w:after="20"/>
+            </w:pPr>
             <w:r>
               <w:rPr>
                 <w:sz w:val="18"/>
@@ -5516,6 +6654,9 @@
             <w:tcW w:type="dxa" w:w="1247"/>
           </w:tcPr>
           <w:p>
+            <w:pPr>
+              <w:spacing w:before="20" w:after="20"/>
+            </w:pPr>
             <w:r>
               <w:rPr>
                 <w:sz w:val="18"/>
@@ -5529,6 +6670,9 @@
             <w:tcW w:type="dxa" w:w="1247"/>
           </w:tcPr>
           <w:p>
+            <w:pPr>
+              <w:spacing w:before="20" w:after="20"/>
+            </w:pPr>
             <w:r>
               <w:rPr>
                 <w:sz w:val="18"/>
@@ -5542,6 +6686,9 @@
             <w:tcW w:type="dxa" w:w="1247"/>
           </w:tcPr>
           <w:p>
+            <w:pPr>
+              <w:spacing w:before="20" w:after="20"/>
+            </w:pPr>
             <w:r>
               <w:rPr>
                 <w:sz w:val="18"/>
@@ -5557,6 +6704,9 @@
             <w:tcW w:type="dxa" w:w="1361"/>
           </w:tcPr>
           <w:p>
+            <w:pPr>
+              <w:spacing w:before="20" w:after="20"/>
+            </w:pPr>
             <w:r>
               <w:rPr>
                 <w:sz w:val="18"/>
@@ -5570,6 +6720,9 @@
             <w:tcW w:type="dxa" w:w="1077"/>
           </w:tcPr>
           <w:p>
+            <w:pPr>
+              <w:spacing w:before="20" w:after="20"/>
+            </w:pPr>
             <w:r>
               <w:rPr>
                 <w:sz w:val="18"/>
@@ -5583,6 +6736,9 @@
             <w:tcW w:type="dxa" w:w="1247"/>
           </w:tcPr>
           <w:p>
+            <w:pPr>
+              <w:spacing w:before="20" w:after="20"/>
+            </w:pPr>
             <w:r>
               <w:rPr>
                 <w:sz w:val="18"/>
@@ -5596,6 +6752,9 @@
             <w:tcW w:type="dxa" w:w="1247"/>
           </w:tcPr>
           <w:p>
+            <w:pPr>
+              <w:spacing w:before="20" w:after="20"/>
+            </w:pPr>
             <w:r>
               <w:rPr>
                 <w:sz w:val="18"/>
@@ -5609,6 +6768,9 @@
             <w:tcW w:type="dxa" w:w="1247"/>
           </w:tcPr>
           <w:p>
+            <w:pPr>
+              <w:spacing w:before="20" w:after="20"/>
+            </w:pPr>
             <w:r>
               <w:rPr>
                 <w:sz w:val="18"/>
@@ -5622,6 +6784,9 @@
             <w:tcW w:type="dxa" w:w="1247"/>
           </w:tcPr>
           <w:p>
+            <w:pPr>
+              <w:spacing w:before="20" w:after="20"/>
+            </w:pPr>
             <w:r>
               <w:rPr>
                 <w:sz w:val="18"/>
@@ -5635,6 +6800,9 @@
             <w:tcW w:type="dxa" w:w="1247"/>
           </w:tcPr>
           <w:p>
+            <w:pPr>
+              <w:spacing w:before="20" w:after="20"/>
+            </w:pPr>
             <w:r>
               <w:rPr>
                 <w:sz w:val="18"/>
@@ -5647,6 +6815,11 @@
     </w:tbl>
     <w:p>
       <w:pPr>
+        <w:spacing w:before="0" w:after="0" w:lineRule="exact" w:line="140"/>
+      </w:pPr>
+    </w:p>
+    <w:p>
+      <w:pPr>
         <w:pStyle w:val="MDPI22heading2"/>
       </w:pPr>
       <w:r>
@@ -5752,6 +6925,8 @@
     <w:p>
       <w:pPr>
         <w:pStyle w:val="MDPI52figure"/>
+        <w:keepNext/>
+        <w:spacing w:before="200" w:after="80"/>
         <w:jc w:val="center"/>
       </w:pPr>
       <w:r>
@@ -5792,6 +6967,7 @@
     <w:p>
       <w:pPr>
         <w:pStyle w:val="MDPI51figurecaption"/>
+        <w:spacing w:after="240"/>
       </w:pPr>
       <w:r>
         <w:t>Figure A1. PM10 predictions: Actual vs. Deep Hybrid Baseline vs. Proposed Ensemble (h=1, Box-Cox scale).</w:t>
@@ -5799,7 +6975,14 @@
     </w:p>
     <w:p>
       <w:pPr>
+        <w:spacing w:before="0" w:after="0" w:lineRule="exact" w:line="100"/>
+      </w:pPr>
+    </w:p>
+    <w:p>
+      <w:pPr>
         <w:pStyle w:val="MDPI52figure"/>
+        <w:keepNext/>
+        <w:spacing w:before="200" w:after="80"/>
         <w:jc w:val="center"/>
       </w:pPr>
       <w:r>
@@ -5840,6 +7023,7 @@
     <w:p>
       <w:pPr>
         <w:pStyle w:val="MDPI51figurecaption"/>
+        <w:spacing w:after="240"/>
       </w:pPr>
       <w:r>
         <w:t>Figure A2. PM10 predictions: Actual vs. Deep Hybrid Baseline vs. Proposed Ensemble (h=7, Box-Cox scale).</w:t>
@@ -5847,7 +7031,14 @@
     </w:p>
     <w:p>
       <w:pPr>
+        <w:spacing w:before="0" w:after="0" w:lineRule="exact" w:line="100"/>
+      </w:pPr>
+    </w:p>
+    <w:p>
+      <w:pPr>
         <w:pStyle w:val="MDPI52figure"/>
+        <w:keepNext/>
+        <w:spacing w:before="200" w:after="80"/>
         <w:jc w:val="center"/>
       </w:pPr>
       <w:r>
@@ -5888,6 +7079,7 @@
     <w:p>
       <w:pPr>
         <w:pStyle w:val="MDPI51figurecaption"/>
+        <w:spacing w:after="240"/>
       </w:pPr>
       <w:r>
         <w:t>Figure A3. PM10 predictions: Actual vs. Deep Hybrid Baseline vs. Proposed Ensemble (h=30, Box-Cox scale).</w:t>
@@ -5895,7 +7087,14 @@
     </w:p>
     <w:p>
       <w:pPr>
+        <w:spacing w:before="0" w:after="0" w:lineRule="exact" w:line="100"/>
+      </w:pPr>
+    </w:p>
+    <w:p>
+      <w:pPr>
         <w:pStyle w:val="MDPI52figure"/>
+        <w:keepNext/>
+        <w:spacing w:before="200" w:after="80"/>
         <w:jc w:val="center"/>
       </w:pPr>
       <w:r>
@@ -5936,6 +7135,7 @@
     <w:p>
       <w:pPr>
         <w:pStyle w:val="MDPI51figurecaption"/>
+        <w:spacing w:after="240"/>
       </w:pPr>
       <w:r>
         <w:t>Figure A4. PM25 predictions: Actual vs. Deep Hybrid Baseline vs. Proposed Ensemble (h=1, Box-Cox scale).</w:t>
@@ -5943,7 +7143,14 @@
     </w:p>
     <w:p>
       <w:pPr>
+        <w:spacing w:before="0" w:after="0" w:lineRule="exact" w:line="100"/>
+      </w:pPr>
+    </w:p>
+    <w:p>
+      <w:pPr>
         <w:pStyle w:val="MDPI52figure"/>
+        <w:keepNext/>
+        <w:spacing w:before="200" w:after="80"/>
         <w:jc w:val="center"/>
       </w:pPr>
       <w:r>
@@ -5984,6 +7191,7 @@
     <w:p>
       <w:pPr>
         <w:pStyle w:val="MDPI51figurecaption"/>
+        <w:spacing w:after="240"/>
       </w:pPr>
       <w:r>
         <w:t>Figure A5. PM25 predictions: Actual vs. Deep Hybrid Baseline vs. Proposed Ensemble (h=7, Box-Cox scale).</w:t>
@@ -5991,7 +7199,14 @@
     </w:p>
     <w:p>
       <w:pPr>
+        <w:spacing w:before="0" w:after="0" w:lineRule="exact" w:line="100"/>
+      </w:pPr>
+    </w:p>
+    <w:p>
+      <w:pPr>
         <w:pStyle w:val="MDPI52figure"/>
+        <w:keepNext/>
+        <w:spacing w:before="200" w:after="80"/>
         <w:jc w:val="center"/>
       </w:pPr>
       <w:r>
@@ -6032,6 +7247,7 @@
     <w:p>
       <w:pPr>
         <w:pStyle w:val="MDPI51figurecaption"/>
+        <w:spacing w:after="240"/>
       </w:pPr>
       <w:r>
         <w:t>Figure A6. PM25 predictions: Actual vs. Deep Hybrid Baseline vs. Proposed Ensemble (h=30, Box-Cox scale).</w:t>
@@ -6039,7 +7255,14 @@
     </w:p>
     <w:p>
       <w:pPr>
+        <w:spacing w:before="0" w:after="0" w:lineRule="exact" w:line="100"/>
+      </w:pPr>
+    </w:p>
+    <w:p>
+      <w:pPr>
         <w:pStyle w:val="MDPI52figure"/>
+        <w:keepNext/>
+        <w:spacing w:before="200" w:after="80"/>
         <w:jc w:val="center"/>
       </w:pPr>
       <w:r>
@@ -6080,6 +7303,7 @@
     <w:p>
       <w:pPr>
         <w:pStyle w:val="MDPI51figurecaption"/>
+        <w:spacing w:after="240"/>
       </w:pPr>
       <w:r>
         <w:t>Figure A7. NO2 predictions: Actual vs. Deep Hybrid Baseline vs. Proposed Ensemble (h=1, Box-Cox scale).</w:t>
@@ -6087,7 +7311,14 @@
     </w:p>
     <w:p>
       <w:pPr>
+        <w:spacing w:before="0" w:after="0" w:lineRule="exact" w:line="100"/>
+      </w:pPr>
+    </w:p>
+    <w:p>
+      <w:pPr>
         <w:pStyle w:val="MDPI52figure"/>
+        <w:keepNext/>
+        <w:spacing w:before="200" w:after="80"/>
         <w:jc w:val="center"/>
       </w:pPr>
       <w:r>
@@ -6128,6 +7359,7 @@
     <w:p>
       <w:pPr>
         <w:pStyle w:val="MDPI51figurecaption"/>
+        <w:spacing w:after="240"/>
       </w:pPr>
       <w:r>
         <w:t>Figure A8. NO2 predictions: Actual vs. Deep Hybrid Baseline vs. Proposed Ensemble (h=7, Box-Cox scale).</w:t>
@@ -6135,7 +7367,14 @@
     </w:p>
     <w:p>
       <w:pPr>
+        <w:spacing w:before="0" w:after="0" w:lineRule="exact" w:line="100"/>
+      </w:pPr>
+    </w:p>
+    <w:p>
+      <w:pPr>
         <w:pStyle w:val="MDPI52figure"/>
+        <w:keepNext/>
+        <w:spacing w:before="200" w:after="80"/>
         <w:jc w:val="center"/>
       </w:pPr>
       <w:r>
@@ -6176,10 +7415,16 @@
     <w:p>
       <w:pPr>
         <w:pStyle w:val="MDPI51figurecaption"/>
+        <w:spacing w:after="240"/>
       </w:pPr>
       <w:r>
         <w:t>Figure A9. NO2 predictions: Actual vs. Deep Hybrid Baseline vs. Proposed Ensemble (h=30, Box-Cox scale).</w:t>
       </w:r>
+    </w:p>
+    <w:p>
+      <w:pPr>
+        <w:spacing w:before="0" w:after="0" w:lineRule="exact" w:line="100"/>
+      </w:pPr>
     </w:p>
     <w:p>
       <w:pPr>
@@ -6382,7 +7627,6 @@
       <w:type w:val="continuous"/>
       <w:pgSz w:w="11906" w:h="16838" w:code="9"/>
       <w:pgMar w:top="1417" w:right="720" w:bottom="907" w:left="720" w:header="720" w:footer="612" w:gutter="0"/>
-      <w:lnNumType w:countBy="1" w:distance="255" w:restart="continuous"/>
       <w:pgNumType w:start="1"/>
       <w:cols w:space="425"/>
       <w:titlePg/>

</xml_diff>

<commit_message>
style(AnC): tabel full-width (tblW 10466 + fixed layout) + email kampus nusamandiri
</commit_message>
<xml_diff>
--- a/04_Naskah/Naskah_Paper_Anc_Ensemble_LGBM_Theta.docx
+++ b/04_Naskah/Naskah_Paper_Anc_Ensemble_LGBM_Theta.docx
@@ -45,7 +45,7 @@
         </w:rPr>
         <w:t>1</w:t>
         <w:tab/>
-        <w:t>Master of Informatics Engineering, Universitas Nusa Mandiri; madajabbar22@gmail.com</w:t>
+        <w:t>Master of Informatics Engineering, Universitas Nusa Mandiri; 14260009@nusamandiri.ac.id</w:t>
       </w:r>
     </w:p>
     <w:p>
@@ -55,7 +55,7 @@
       <w:r>
         <w:t>*</w:t>
         <w:tab/>
-        <w:t>Correspondence: madajabbar22@gmail.com</w:t>
+        <w:t>Correspondence: 14260009@nusamandiri.ac.id</w:t>
       </w:r>
     </w:p>
     <w:p>
@@ -216,7 +216,11 @@
     <w:tbl>
       <w:tblPr>
         <w:tblStyle w:val="MDPItable"/>
+        <w:tblW w:w="10466" w:type="dxa"/>
+        <w:jc w:val="left"/>
+        <w:tblInd w:w="0" w:type="dxa"/>
         <w:tblW w:type="auto" w:w="0"/>
+        <w:tblLayout w:type="fixed"/>
         <w:tblLook w:firstColumn="1" w:firstRow="1" w:lastColumn="0" w:lastRow="0" w:noHBand="0" w:noVBand="1" w:val="04A0"/>
         <w:tblBorders>
           <w:top w:val="single" w:sz="4" w:color="9AA5B1"/>
@@ -235,7 +239,7 @@
       <w:tr>
         <w:tc>
           <w:tcPr>
-            <w:tcW w:type="dxa" w:w="2268"/>
+            <w:tcW w:type="dxa" w:w="3805"/>
             <w:shd w:fill="EDF2F7"/>
           </w:tcPr>
           <w:p>
@@ -253,7 +257,7 @@
         </w:tc>
         <w:tc>
           <w:tcPr>
-            <w:tcW w:type="dxa" w:w="2268"/>
+            <w:tcW w:type="dxa" w:w="3805"/>
             <w:shd w:fill="EDF2F7"/>
           </w:tcPr>
           <w:p>
@@ -271,7 +275,7 @@
         </w:tc>
         <w:tc>
           <w:tcPr>
-            <w:tcW w:type="dxa" w:w="1701"/>
+            <w:tcW w:type="dxa" w:w="2854"/>
             <w:shd w:fill="EDF2F7"/>
           </w:tcPr>
           <w:p>
@@ -291,7 +295,7 @@
       <w:tr>
         <w:tc>
           <w:tcPr>
-            <w:tcW w:type="dxa" w:w="2268"/>
+            <w:tcW w:type="dxa" w:w="3805"/>
           </w:tcPr>
           <w:p>
             <w:pPr>
@@ -307,7 +311,7 @@
         </w:tc>
         <w:tc>
           <w:tcPr>
-            <w:tcW w:type="dxa" w:w="2268"/>
+            <w:tcW w:type="dxa" w:w="3805"/>
           </w:tcPr>
           <w:p>
             <w:pPr>
@@ -323,7 +327,7 @@
         </w:tc>
         <w:tc>
           <w:tcPr>
-            <w:tcW w:type="dxa" w:w="1701"/>
+            <w:tcW w:type="dxa" w:w="2854"/>
           </w:tcPr>
           <w:p>
             <w:pPr>
@@ -341,7 +345,7 @@
       <w:tr>
         <w:tc>
           <w:tcPr>
-            <w:tcW w:type="dxa" w:w="2268"/>
+            <w:tcW w:type="dxa" w:w="3805"/>
           </w:tcPr>
           <w:p>
             <w:pPr>
@@ -357,7 +361,7 @@
         </w:tc>
         <w:tc>
           <w:tcPr>
-            <w:tcW w:type="dxa" w:w="2268"/>
+            <w:tcW w:type="dxa" w:w="3805"/>
           </w:tcPr>
           <w:p>
             <w:pPr>
@@ -373,7 +377,7 @@
         </w:tc>
         <w:tc>
           <w:tcPr>
-            <w:tcW w:type="dxa" w:w="1701"/>
+            <w:tcW w:type="dxa" w:w="2854"/>
           </w:tcPr>
           <w:p>
             <w:pPr>
@@ -391,7 +395,7 @@
       <w:tr>
         <w:tc>
           <w:tcPr>
-            <w:tcW w:type="dxa" w:w="2268"/>
+            <w:tcW w:type="dxa" w:w="3805"/>
           </w:tcPr>
           <w:p>
             <w:pPr>
@@ -407,7 +411,7 @@
         </w:tc>
         <w:tc>
           <w:tcPr>
-            <w:tcW w:type="dxa" w:w="2268"/>
+            <w:tcW w:type="dxa" w:w="3805"/>
           </w:tcPr>
           <w:p>
             <w:pPr>
@@ -423,7 +427,7 @@
         </w:tc>
         <w:tc>
           <w:tcPr>
-            <w:tcW w:type="dxa" w:w="1701"/>
+            <w:tcW w:type="dxa" w:w="2854"/>
           </w:tcPr>
           <w:p>
             <w:pPr>
@@ -457,7 +461,11 @@
     <w:tbl>
       <w:tblPr>
         <w:tblStyle w:val="MDPItable"/>
+        <w:tblW w:w="10466" w:type="dxa"/>
+        <w:jc w:val="left"/>
+        <w:tblInd w:w="0" w:type="dxa"/>
         <w:tblW w:type="auto" w:w="0"/>
+        <w:tblLayout w:type="fixed"/>
         <w:tblLook w:firstColumn="1" w:firstRow="1" w:lastColumn="0" w:lastRow="0" w:noHBand="0" w:noVBand="1" w:val="04A0"/>
         <w:tblBorders>
           <w:top w:val="single" w:sz="4" w:color="9AA5B1"/>
@@ -482,7 +490,7 @@
       <w:tr>
         <w:tc>
           <w:tcPr>
-            <w:tcW w:type="dxa" w:w="1361"/>
+            <w:tcW w:type="dxa" w:w="1550"/>
             <w:shd w:fill="EDF2F7"/>
           </w:tcPr>
           <w:p>
@@ -500,7 +508,7 @@
         </w:tc>
         <w:tc>
           <w:tcPr>
-            <w:tcW w:type="dxa" w:w="964"/>
+            <w:tcW w:type="dxa" w:w="1098"/>
             <w:shd w:fill="EDF2F7"/>
           </w:tcPr>
           <w:p>
@@ -518,7 +526,7 @@
         </w:tc>
         <w:tc>
           <w:tcPr>
-            <w:tcW w:type="dxa" w:w="964"/>
+            <w:tcW w:type="dxa" w:w="1098"/>
             <w:shd w:fill="EDF2F7"/>
           </w:tcPr>
           <w:p>
@@ -536,7 +544,7 @@
         </w:tc>
         <w:tc>
           <w:tcPr>
-            <w:tcW w:type="dxa" w:w="964"/>
+            <w:tcW w:type="dxa" w:w="1098"/>
             <w:shd w:fill="EDF2F7"/>
           </w:tcPr>
           <w:p>
@@ -554,7 +562,7 @@
         </w:tc>
         <w:tc>
           <w:tcPr>
-            <w:tcW w:type="dxa" w:w="964"/>
+            <w:tcW w:type="dxa" w:w="1098"/>
             <w:shd w:fill="EDF2F7"/>
           </w:tcPr>
           <w:p>
@@ -572,7 +580,7 @@
         </w:tc>
         <w:tc>
           <w:tcPr>
-            <w:tcW w:type="dxa" w:w="964"/>
+            <w:tcW w:type="dxa" w:w="1098"/>
             <w:shd w:fill="EDF2F7"/>
           </w:tcPr>
           <w:p>
@@ -590,7 +598,7 @@
         </w:tc>
         <w:tc>
           <w:tcPr>
-            <w:tcW w:type="dxa" w:w="964"/>
+            <w:tcW w:type="dxa" w:w="1098"/>
             <w:shd w:fill="EDF2F7"/>
           </w:tcPr>
           <w:p>
@@ -608,7 +616,7 @@
         </w:tc>
         <w:tc>
           <w:tcPr>
-            <w:tcW w:type="dxa" w:w="964"/>
+            <w:tcW w:type="dxa" w:w="1098"/>
             <w:shd w:fill="EDF2F7"/>
           </w:tcPr>
           <w:p>
@@ -626,7 +634,7 @@
         </w:tc>
         <w:tc>
           <w:tcPr>
-            <w:tcW w:type="dxa" w:w="1077"/>
+            <w:tcW w:type="dxa" w:w="1227"/>
             <w:shd w:fill="EDF2F7"/>
           </w:tcPr>
           <w:p>
@@ -646,7 +654,7 @@
       <w:tr>
         <w:tc>
           <w:tcPr>
-            <w:tcW w:type="dxa" w:w="1361"/>
+            <w:tcW w:type="dxa" w:w="1550"/>
           </w:tcPr>
           <w:p>
             <w:pPr>
@@ -662,7 +670,7 @@
         </w:tc>
         <w:tc>
           <w:tcPr>
-            <w:tcW w:type="dxa" w:w="964"/>
+            <w:tcW w:type="dxa" w:w="1098"/>
           </w:tcPr>
           <w:p>
             <w:pPr>
@@ -678,7 +686,7 @@
         </w:tc>
         <w:tc>
           <w:tcPr>
-            <w:tcW w:type="dxa" w:w="964"/>
+            <w:tcW w:type="dxa" w:w="1098"/>
           </w:tcPr>
           <w:p>
             <w:pPr>
@@ -694,7 +702,7 @@
         </w:tc>
         <w:tc>
           <w:tcPr>
-            <w:tcW w:type="dxa" w:w="964"/>
+            <w:tcW w:type="dxa" w:w="1098"/>
           </w:tcPr>
           <w:p>
             <w:pPr>
@@ -710,7 +718,7 @@
         </w:tc>
         <w:tc>
           <w:tcPr>
-            <w:tcW w:type="dxa" w:w="964"/>
+            <w:tcW w:type="dxa" w:w="1098"/>
           </w:tcPr>
           <w:p>
             <w:pPr>
@@ -726,7 +734,7 @@
         </w:tc>
         <w:tc>
           <w:tcPr>
-            <w:tcW w:type="dxa" w:w="964"/>
+            <w:tcW w:type="dxa" w:w="1098"/>
           </w:tcPr>
           <w:p>
             <w:pPr>
@@ -742,7 +750,7 @@
         </w:tc>
         <w:tc>
           <w:tcPr>
-            <w:tcW w:type="dxa" w:w="964"/>
+            <w:tcW w:type="dxa" w:w="1098"/>
           </w:tcPr>
           <w:p>
             <w:pPr>
@@ -758,7 +766,7 @@
         </w:tc>
         <w:tc>
           <w:tcPr>
-            <w:tcW w:type="dxa" w:w="964"/>
+            <w:tcW w:type="dxa" w:w="1098"/>
           </w:tcPr>
           <w:p>
             <w:pPr>
@@ -774,7 +782,7 @@
         </w:tc>
         <w:tc>
           <w:tcPr>
-            <w:tcW w:type="dxa" w:w="1077"/>
+            <w:tcW w:type="dxa" w:w="1227"/>
           </w:tcPr>
           <w:p>
             <w:pPr>
@@ -792,7 +800,7 @@
       <w:tr>
         <w:tc>
           <w:tcPr>
-            <w:tcW w:type="dxa" w:w="1361"/>
+            <w:tcW w:type="dxa" w:w="1550"/>
           </w:tcPr>
           <w:p>
             <w:pPr>
@@ -808,7 +816,7 @@
         </w:tc>
         <w:tc>
           <w:tcPr>
-            <w:tcW w:type="dxa" w:w="964"/>
+            <w:tcW w:type="dxa" w:w="1098"/>
           </w:tcPr>
           <w:p>
             <w:pPr>
@@ -824,7 +832,7 @@
         </w:tc>
         <w:tc>
           <w:tcPr>
-            <w:tcW w:type="dxa" w:w="964"/>
+            <w:tcW w:type="dxa" w:w="1098"/>
           </w:tcPr>
           <w:p>
             <w:pPr>
@@ -840,7 +848,7 @@
         </w:tc>
         <w:tc>
           <w:tcPr>
-            <w:tcW w:type="dxa" w:w="964"/>
+            <w:tcW w:type="dxa" w:w="1098"/>
           </w:tcPr>
           <w:p>
             <w:pPr>
@@ -856,7 +864,7 @@
         </w:tc>
         <w:tc>
           <w:tcPr>
-            <w:tcW w:type="dxa" w:w="964"/>
+            <w:tcW w:type="dxa" w:w="1098"/>
           </w:tcPr>
           <w:p>
             <w:pPr>
@@ -872,7 +880,7 @@
         </w:tc>
         <w:tc>
           <w:tcPr>
-            <w:tcW w:type="dxa" w:w="964"/>
+            <w:tcW w:type="dxa" w:w="1098"/>
           </w:tcPr>
           <w:p>
             <w:pPr>
@@ -888,7 +896,7 @@
         </w:tc>
         <w:tc>
           <w:tcPr>
-            <w:tcW w:type="dxa" w:w="964"/>
+            <w:tcW w:type="dxa" w:w="1098"/>
           </w:tcPr>
           <w:p>
             <w:pPr>
@@ -904,7 +912,7 @@
         </w:tc>
         <w:tc>
           <w:tcPr>
-            <w:tcW w:type="dxa" w:w="964"/>
+            <w:tcW w:type="dxa" w:w="1098"/>
           </w:tcPr>
           <w:p>
             <w:pPr>
@@ -920,7 +928,7 @@
         </w:tc>
         <w:tc>
           <w:tcPr>
-            <w:tcW w:type="dxa" w:w="1077"/>
+            <w:tcW w:type="dxa" w:w="1227"/>
           </w:tcPr>
           <w:p>
             <w:pPr>
@@ -938,7 +946,7 @@
       <w:tr>
         <w:tc>
           <w:tcPr>
-            <w:tcW w:type="dxa" w:w="1361"/>
+            <w:tcW w:type="dxa" w:w="1550"/>
           </w:tcPr>
           <w:p>
             <w:pPr>
@@ -954,7 +962,7 @@
         </w:tc>
         <w:tc>
           <w:tcPr>
-            <w:tcW w:type="dxa" w:w="964"/>
+            <w:tcW w:type="dxa" w:w="1098"/>
           </w:tcPr>
           <w:p>
             <w:pPr>
@@ -970,7 +978,7 @@
         </w:tc>
         <w:tc>
           <w:tcPr>
-            <w:tcW w:type="dxa" w:w="964"/>
+            <w:tcW w:type="dxa" w:w="1098"/>
           </w:tcPr>
           <w:p>
             <w:pPr>
@@ -986,7 +994,7 @@
         </w:tc>
         <w:tc>
           <w:tcPr>
-            <w:tcW w:type="dxa" w:w="964"/>
+            <w:tcW w:type="dxa" w:w="1098"/>
           </w:tcPr>
           <w:p>
             <w:pPr>
@@ -1002,7 +1010,7 @@
         </w:tc>
         <w:tc>
           <w:tcPr>
-            <w:tcW w:type="dxa" w:w="964"/>
+            <w:tcW w:type="dxa" w:w="1098"/>
           </w:tcPr>
           <w:p>
             <w:pPr>
@@ -1018,7 +1026,7 @@
         </w:tc>
         <w:tc>
           <w:tcPr>
-            <w:tcW w:type="dxa" w:w="964"/>
+            <w:tcW w:type="dxa" w:w="1098"/>
           </w:tcPr>
           <w:p>
             <w:pPr>
@@ -1034,7 +1042,7 @@
         </w:tc>
         <w:tc>
           <w:tcPr>
-            <w:tcW w:type="dxa" w:w="964"/>
+            <w:tcW w:type="dxa" w:w="1098"/>
           </w:tcPr>
           <w:p>
             <w:pPr>
@@ -1050,7 +1058,7 @@
         </w:tc>
         <w:tc>
           <w:tcPr>
-            <w:tcW w:type="dxa" w:w="964"/>
+            <w:tcW w:type="dxa" w:w="1098"/>
           </w:tcPr>
           <w:p>
             <w:pPr>
@@ -1066,7 +1074,7 @@
         </w:tc>
         <w:tc>
           <w:tcPr>
-            <w:tcW w:type="dxa" w:w="1077"/>
+            <w:tcW w:type="dxa" w:w="1227"/>
           </w:tcPr>
           <w:p>
             <w:pPr>
@@ -1292,7 +1300,11 @@
     <w:tbl>
       <w:tblPr>
         <w:tblStyle w:val="MDPItable"/>
+        <w:tblW w:w="10466" w:type="dxa"/>
+        <w:jc w:val="left"/>
+        <w:tblInd w:w="0" w:type="dxa"/>
         <w:tblW w:type="auto" w:w="0"/>
+        <w:tblLayout w:type="fixed"/>
         <w:tblLook w:firstColumn="1" w:firstRow="1" w:lastColumn="0" w:lastRow="0" w:noHBand="0" w:noVBand="1" w:val="04A0"/>
         <w:tblBorders>
           <w:top w:val="single" w:sz="4" w:color="9AA5B1"/>
@@ -1313,7 +1325,7 @@
       <w:tr>
         <w:tc>
           <w:tcPr>
-            <w:tcW w:type="dxa" w:w="1814"/>
+            <w:tcW w:type="dxa" w:w="2119"/>
             <w:shd w:fill="EDF2F7"/>
           </w:tcPr>
           <w:p>
@@ -1331,7 +1343,7 @@
         </w:tc>
         <w:tc>
           <w:tcPr>
-            <w:tcW w:type="dxa" w:w="1928"/>
+            <w:tcW w:type="dxa" w:w="2252"/>
             <w:shd w:fill="EDF2F7"/>
           </w:tcPr>
           <w:p>
@@ -1349,7 +1361,7 @@
         </w:tc>
         <w:tc>
           <w:tcPr>
-            <w:tcW w:type="dxa" w:w="1587"/>
+            <w:tcW w:type="dxa" w:w="1854"/>
             <w:shd w:fill="EDF2F7"/>
           </w:tcPr>
           <w:p>
@@ -1367,7 +1379,7 @@
         </w:tc>
         <w:tc>
           <w:tcPr>
-            <w:tcW w:type="dxa" w:w="1928"/>
+            <w:tcW w:type="dxa" w:w="2252"/>
             <w:shd w:fill="EDF2F7"/>
           </w:tcPr>
           <w:p>
@@ -1385,7 +1397,7 @@
         </w:tc>
         <w:tc>
           <w:tcPr>
-            <w:tcW w:type="dxa" w:w="1701"/>
+            <w:tcW w:type="dxa" w:w="1987"/>
             <w:shd w:fill="EDF2F7"/>
           </w:tcPr>
           <w:p>
@@ -1405,7 +1417,7 @@
       <w:tr>
         <w:tc>
           <w:tcPr>
-            <w:tcW w:type="dxa" w:w="1814"/>
+            <w:tcW w:type="dxa" w:w="2119"/>
           </w:tcPr>
           <w:p>
             <w:pPr>
@@ -1421,7 +1433,7 @@
         </w:tc>
         <w:tc>
           <w:tcPr>
-            <w:tcW w:type="dxa" w:w="1928"/>
+            <w:tcW w:type="dxa" w:w="2252"/>
           </w:tcPr>
           <w:p>
             <w:pPr>
@@ -1437,7 +1449,7 @@
         </w:tc>
         <w:tc>
           <w:tcPr>
-            <w:tcW w:type="dxa" w:w="1587"/>
+            <w:tcW w:type="dxa" w:w="1854"/>
           </w:tcPr>
           <w:p>
             <w:pPr>
@@ -1453,7 +1465,7 @@
         </w:tc>
         <w:tc>
           <w:tcPr>
-            <w:tcW w:type="dxa" w:w="1928"/>
+            <w:tcW w:type="dxa" w:w="2252"/>
           </w:tcPr>
           <w:p>
             <w:pPr>
@@ -1469,7 +1481,7 @@
         </w:tc>
         <w:tc>
           <w:tcPr>
-            <w:tcW w:type="dxa" w:w="1701"/>
+            <w:tcW w:type="dxa" w:w="1987"/>
           </w:tcPr>
           <w:p>
             <w:pPr>
@@ -1487,7 +1499,7 @@
       <w:tr>
         <w:tc>
           <w:tcPr>
-            <w:tcW w:type="dxa" w:w="1814"/>
+            <w:tcW w:type="dxa" w:w="2119"/>
           </w:tcPr>
           <w:p>
             <w:pPr>
@@ -1503,7 +1515,7 @@
         </w:tc>
         <w:tc>
           <w:tcPr>
-            <w:tcW w:type="dxa" w:w="1928"/>
+            <w:tcW w:type="dxa" w:w="2252"/>
           </w:tcPr>
           <w:p>
             <w:pPr>
@@ -1519,7 +1531,7 @@
         </w:tc>
         <w:tc>
           <w:tcPr>
-            <w:tcW w:type="dxa" w:w="1587"/>
+            <w:tcW w:type="dxa" w:w="1854"/>
           </w:tcPr>
           <w:p>
             <w:pPr>
@@ -1535,7 +1547,7 @@
         </w:tc>
         <w:tc>
           <w:tcPr>
-            <w:tcW w:type="dxa" w:w="1928"/>
+            <w:tcW w:type="dxa" w:w="2252"/>
           </w:tcPr>
           <w:p>
             <w:pPr>
@@ -1551,7 +1563,7 @@
         </w:tc>
         <w:tc>
           <w:tcPr>
-            <w:tcW w:type="dxa" w:w="1701"/>
+            <w:tcW w:type="dxa" w:w="1987"/>
           </w:tcPr>
           <w:p>
             <w:pPr>
@@ -1569,7 +1581,7 @@
       <w:tr>
         <w:tc>
           <w:tcPr>
-            <w:tcW w:type="dxa" w:w="1814"/>
+            <w:tcW w:type="dxa" w:w="2119"/>
           </w:tcPr>
           <w:p>
             <w:pPr>
@@ -1585,7 +1597,7 @@
         </w:tc>
         <w:tc>
           <w:tcPr>
-            <w:tcW w:type="dxa" w:w="1928"/>
+            <w:tcW w:type="dxa" w:w="2252"/>
           </w:tcPr>
           <w:p>
             <w:pPr>
@@ -1601,7 +1613,7 @@
         </w:tc>
         <w:tc>
           <w:tcPr>
-            <w:tcW w:type="dxa" w:w="1587"/>
+            <w:tcW w:type="dxa" w:w="1854"/>
           </w:tcPr>
           <w:p>
             <w:pPr>
@@ -1617,7 +1629,7 @@
         </w:tc>
         <w:tc>
           <w:tcPr>
-            <w:tcW w:type="dxa" w:w="1928"/>
+            <w:tcW w:type="dxa" w:w="2252"/>
           </w:tcPr>
           <w:p>
             <w:pPr>
@@ -1633,7 +1645,7 @@
         </w:tc>
         <w:tc>
           <w:tcPr>
-            <w:tcW w:type="dxa" w:w="1701"/>
+            <w:tcW w:type="dxa" w:w="1987"/>
           </w:tcPr>
           <w:p>
             <w:pPr>
@@ -1851,7 +1863,11 @@
     <w:tbl>
       <w:tblPr>
         <w:tblStyle w:val="MDPItable"/>
+        <w:tblW w:w="10466" w:type="dxa"/>
+        <w:jc w:val="left"/>
+        <w:tblInd w:w="0" w:type="dxa"/>
         <w:tblW w:type="auto" w:w="0"/>
+        <w:tblLayout w:type="fixed"/>
         <w:tblLook w:firstColumn="1" w:firstRow="1" w:lastColumn="0" w:lastRow="0" w:noHBand="0" w:noVBand="1" w:val="04A0"/>
         <w:tblBorders>
           <w:top w:val="single" w:sz="4" w:color="9AA5B1"/>
@@ -1881,7 +1897,7 @@
       <w:tr>
         <w:tc>
           <w:tcPr>
-            <w:tcW w:type="dxa" w:w="1191"/>
+            <w:tcW w:type="dxa" w:w="968"/>
             <w:shd w:fill="EDF2F7"/>
           </w:tcPr>
           <w:p>
@@ -1899,7 +1915,7 @@
         </w:tc>
         <w:tc>
           <w:tcPr>
-            <w:tcW w:type="dxa" w:w="1134"/>
+            <w:tcW w:type="dxa" w:w="922"/>
             <w:shd w:fill="EDF2F7"/>
           </w:tcPr>
           <w:p>
@@ -1917,7 +1933,7 @@
         </w:tc>
         <w:tc>
           <w:tcPr>
-            <w:tcW w:type="dxa" w:w="879"/>
+            <w:tcW w:type="dxa" w:w="714"/>
             <w:shd w:fill="EDF2F7"/>
           </w:tcPr>
           <w:p>
@@ -1935,7 +1951,7 @@
         </w:tc>
         <w:tc>
           <w:tcPr>
-            <w:tcW w:type="dxa" w:w="879"/>
+            <w:tcW w:type="dxa" w:w="714"/>
             <w:shd w:fill="EDF2F7"/>
           </w:tcPr>
           <w:p>
@@ -1953,7 +1969,7 @@
         </w:tc>
         <w:tc>
           <w:tcPr>
-            <w:tcW w:type="dxa" w:w="879"/>
+            <w:tcW w:type="dxa" w:w="714"/>
             <w:shd w:fill="EDF2F7"/>
           </w:tcPr>
           <w:p>
@@ -1971,7 +1987,7 @@
         </w:tc>
         <w:tc>
           <w:tcPr>
-            <w:tcW w:type="dxa" w:w="879"/>
+            <w:tcW w:type="dxa" w:w="714"/>
             <w:shd w:fill="EDF2F7"/>
           </w:tcPr>
           <w:p>
@@ -1989,7 +2005,7 @@
         </w:tc>
         <w:tc>
           <w:tcPr>
-            <w:tcW w:type="dxa" w:w="879"/>
+            <w:tcW w:type="dxa" w:w="714"/>
             <w:shd w:fill="EDF2F7"/>
           </w:tcPr>
           <w:p>
@@ -2007,7 +2023,7 @@
         </w:tc>
         <w:tc>
           <w:tcPr>
-            <w:tcW w:type="dxa" w:w="879"/>
+            <w:tcW w:type="dxa" w:w="714"/>
             <w:shd w:fill="EDF2F7"/>
           </w:tcPr>
           <w:p>
@@ -2025,7 +2041,7 @@
         </w:tc>
         <w:tc>
           <w:tcPr>
-            <w:tcW w:type="dxa" w:w="879"/>
+            <w:tcW w:type="dxa" w:w="714"/>
             <w:shd w:fill="EDF2F7"/>
           </w:tcPr>
           <w:p>
@@ -2043,7 +2059,7 @@
         </w:tc>
         <w:tc>
           <w:tcPr>
-            <w:tcW w:type="dxa" w:w="879"/>
+            <w:tcW w:type="dxa" w:w="714"/>
             <w:shd w:fill="EDF2F7"/>
           </w:tcPr>
           <w:p>
@@ -2061,7 +2077,7 @@
         </w:tc>
         <w:tc>
           <w:tcPr>
-            <w:tcW w:type="dxa" w:w="879"/>
+            <w:tcW w:type="dxa" w:w="714"/>
             <w:shd w:fill="EDF2F7"/>
           </w:tcPr>
           <w:p>
@@ -2079,7 +2095,7 @@
         </w:tc>
         <w:tc>
           <w:tcPr>
-            <w:tcW w:type="dxa" w:w="879"/>
+            <w:tcW w:type="dxa" w:w="714"/>
             <w:shd w:fill="EDF2F7"/>
           </w:tcPr>
           <w:p>
@@ -2097,7 +2113,7 @@
         </w:tc>
         <w:tc>
           <w:tcPr>
-            <w:tcW w:type="dxa" w:w="879"/>
+            <w:tcW w:type="dxa" w:w="714"/>
             <w:shd w:fill="EDF2F7"/>
           </w:tcPr>
           <w:p>
@@ -2115,7 +2131,7 @@
         </w:tc>
         <w:tc>
           <w:tcPr>
-            <w:tcW w:type="dxa" w:w="879"/>
+            <w:tcW w:type="dxa" w:w="714"/>
             <w:shd w:fill="EDF2F7"/>
           </w:tcPr>
           <w:p>
@@ -2135,7 +2151,7 @@
       <w:tr>
         <w:tc>
           <w:tcPr>
-            <w:tcW w:type="dxa" w:w="1191"/>
+            <w:tcW w:type="dxa" w:w="968"/>
           </w:tcPr>
           <w:p>
             <w:pPr>
@@ -2151,7 +2167,7 @@
         </w:tc>
         <w:tc>
           <w:tcPr>
-            <w:tcW w:type="dxa" w:w="1134"/>
+            <w:tcW w:type="dxa" w:w="922"/>
           </w:tcPr>
           <w:p>
             <w:pPr>
@@ -2167,7 +2183,7 @@
         </w:tc>
         <w:tc>
           <w:tcPr>
-            <w:tcW w:type="dxa" w:w="879"/>
+            <w:tcW w:type="dxa" w:w="714"/>
           </w:tcPr>
           <w:p>
             <w:pPr>
@@ -2184,7 +2200,7 @@
         </w:tc>
         <w:tc>
           <w:tcPr>
-            <w:tcW w:type="dxa" w:w="879"/>
+            <w:tcW w:type="dxa" w:w="714"/>
           </w:tcPr>
           <w:p>
             <w:pPr>
@@ -2200,7 +2216,7 @@
         </w:tc>
         <w:tc>
           <w:tcPr>
-            <w:tcW w:type="dxa" w:w="879"/>
+            <w:tcW w:type="dxa" w:w="714"/>
           </w:tcPr>
           <w:p>
             <w:pPr>
@@ -2216,7 +2232,7 @@
         </w:tc>
         <w:tc>
           <w:tcPr>
-            <w:tcW w:type="dxa" w:w="879"/>
+            <w:tcW w:type="dxa" w:w="714"/>
           </w:tcPr>
           <w:p>
             <w:pPr>
@@ -2232,7 +2248,7 @@
         </w:tc>
         <w:tc>
           <w:tcPr>
-            <w:tcW w:type="dxa" w:w="879"/>
+            <w:tcW w:type="dxa" w:w="714"/>
           </w:tcPr>
           <w:p>
             <w:pPr>
@@ -2248,7 +2264,7 @@
         </w:tc>
         <w:tc>
           <w:tcPr>
-            <w:tcW w:type="dxa" w:w="879"/>
+            <w:tcW w:type="dxa" w:w="714"/>
           </w:tcPr>
           <w:p>
             <w:pPr>
@@ -2264,7 +2280,7 @@
         </w:tc>
         <w:tc>
           <w:tcPr>
-            <w:tcW w:type="dxa" w:w="879"/>
+            <w:tcW w:type="dxa" w:w="714"/>
           </w:tcPr>
           <w:p>
             <w:pPr>
@@ -2280,7 +2296,7 @@
         </w:tc>
         <w:tc>
           <w:tcPr>
-            <w:tcW w:type="dxa" w:w="879"/>
+            <w:tcW w:type="dxa" w:w="714"/>
           </w:tcPr>
           <w:p>
             <w:pPr>
@@ -2296,7 +2312,7 @@
         </w:tc>
         <w:tc>
           <w:tcPr>
-            <w:tcW w:type="dxa" w:w="879"/>
+            <w:tcW w:type="dxa" w:w="714"/>
           </w:tcPr>
           <w:p>
             <w:pPr>
@@ -2312,7 +2328,7 @@
         </w:tc>
         <w:tc>
           <w:tcPr>
-            <w:tcW w:type="dxa" w:w="879"/>
+            <w:tcW w:type="dxa" w:w="714"/>
           </w:tcPr>
           <w:p>
             <w:pPr>
@@ -2328,7 +2344,7 @@
         </w:tc>
         <w:tc>
           <w:tcPr>
-            <w:tcW w:type="dxa" w:w="879"/>
+            <w:tcW w:type="dxa" w:w="714"/>
           </w:tcPr>
           <w:p>
             <w:pPr>
@@ -2344,7 +2360,7 @@
         </w:tc>
         <w:tc>
           <w:tcPr>
-            <w:tcW w:type="dxa" w:w="879"/>
+            <w:tcW w:type="dxa" w:w="714"/>
           </w:tcPr>
           <w:p>
             <w:pPr>
@@ -2362,7 +2378,7 @@
       <w:tr>
         <w:tc>
           <w:tcPr>
-            <w:tcW w:type="dxa" w:w="1191"/>
+            <w:tcW w:type="dxa" w:w="968"/>
           </w:tcPr>
           <w:p>
             <w:pPr>
@@ -2378,7 +2394,7 @@
         </w:tc>
         <w:tc>
           <w:tcPr>
-            <w:tcW w:type="dxa" w:w="1134"/>
+            <w:tcW w:type="dxa" w:w="922"/>
           </w:tcPr>
           <w:p>
             <w:pPr>
@@ -2394,7 +2410,7 @@
         </w:tc>
         <w:tc>
           <w:tcPr>
-            <w:tcW w:type="dxa" w:w="879"/>
+            <w:tcW w:type="dxa" w:w="714"/>
           </w:tcPr>
           <w:p>
             <w:pPr>
@@ -2411,7 +2427,7 @@
         </w:tc>
         <w:tc>
           <w:tcPr>
-            <w:tcW w:type="dxa" w:w="879"/>
+            <w:tcW w:type="dxa" w:w="714"/>
           </w:tcPr>
           <w:p>
             <w:pPr>
@@ -2427,7 +2443,7 @@
         </w:tc>
         <w:tc>
           <w:tcPr>
-            <w:tcW w:type="dxa" w:w="879"/>
+            <w:tcW w:type="dxa" w:w="714"/>
           </w:tcPr>
           <w:p>
             <w:pPr>
@@ -2443,7 +2459,7 @@
         </w:tc>
         <w:tc>
           <w:tcPr>
-            <w:tcW w:type="dxa" w:w="879"/>
+            <w:tcW w:type="dxa" w:w="714"/>
           </w:tcPr>
           <w:p>
             <w:pPr>
@@ -2459,7 +2475,7 @@
         </w:tc>
         <w:tc>
           <w:tcPr>
-            <w:tcW w:type="dxa" w:w="879"/>
+            <w:tcW w:type="dxa" w:w="714"/>
           </w:tcPr>
           <w:p>
             <w:pPr>
@@ -2475,7 +2491,7 @@
         </w:tc>
         <w:tc>
           <w:tcPr>
-            <w:tcW w:type="dxa" w:w="879"/>
+            <w:tcW w:type="dxa" w:w="714"/>
           </w:tcPr>
           <w:p>
             <w:pPr>
@@ -2491,7 +2507,7 @@
         </w:tc>
         <w:tc>
           <w:tcPr>
-            <w:tcW w:type="dxa" w:w="879"/>
+            <w:tcW w:type="dxa" w:w="714"/>
           </w:tcPr>
           <w:p>
             <w:pPr>
@@ -2507,7 +2523,7 @@
         </w:tc>
         <w:tc>
           <w:tcPr>
-            <w:tcW w:type="dxa" w:w="879"/>
+            <w:tcW w:type="dxa" w:w="714"/>
           </w:tcPr>
           <w:p>
             <w:pPr>
@@ -2523,7 +2539,7 @@
         </w:tc>
         <w:tc>
           <w:tcPr>
-            <w:tcW w:type="dxa" w:w="879"/>
+            <w:tcW w:type="dxa" w:w="714"/>
           </w:tcPr>
           <w:p>
             <w:pPr>
@@ -2539,7 +2555,7 @@
         </w:tc>
         <w:tc>
           <w:tcPr>
-            <w:tcW w:type="dxa" w:w="879"/>
+            <w:tcW w:type="dxa" w:w="714"/>
           </w:tcPr>
           <w:p>
             <w:pPr>
@@ -2555,7 +2571,7 @@
         </w:tc>
         <w:tc>
           <w:tcPr>
-            <w:tcW w:type="dxa" w:w="879"/>
+            <w:tcW w:type="dxa" w:w="714"/>
           </w:tcPr>
           <w:p>
             <w:pPr>
@@ -2571,7 +2587,7 @@
         </w:tc>
         <w:tc>
           <w:tcPr>
-            <w:tcW w:type="dxa" w:w="879"/>
+            <w:tcW w:type="dxa" w:w="714"/>
           </w:tcPr>
           <w:p>
             <w:pPr>
@@ -2589,7 +2605,7 @@
       <w:tr>
         <w:tc>
           <w:tcPr>
-            <w:tcW w:type="dxa" w:w="1191"/>
+            <w:tcW w:type="dxa" w:w="968"/>
           </w:tcPr>
           <w:p>
             <w:pPr>
@@ -2605,7 +2621,7 @@
         </w:tc>
         <w:tc>
           <w:tcPr>
-            <w:tcW w:type="dxa" w:w="1134"/>
+            <w:tcW w:type="dxa" w:w="922"/>
           </w:tcPr>
           <w:p>
             <w:pPr>
@@ -2621,7 +2637,7 @@
         </w:tc>
         <w:tc>
           <w:tcPr>
-            <w:tcW w:type="dxa" w:w="879"/>
+            <w:tcW w:type="dxa" w:w="714"/>
           </w:tcPr>
           <w:p>
             <w:pPr>
@@ -2638,7 +2654,7 @@
         </w:tc>
         <w:tc>
           <w:tcPr>
-            <w:tcW w:type="dxa" w:w="879"/>
+            <w:tcW w:type="dxa" w:w="714"/>
           </w:tcPr>
           <w:p>
             <w:pPr>
@@ -2654,7 +2670,7 @@
         </w:tc>
         <w:tc>
           <w:tcPr>
-            <w:tcW w:type="dxa" w:w="879"/>
+            <w:tcW w:type="dxa" w:w="714"/>
           </w:tcPr>
           <w:p>
             <w:pPr>
@@ -2670,7 +2686,7 @@
         </w:tc>
         <w:tc>
           <w:tcPr>
-            <w:tcW w:type="dxa" w:w="879"/>
+            <w:tcW w:type="dxa" w:w="714"/>
           </w:tcPr>
           <w:p>
             <w:pPr>
@@ -2686,7 +2702,7 @@
         </w:tc>
         <w:tc>
           <w:tcPr>
-            <w:tcW w:type="dxa" w:w="879"/>
+            <w:tcW w:type="dxa" w:w="714"/>
           </w:tcPr>
           <w:p>
             <w:pPr>
@@ -2702,7 +2718,7 @@
         </w:tc>
         <w:tc>
           <w:tcPr>
-            <w:tcW w:type="dxa" w:w="879"/>
+            <w:tcW w:type="dxa" w:w="714"/>
           </w:tcPr>
           <w:p>
             <w:pPr>
@@ -2718,7 +2734,7 @@
         </w:tc>
         <w:tc>
           <w:tcPr>
-            <w:tcW w:type="dxa" w:w="879"/>
+            <w:tcW w:type="dxa" w:w="714"/>
           </w:tcPr>
           <w:p>
             <w:pPr>
@@ -2734,7 +2750,7 @@
         </w:tc>
         <w:tc>
           <w:tcPr>
-            <w:tcW w:type="dxa" w:w="879"/>
+            <w:tcW w:type="dxa" w:w="714"/>
           </w:tcPr>
           <w:p>
             <w:pPr>
@@ -2750,7 +2766,7 @@
         </w:tc>
         <w:tc>
           <w:tcPr>
-            <w:tcW w:type="dxa" w:w="879"/>
+            <w:tcW w:type="dxa" w:w="714"/>
           </w:tcPr>
           <w:p>
             <w:pPr>
@@ -2766,7 +2782,7 @@
         </w:tc>
         <w:tc>
           <w:tcPr>
-            <w:tcW w:type="dxa" w:w="879"/>
+            <w:tcW w:type="dxa" w:w="714"/>
           </w:tcPr>
           <w:p>
             <w:pPr>
@@ -2782,7 +2798,7 @@
         </w:tc>
         <w:tc>
           <w:tcPr>
-            <w:tcW w:type="dxa" w:w="879"/>
+            <w:tcW w:type="dxa" w:w="714"/>
           </w:tcPr>
           <w:p>
             <w:pPr>
@@ -2798,7 +2814,7 @@
         </w:tc>
         <w:tc>
           <w:tcPr>
-            <w:tcW w:type="dxa" w:w="879"/>
+            <w:tcW w:type="dxa" w:w="714"/>
           </w:tcPr>
           <w:p>
             <w:pPr>
@@ -2816,7 +2832,7 @@
       <w:tr>
         <w:tc>
           <w:tcPr>
-            <w:tcW w:type="dxa" w:w="1191"/>
+            <w:tcW w:type="dxa" w:w="968"/>
           </w:tcPr>
           <w:p>
             <w:pPr>
@@ -2832,7 +2848,7 @@
         </w:tc>
         <w:tc>
           <w:tcPr>
-            <w:tcW w:type="dxa" w:w="1134"/>
+            <w:tcW w:type="dxa" w:w="922"/>
           </w:tcPr>
           <w:p>
             <w:pPr>
@@ -2848,7 +2864,7 @@
         </w:tc>
         <w:tc>
           <w:tcPr>
-            <w:tcW w:type="dxa" w:w="879"/>
+            <w:tcW w:type="dxa" w:w="714"/>
           </w:tcPr>
           <w:p>
             <w:pPr>
@@ -2865,7 +2881,7 @@
         </w:tc>
         <w:tc>
           <w:tcPr>
-            <w:tcW w:type="dxa" w:w="879"/>
+            <w:tcW w:type="dxa" w:w="714"/>
           </w:tcPr>
           <w:p>
             <w:pPr>
@@ -2881,7 +2897,7 @@
         </w:tc>
         <w:tc>
           <w:tcPr>
-            <w:tcW w:type="dxa" w:w="879"/>
+            <w:tcW w:type="dxa" w:w="714"/>
           </w:tcPr>
           <w:p>
             <w:pPr>
@@ -2897,7 +2913,7 @@
         </w:tc>
         <w:tc>
           <w:tcPr>
-            <w:tcW w:type="dxa" w:w="879"/>
+            <w:tcW w:type="dxa" w:w="714"/>
           </w:tcPr>
           <w:p>
             <w:pPr>
@@ -2913,7 +2929,7 @@
         </w:tc>
         <w:tc>
           <w:tcPr>
-            <w:tcW w:type="dxa" w:w="879"/>
+            <w:tcW w:type="dxa" w:w="714"/>
           </w:tcPr>
           <w:p>
             <w:pPr>
@@ -2929,7 +2945,7 @@
         </w:tc>
         <w:tc>
           <w:tcPr>
-            <w:tcW w:type="dxa" w:w="879"/>
+            <w:tcW w:type="dxa" w:w="714"/>
           </w:tcPr>
           <w:p>
             <w:pPr>
@@ -2945,7 +2961,7 @@
         </w:tc>
         <w:tc>
           <w:tcPr>
-            <w:tcW w:type="dxa" w:w="879"/>
+            <w:tcW w:type="dxa" w:w="714"/>
           </w:tcPr>
           <w:p>
             <w:pPr>
@@ -2961,7 +2977,7 @@
         </w:tc>
         <w:tc>
           <w:tcPr>
-            <w:tcW w:type="dxa" w:w="879"/>
+            <w:tcW w:type="dxa" w:w="714"/>
           </w:tcPr>
           <w:p>
             <w:pPr>
@@ -2977,7 +2993,7 @@
         </w:tc>
         <w:tc>
           <w:tcPr>
-            <w:tcW w:type="dxa" w:w="879"/>
+            <w:tcW w:type="dxa" w:w="714"/>
           </w:tcPr>
           <w:p>
             <w:pPr>
@@ -2993,7 +3009,7 @@
         </w:tc>
         <w:tc>
           <w:tcPr>
-            <w:tcW w:type="dxa" w:w="879"/>
+            <w:tcW w:type="dxa" w:w="714"/>
           </w:tcPr>
           <w:p>
             <w:pPr>
@@ -3009,7 +3025,7 @@
         </w:tc>
         <w:tc>
           <w:tcPr>
-            <w:tcW w:type="dxa" w:w="879"/>
+            <w:tcW w:type="dxa" w:w="714"/>
           </w:tcPr>
           <w:p>
             <w:pPr>
@@ -3025,7 +3041,7 @@
         </w:tc>
         <w:tc>
           <w:tcPr>
-            <w:tcW w:type="dxa" w:w="879"/>
+            <w:tcW w:type="dxa" w:w="714"/>
           </w:tcPr>
           <w:p>
             <w:pPr>
@@ -3043,7 +3059,7 @@
       <w:tr>
         <w:tc>
           <w:tcPr>
-            <w:tcW w:type="dxa" w:w="1191"/>
+            <w:tcW w:type="dxa" w:w="968"/>
           </w:tcPr>
           <w:p>
             <w:pPr>
@@ -3059,7 +3075,7 @@
         </w:tc>
         <w:tc>
           <w:tcPr>
-            <w:tcW w:type="dxa" w:w="1134"/>
+            <w:tcW w:type="dxa" w:w="922"/>
           </w:tcPr>
           <w:p>
             <w:pPr>
@@ -3075,7 +3091,7 @@
         </w:tc>
         <w:tc>
           <w:tcPr>
-            <w:tcW w:type="dxa" w:w="879"/>
+            <w:tcW w:type="dxa" w:w="714"/>
           </w:tcPr>
           <w:p>
             <w:pPr>
@@ -3092,7 +3108,7 @@
         </w:tc>
         <w:tc>
           <w:tcPr>
-            <w:tcW w:type="dxa" w:w="879"/>
+            <w:tcW w:type="dxa" w:w="714"/>
           </w:tcPr>
           <w:p>
             <w:pPr>
@@ -3108,7 +3124,7 @@
         </w:tc>
         <w:tc>
           <w:tcPr>
-            <w:tcW w:type="dxa" w:w="879"/>
+            <w:tcW w:type="dxa" w:w="714"/>
           </w:tcPr>
           <w:p>
             <w:pPr>
@@ -3124,7 +3140,7 @@
         </w:tc>
         <w:tc>
           <w:tcPr>
-            <w:tcW w:type="dxa" w:w="879"/>
+            <w:tcW w:type="dxa" w:w="714"/>
           </w:tcPr>
           <w:p>
             <w:pPr>
@@ -3140,7 +3156,7 @@
         </w:tc>
         <w:tc>
           <w:tcPr>
-            <w:tcW w:type="dxa" w:w="879"/>
+            <w:tcW w:type="dxa" w:w="714"/>
           </w:tcPr>
           <w:p>
             <w:pPr>
@@ -3156,7 +3172,7 @@
         </w:tc>
         <w:tc>
           <w:tcPr>
-            <w:tcW w:type="dxa" w:w="879"/>
+            <w:tcW w:type="dxa" w:w="714"/>
           </w:tcPr>
           <w:p>
             <w:pPr>
@@ -3172,7 +3188,7 @@
         </w:tc>
         <w:tc>
           <w:tcPr>
-            <w:tcW w:type="dxa" w:w="879"/>
+            <w:tcW w:type="dxa" w:w="714"/>
           </w:tcPr>
           <w:p>
             <w:pPr>
@@ -3188,7 +3204,7 @@
         </w:tc>
         <w:tc>
           <w:tcPr>
-            <w:tcW w:type="dxa" w:w="879"/>
+            <w:tcW w:type="dxa" w:w="714"/>
           </w:tcPr>
           <w:p>
             <w:pPr>
@@ -3204,7 +3220,7 @@
         </w:tc>
         <w:tc>
           <w:tcPr>
-            <w:tcW w:type="dxa" w:w="879"/>
+            <w:tcW w:type="dxa" w:w="714"/>
           </w:tcPr>
           <w:p>
             <w:pPr>
@@ -3220,7 +3236,7 @@
         </w:tc>
         <w:tc>
           <w:tcPr>
-            <w:tcW w:type="dxa" w:w="879"/>
+            <w:tcW w:type="dxa" w:w="714"/>
           </w:tcPr>
           <w:p>
             <w:pPr>
@@ -3236,7 +3252,7 @@
         </w:tc>
         <w:tc>
           <w:tcPr>
-            <w:tcW w:type="dxa" w:w="879"/>
+            <w:tcW w:type="dxa" w:w="714"/>
           </w:tcPr>
           <w:p>
             <w:pPr>
@@ -3252,7 +3268,7 @@
         </w:tc>
         <w:tc>
           <w:tcPr>
-            <w:tcW w:type="dxa" w:w="879"/>
+            <w:tcW w:type="dxa" w:w="714"/>
           </w:tcPr>
           <w:p>
             <w:pPr>
@@ -3270,7 +3286,7 @@
       <w:tr>
         <w:tc>
           <w:tcPr>
-            <w:tcW w:type="dxa" w:w="1191"/>
+            <w:tcW w:type="dxa" w:w="968"/>
           </w:tcPr>
           <w:p>
             <w:pPr>
@@ -3286,7 +3302,7 @@
         </w:tc>
         <w:tc>
           <w:tcPr>
-            <w:tcW w:type="dxa" w:w="1134"/>
+            <w:tcW w:type="dxa" w:w="922"/>
           </w:tcPr>
           <w:p>
             <w:pPr>
@@ -3302,7 +3318,7 @@
         </w:tc>
         <w:tc>
           <w:tcPr>
-            <w:tcW w:type="dxa" w:w="879"/>
+            <w:tcW w:type="dxa" w:w="714"/>
           </w:tcPr>
           <w:p>
             <w:pPr>
@@ -3319,7 +3335,7 @@
         </w:tc>
         <w:tc>
           <w:tcPr>
-            <w:tcW w:type="dxa" w:w="879"/>
+            <w:tcW w:type="dxa" w:w="714"/>
           </w:tcPr>
           <w:p>
             <w:pPr>
@@ -3335,7 +3351,7 @@
         </w:tc>
         <w:tc>
           <w:tcPr>
-            <w:tcW w:type="dxa" w:w="879"/>
+            <w:tcW w:type="dxa" w:w="714"/>
           </w:tcPr>
           <w:p>
             <w:pPr>
@@ -3351,7 +3367,7 @@
         </w:tc>
         <w:tc>
           <w:tcPr>
-            <w:tcW w:type="dxa" w:w="879"/>
+            <w:tcW w:type="dxa" w:w="714"/>
           </w:tcPr>
           <w:p>
             <w:pPr>
@@ -3367,7 +3383,7 @@
         </w:tc>
         <w:tc>
           <w:tcPr>
-            <w:tcW w:type="dxa" w:w="879"/>
+            <w:tcW w:type="dxa" w:w="714"/>
           </w:tcPr>
           <w:p>
             <w:pPr>
@@ -3383,7 +3399,7 @@
         </w:tc>
         <w:tc>
           <w:tcPr>
-            <w:tcW w:type="dxa" w:w="879"/>
+            <w:tcW w:type="dxa" w:w="714"/>
           </w:tcPr>
           <w:p>
             <w:pPr>
@@ -3399,7 +3415,7 @@
         </w:tc>
         <w:tc>
           <w:tcPr>
-            <w:tcW w:type="dxa" w:w="879"/>
+            <w:tcW w:type="dxa" w:w="714"/>
           </w:tcPr>
           <w:p>
             <w:pPr>
@@ -3415,7 +3431,7 @@
         </w:tc>
         <w:tc>
           <w:tcPr>
-            <w:tcW w:type="dxa" w:w="879"/>
+            <w:tcW w:type="dxa" w:w="714"/>
           </w:tcPr>
           <w:p>
             <w:pPr>
@@ -3431,7 +3447,7 @@
         </w:tc>
         <w:tc>
           <w:tcPr>
-            <w:tcW w:type="dxa" w:w="879"/>
+            <w:tcW w:type="dxa" w:w="714"/>
           </w:tcPr>
           <w:p>
             <w:pPr>
@@ -3447,7 +3463,7 @@
         </w:tc>
         <w:tc>
           <w:tcPr>
-            <w:tcW w:type="dxa" w:w="879"/>
+            <w:tcW w:type="dxa" w:w="714"/>
           </w:tcPr>
           <w:p>
             <w:pPr>
@@ -3463,7 +3479,7 @@
         </w:tc>
         <w:tc>
           <w:tcPr>
-            <w:tcW w:type="dxa" w:w="879"/>
+            <w:tcW w:type="dxa" w:w="714"/>
           </w:tcPr>
           <w:p>
             <w:pPr>
@@ -3479,7 +3495,7 @@
         </w:tc>
         <w:tc>
           <w:tcPr>
-            <w:tcW w:type="dxa" w:w="879"/>
+            <w:tcW w:type="dxa" w:w="714"/>
           </w:tcPr>
           <w:p>
             <w:pPr>
@@ -3497,7 +3513,7 @@
       <w:tr>
         <w:tc>
           <w:tcPr>
-            <w:tcW w:type="dxa" w:w="1191"/>
+            <w:tcW w:type="dxa" w:w="968"/>
           </w:tcPr>
           <w:p>
             <w:pPr>
@@ -3513,7 +3529,7 @@
         </w:tc>
         <w:tc>
           <w:tcPr>
-            <w:tcW w:type="dxa" w:w="1134"/>
+            <w:tcW w:type="dxa" w:w="922"/>
           </w:tcPr>
           <w:p>
             <w:pPr>
@@ -3529,7 +3545,7 @@
         </w:tc>
         <w:tc>
           <w:tcPr>
-            <w:tcW w:type="dxa" w:w="879"/>
+            <w:tcW w:type="dxa" w:w="714"/>
           </w:tcPr>
           <w:p>
             <w:pPr>
@@ -3546,7 +3562,7 @@
         </w:tc>
         <w:tc>
           <w:tcPr>
-            <w:tcW w:type="dxa" w:w="879"/>
+            <w:tcW w:type="dxa" w:w="714"/>
           </w:tcPr>
           <w:p>
             <w:pPr>
@@ -3562,7 +3578,7 @@
         </w:tc>
         <w:tc>
           <w:tcPr>
-            <w:tcW w:type="dxa" w:w="879"/>
+            <w:tcW w:type="dxa" w:w="714"/>
           </w:tcPr>
           <w:p>
             <w:pPr>
@@ -3578,7 +3594,7 @@
         </w:tc>
         <w:tc>
           <w:tcPr>
-            <w:tcW w:type="dxa" w:w="879"/>
+            <w:tcW w:type="dxa" w:w="714"/>
           </w:tcPr>
           <w:p>
             <w:pPr>
@@ -3594,7 +3610,7 @@
         </w:tc>
         <w:tc>
           <w:tcPr>
-            <w:tcW w:type="dxa" w:w="879"/>
+            <w:tcW w:type="dxa" w:w="714"/>
           </w:tcPr>
           <w:p>
             <w:pPr>
@@ -3610,7 +3626,7 @@
         </w:tc>
         <w:tc>
           <w:tcPr>
-            <w:tcW w:type="dxa" w:w="879"/>
+            <w:tcW w:type="dxa" w:w="714"/>
           </w:tcPr>
           <w:p>
             <w:pPr>
@@ -3626,7 +3642,7 @@
         </w:tc>
         <w:tc>
           <w:tcPr>
-            <w:tcW w:type="dxa" w:w="879"/>
+            <w:tcW w:type="dxa" w:w="714"/>
           </w:tcPr>
           <w:p>
             <w:pPr>
@@ -3642,7 +3658,7 @@
         </w:tc>
         <w:tc>
           <w:tcPr>
-            <w:tcW w:type="dxa" w:w="879"/>
+            <w:tcW w:type="dxa" w:w="714"/>
           </w:tcPr>
           <w:p>
             <w:pPr>
@@ -3658,7 +3674,7 @@
         </w:tc>
         <w:tc>
           <w:tcPr>
-            <w:tcW w:type="dxa" w:w="879"/>
+            <w:tcW w:type="dxa" w:w="714"/>
           </w:tcPr>
           <w:p>
             <w:pPr>
@@ -3674,7 +3690,7 @@
         </w:tc>
         <w:tc>
           <w:tcPr>
-            <w:tcW w:type="dxa" w:w="879"/>
+            <w:tcW w:type="dxa" w:w="714"/>
           </w:tcPr>
           <w:p>
             <w:pPr>
@@ -3690,7 +3706,7 @@
         </w:tc>
         <w:tc>
           <w:tcPr>
-            <w:tcW w:type="dxa" w:w="879"/>
+            <w:tcW w:type="dxa" w:w="714"/>
           </w:tcPr>
           <w:p>
             <w:pPr>
@@ -3706,7 +3722,7 @@
         </w:tc>
         <w:tc>
           <w:tcPr>
-            <w:tcW w:type="dxa" w:w="879"/>
+            <w:tcW w:type="dxa" w:w="714"/>
           </w:tcPr>
           <w:p>
             <w:pPr>
@@ -3724,7 +3740,7 @@
       <w:tr>
         <w:tc>
           <w:tcPr>
-            <w:tcW w:type="dxa" w:w="1191"/>
+            <w:tcW w:type="dxa" w:w="968"/>
           </w:tcPr>
           <w:p>
             <w:pPr>
@@ -3740,7 +3756,7 @@
         </w:tc>
         <w:tc>
           <w:tcPr>
-            <w:tcW w:type="dxa" w:w="1134"/>
+            <w:tcW w:type="dxa" w:w="922"/>
           </w:tcPr>
           <w:p>
             <w:pPr>
@@ -3756,7 +3772,7 @@
         </w:tc>
         <w:tc>
           <w:tcPr>
-            <w:tcW w:type="dxa" w:w="879"/>
+            <w:tcW w:type="dxa" w:w="714"/>
           </w:tcPr>
           <w:p>
             <w:pPr>
@@ -3773,7 +3789,7 @@
         </w:tc>
         <w:tc>
           <w:tcPr>
-            <w:tcW w:type="dxa" w:w="879"/>
+            <w:tcW w:type="dxa" w:w="714"/>
           </w:tcPr>
           <w:p>
             <w:pPr>
@@ -3789,7 +3805,7 @@
         </w:tc>
         <w:tc>
           <w:tcPr>
-            <w:tcW w:type="dxa" w:w="879"/>
+            <w:tcW w:type="dxa" w:w="714"/>
           </w:tcPr>
           <w:p>
             <w:pPr>
@@ -3805,7 +3821,7 @@
         </w:tc>
         <w:tc>
           <w:tcPr>
-            <w:tcW w:type="dxa" w:w="879"/>
+            <w:tcW w:type="dxa" w:w="714"/>
           </w:tcPr>
           <w:p>
             <w:pPr>
@@ -3821,7 +3837,7 @@
         </w:tc>
         <w:tc>
           <w:tcPr>
-            <w:tcW w:type="dxa" w:w="879"/>
+            <w:tcW w:type="dxa" w:w="714"/>
           </w:tcPr>
           <w:p>
             <w:pPr>
@@ -3837,7 +3853,7 @@
         </w:tc>
         <w:tc>
           <w:tcPr>
-            <w:tcW w:type="dxa" w:w="879"/>
+            <w:tcW w:type="dxa" w:w="714"/>
           </w:tcPr>
           <w:p>
             <w:pPr>
@@ -3853,7 +3869,7 @@
         </w:tc>
         <w:tc>
           <w:tcPr>
-            <w:tcW w:type="dxa" w:w="879"/>
+            <w:tcW w:type="dxa" w:w="714"/>
           </w:tcPr>
           <w:p>
             <w:pPr>
@@ -3869,7 +3885,7 @@
         </w:tc>
         <w:tc>
           <w:tcPr>
-            <w:tcW w:type="dxa" w:w="879"/>
+            <w:tcW w:type="dxa" w:w="714"/>
           </w:tcPr>
           <w:p>
             <w:pPr>
@@ -3885,7 +3901,7 @@
         </w:tc>
         <w:tc>
           <w:tcPr>
-            <w:tcW w:type="dxa" w:w="879"/>
+            <w:tcW w:type="dxa" w:w="714"/>
           </w:tcPr>
           <w:p>
             <w:pPr>
@@ -3901,7 +3917,7 @@
         </w:tc>
         <w:tc>
           <w:tcPr>
-            <w:tcW w:type="dxa" w:w="879"/>
+            <w:tcW w:type="dxa" w:w="714"/>
           </w:tcPr>
           <w:p>
             <w:pPr>
@@ -3917,7 +3933,7 @@
         </w:tc>
         <w:tc>
           <w:tcPr>
-            <w:tcW w:type="dxa" w:w="879"/>
+            <w:tcW w:type="dxa" w:w="714"/>
           </w:tcPr>
           <w:p>
             <w:pPr>
@@ -3933,7 +3949,7 @@
         </w:tc>
         <w:tc>
           <w:tcPr>
-            <w:tcW w:type="dxa" w:w="879"/>
+            <w:tcW w:type="dxa" w:w="714"/>
           </w:tcPr>
           <w:p>
             <w:pPr>
@@ -3951,7 +3967,7 @@
       <w:tr>
         <w:tc>
           <w:tcPr>
-            <w:tcW w:type="dxa" w:w="1191"/>
+            <w:tcW w:type="dxa" w:w="968"/>
           </w:tcPr>
           <w:p>
             <w:pPr>
@@ -3967,7 +3983,7 @@
         </w:tc>
         <w:tc>
           <w:tcPr>
-            <w:tcW w:type="dxa" w:w="1134"/>
+            <w:tcW w:type="dxa" w:w="922"/>
           </w:tcPr>
           <w:p>
             <w:pPr>
@@ -3983,7 +3999,7 @@
         </w:tc>
         <w:tc>
           <w:tcPr>
-            <w:tcW w:type="dxa" w:w="879"/>
+            <w:tcW w:type="dxa" w:w="714"/>
           </w:tcPr>
           <w:p>
             <w:pPr>
@@ -4000,7 +4016,7 @@
         </w:tc>
         <w:tc>
           <w:tcPr>
-            <w:tcW w:type="dxa" w:w="879"/>
+            <w:tcW w:type="dxa" w:w="714"/>
           </w:tcPr>
           <w:p>
             <w:pPr>
@@ -4016,7 +4032,7 @@
         </w:tc>
         <w:tc>
           <w:tcPr>
-            <w:tcW w:type="dxa" w:w="879"/>
+            <w:tcW w:type="dxa" w:w="714"/>
           </w:tcPr>
           <w:p>
             <w:pPr>
@@ -4032,7 +4048,7 @@
         </w:tc>
         <w:tc>
           <w:tcPr>
-            <w:tcW w:type="dxa" w:w="879"/>
+            <w:tcW w:type="dxa" w:w="714"/>
           </w:tcPr>
           <w:p>
             <w:pPr>
@@ -4048,7 +4064,7 @@
         </w:tc>
         <w:tc>
           <w:tcPr>
-            <w:tcW w:type="dxa" w:w="879"/>
+            <w:tcW w:type="dxa" w:w="714"/>
           </w:tcPr>
           <w:p>
             <w:pPr>
@@ -4064,7 +4080,7 @@
         </w:tc>
         <w:tc>
           <w:tcPr>
-            <w:tcW w:type="dxa" w:w="879"/>
+            <w:tcW w:type="dxa" w:w="714"/>
           </w:tcPr>
           <w:p>
             <w:pPr>
@@ -4080,7 +4096,7 @@
         </w:tc>
         <w:tc>
           <w:tcPr>
-            <w:tcW w:type="dxa" w:w="879"/>
+            <w:tcW w:type="dxa" w:w="714"/>
           </w:tcPr>
           <w:p>
             <w:pPr>
@@ -4096,7 +4112,7 @@
         </w:tc>
         <w:tc>
           <w:tcPr>
-            <w:tcW w:type="dxa" w:w="879"/>
+            <w:tcW w:type="dxa" w:w="714"/>
           </w:tcPr>
           <w:p>
             <w:pPr>
@@ -4112,7 +4128,7 @@
         </w:tc>
         <w:tc>
           <w:tcPr>
-            <w:tcW w:type="dxa" w:w="879"/>
+            <w:tcW w:type="dxa" w:w="714"/>
           </w:tcPr>
           <w:p>
             <w:pPr>
@@ -4128,7 +4144,7 @@
         </w:tc>
         <w:tc>
           <w:tcPr>
-            <w:tcW w:type="dxa" w:w="879"/>
+            <w:tcW w:type="dxa" w:w="714"/>
           </w:tcPr>
           <w:p>
             <w:pPr>
@@ -4144,7 +4160,7 @@
         </w:tc>
         <w:tc>
           <w:tcPr>
-            <w:tcW w:type="dxa" w:w="879"/>
+            <w:tcW w:type="dxa" w:w="714"/>
           </w:tcPr>
           <w:p>
             <w:pPr>
@@ -4160,7 +4176,7 @@
         </w:tc>
         <w:tc>
           <w:tcPr>
-            <w:tcW w:type="dxa" w:w="879"/>
+            <w:tcW w:type="dxa" w:w="714"/>
           </w:tcPr>
           <w:p>
             <w:pPr>
@@ -4266,7 +4282,11 @@
     <w:tbl>
       <w:tblPr>
         <w:tblStyle w:val="MDPItable"/>
+        <w:tblW w:w="10466" w:type="dxa"/>
+        <w:jc w:val="left"/>
+        <w:tblInd w:w="0" w:type="dxa"/>
         <w:tblW w:type="auto" w:w="0"/>
+        <w:tblLayout w:type="fixed"/>
         <w:tblLook w:firstColumn="1" w:firstRow="1" w:lastColumn="0" w:lastRow="0" w:noHBand="0" w:noVBand="1" w:val="04A0"/>
         <w:tblBorders>
           <w:top w:val="single" w:sz="4" w:color="9AA5B1"/>
@@ -4290,7 +4310,7 @@
       <w:tr>
         <w:tc>
           <w:tcPr>
-            <w:tcW w:type="dxa" w:w="1304"/>
+            <w:tcW w:type="dxa" w:w="1399"/>
             <w:shd w:fill="EDF2F7"/>
           </w:tcPr>
           <w:p>
@@ -4308,7 +4328,7 @@
         </w:tc>
         <w:tc>
           <w:tcPr>
-            <w:tcW w:type="dxa" w:w="1077"/>
+            <w:tcW w:type="dxa" w:w="1156"/>
             <w:shd w:fill="EDF2F7"/>
           </w:tcPr>
           <w:p>
@@ -4326,7 +4346,7 @@
         </w:tc>
         <w:tc>
           <w:tcPr>
-            <w:tcW w:type="dxa" w:w="1304"/>
+            <w:tcW w:type="dxa" w:w="1399"/>
             <w:shd w:fill="EDF2F7"/>
           </w:tcPr>
           <w:p>
@@ -4344,7 +4364,7 @@
         </w:tc>
         <w:tc>
           <w:tcPr>
-            <w:tcW w:type="dxa" w:w="1191"/>
+            <w:tcW w:type="dxa" w:w="1277"/>
             <w:shd w:fill="EDF2F7"/>
           </w:tcPr>
           <w:p>
@@ -4362,7 +4382,7 @@
         </w:tc>
         <w:tc>
           <w:tcPr>
-            <w:tcW w:type="dxa" w:w="1191"/>
+            <w:tcW w:type="dxa" w:w="1277"/>
             <w:shd w:fill="EDF2F7"/>
           </w:tcPr>
           <w:p>
@@ -4380,7 +4400,7 @@
         </w:tc>
         <w:tc>
           <w:tcPr>
-            <w:tcW w:type="dxa" w:w="1304"/>
+            <w:tcW w:type="dxa" w:w="1399"/>
             <w:shd w:fill="EDF2F7"/>
           </w:tcPr>
           <w:p>
@@ -4398,7 +4418,7 @@
         </w:tc>
         <w:tc>
           <w:tcPr>
-            <w:tcW w:type="dxa" w:w="1191"/>
+            <w:tcW w:type="dxa" w:w="1277"/>
             <w:shd w:fill="EDF2F7"/>
           </w:tcPr>
           <w:p>
@@ -4416,7 +4436,7 @@
         </w:tc>
         <w:tc>
           <w:tcPr>
-            <w:tcW w:type="dxa" w:w="1191"/>
+            <w:tcW w:type="dxa" w:w="1277"/>
             <w:shd w:fill="EDF2F7"/>
           </w:tcPr>
           <w:p>
@@ -4436,7 +4456,7 @@
       <w:tr>
         <w:tc>
           <w:tcPr>
-            <w:tcW w:type="dxa" w:w="1304"/>
+            <w:tcW w:type="dxa" w:w="1399"/>
           </w:tcPr>
           <w:p>
             <w:pPr>
@@ -4452,7 +4472,7 @@
         </w:tc>
         <w:tc>
           <w:tcPr>
-            <w:tcW w:type="dxa" w:w="1077"/>
+            <w:tcW w:type="dxa" w:w="1156"/>
           </w:tcPr>
           <w:p>
             <w:pPr>
@@ -4468,7 +4488,7 @@
         </w:tc>
         <w:tc>
           <w:tcPr>
-            <w:tcW w:type="dxa" w:w="1304"/>
+            <w:tcW w:type="dxa" w:w="1399"/>
           </w:tcPr>
           <w:p>
             <w:pPr>
@@ -4484,7 +4504,7 @@
         </w:tc>
         <w:tc>
           <w:tcPr>
-            <w:tcW w:type="dxa" w:w="1191"/>
+            <w:tcW w:type="dxa" w:w="1277"/>
           </w:tcPr>
           <w:p>
             <w:pPr>
@@ -4500,7 +4520,7 @@
         </w:tc>
         <w:tc>
           <w:tcPr>
-            <w:tcW w:type="dxa" w:w="1191"/>
+            <w:tcW w:type="dxa" w:w="1277"/>
           </w:tcPr>
           <w:p>
             <w:pPr>
@@ -4516,7 +4536,7 @@
         </w:tc>
         <w:tc>
           <w:tcPr>
-            <w:tcW w:type="dxa" w:w="1304"/>
+            <w:tcW w:type="dxa" w:w="1399"/>
           </w:tcPr>
           <w:p>
             <w:pPr>
@@ -4532,7 +4552,7 @@
         </w:tc>
         <w:tc>
           <w:tcPr>
-            <w:tcW w:type="dxa" w:w="1191"/>
+            <w:tcW w:type="dxa" w:w="1277"/>
           </w:tcPr>
           <w:p>
             <w:pPr>
@@ -4548,7 +4568,7 @@
         </w:tc>
         <w:tc>
           <w:tcPr>
-            <w:tcW w:type="dxa" w:w="1191"/>
+            <w:tcW w:type="dxa" w:w="1277"/>
           </w:tcPr>
           <w:p>
             <w:pPr>
@@ -4566,7 +4586,7 @@
       <w:tr>
         <w:tc>
           <w:tcPr>
-            <w:tcW w:type="dxa" w:w="1304"/>
+            <w:tcW w:type="dxa" w:w="1399"/>
           </w:tcPr>
           <w:p>
             <w:pPr>
@@ -4582,7 +4602,7 @@
         </w:tc>
         <w:tc>
           <w:tcPr>
-            <w:tcW w:type="dxa" w:w="1077"/>
+            <w:tcW w:type="dxa" w:w="1156"/>
           </w:tcPr>
           <w:p>
             <w:pPr>
@@ -4598,7 +4618,7 @@
         </w:tc>
         <w:tc>
           <w:tcPr>
-            <w:tcW w:type="dxa" w:w="1304"/>
+            <w:tcW w:type="dxa" w:w="1399"/>
           </w:tcPr>
           <w:p>
             <w:pPr>
@@ -4614,7 +4634,7 @@
         </w:tc>
         <w:tc>
           <w:tcPr>
-            <w:tcW w:type="dxa" w:w="1191"/>
+            <w:tcW w:type="dxa" w:w="1277"/>
           </w:tcPr>
           <w:p>
             <w:pPr>
@@ -4630,7 +4650,7 @@
         </w:tc>
         <w:tc>
           <w:tcPr>
-            <w:tcW w:type="dxa" w:w="1191"/>
+            <w:tcW w:type="dxa" w:w="1277"/>
           </w:tcPr>
           <w:p>
             <w:pPr>
@@ -4646,7 +4666,7 @@
         </w:tc>
         <w:tc>
           <w:tcPr>
-            <w:tcW w:type="dxa" w:w="1304"/>
+            <w:tcW w:type="dxa" w:w="1399"/>
           </w:tcPr>
           <w:p>
             <w:pPr>
@@ -4662,7 +4682,7 @@
         </w:tc>
         <w:tc>
           <w:tcPr>
-            <w:tcW w:type="dxa" w:w="1191"/>
+            <w:tcW w:type="dxa" w:w="1277"/>
           </w:tcPr>
           <w:p>
             <w:pPr>
@@ -4678,7 +4698,7 @@
         </w:tc>
         <w:tc>
           <w:tcPr>
-            <w:tcW w:type="dxa" w:w="1191"/>
+            <w:tcW w:type="dxa" w:w="1277"/>
           </w:tcPr>
           <w:p>
             <w:pPr>
@@ -4696,7 +4716,7 @@
       <w:tr>
         <w:tc>
           <w:tcPr>
-            <w:tcW w:type="dxa" w:w="1304"/>
+            <w:tcW w:type="dxa" w:w="1399"/>
           </w:tcPr>
           <w:p>
             <w:pPr>
@@ -4712,7 +4732,7 @@
         </w:tc>
         <w:tc>
           <w:tcPr>
-            <w:tcW w:type="dxa" w:w="1077"/>
+            <w:tcW w:type="dxa" w:w="1156"/>
           </w:tcPr>
           <w:p>
             <w:pPr>
@@ -4728,7 +4748,7 @@
         </w:tc>
         <w:tc>
           <w:tcPr>
-            <w:tcW w:type="dxa" w:w="1304"/>
+            <w:tcW w:type="dxa" w:w="1399"/>
           </w:tcPr>
           <w:p>
             <w:pPr>
@@ -4744,7 +4764,7 @@
         </w:tc>
         <w:tc>
           <w:tcPr>
-            <w:tcW w:type="dxa" w:w="1191"/>
+            <w:tcW w:type="dxa" w:w="1277"/>
           </w:tcPr>
           <w:p>
             <w:pPr>
@@ -4760,7 +4780,7 @@
         </w:tc>
         <w:tc>
           <w:tcPr>
-            <w:tcW w:type="dxa" w:w="1191"/>
+            <w:tcW w:type="dxa" w:w="1277"/>
           </w:tcPr>
           <w:p>
             <w:pPr>
@@ -4776,7 +4796,7 @@
         </w:tc>
         <w:tc>
           <w:tcPr>
-            <w:tcW w:type="dxa" w:w="1304"/>
+            <w:tcW w:type="dxa" w:w="1399"/>
           </w:tcPr>
           <w:p>
             <w:pPr>
@@ -4792,7 +4812,7 @@
         </w:tc>
         <w:tc>
           <w:tcPr>
-            <w:tcW w:type="dxa" w:w="1191"/>
+            <w:tcW w:type="dxa" w:w="1277"/>
           </w:tcPr>
           <w:p>
             <w:pPr>
@@ -4808,7 +4828,7 @@
         </w:tc>
         <w:tc>
           <w:tcPr>
-            <w:tcW w:type="dxa" w:w="1191"/>
+            <w:tcW w:type="dxa" w:w="1277"/>
           </w:tcPr>
           <w:p>
             <w:pPr>
@@ -4826,7 +4846,7 @@
       <w:tr>
         <w:tc>
           <w:tcPr>
-            <w:tcW w:type="dxa" w:w="1304"/>
+            <w:tcW w:type="dxa" w:w="1399"/>
           </w:tcPr>
           <w:p>
             <w:pPr>
@@ -4842,7 +4862,7 @@
         </w:tc>
         <w:tc>
           <w:tcPr>
-            <w:tcW w:type="dxa" w:w="1077"/>
+            <w:tcW w:type="dxa" w:w="1156"/>
           </w:tcPr>
           <w:p>
             <w:pPr>
@@ -4858,7 +4878,7 @@
         </w:tc>
         <w:tc>
           <w:tcPr>
-            <w:tcW w:type="dxa" w:w="1304"/>
+            <w:tcW w:type="dxa" w:w="1399"/>
           </w:tcPr>
           <w:p>
             <w:pPr>
@@ -4874,7 +4894,7 @@
         </w:tc>
         <w:tc>
           <w:tcPr>
-            <w:tcW w:type="dxa" w:w="1191"/>
+            <w:tcW w:type="dxa" w:w="1277"/>
           </w:tcPr>
           <w:p>
             <w:pPr>
@@ -4890,7 +4910,7 @@
         </w:tc>
         <w:tc>
           <w:tcPr>
-            <w:tcW w:type="dxa" w:w="1191"/>
+            <w:tcW w:type="dxa" w:w="1277"/>
           </w:tcPr>
           <w:p>
             <w:pPr>
@@ -4906,7 +4926,7 @@
         </w:tc>
         <w:tc>
           <w:tcPr>
-            <w:tcW w:type="dxa" w:w="1304"/>
+            <w:tcW w:type="dxa" w:w="1399"/>
           </w:tcPr>
           <w:p>
             <w:pPr>
@@ -4922,7 +4942,7 @@
         </w:tc>
         <w:tc>
           <w:tcPr>
-            <w:tcW w:type="dxa" w:w="1191"/>
+            <w:tcW w:type="dxa" w:w="1277"/>
           </w:tcPr>
           <w:p>
             <w:pPr>
@@ -4938,7 +4958,7 @@
         </w:tc>
         <w:tc>
           <w:tcPr>
-            <w:tcW w:type="dxa" w:w="1191"/>
+            <w:tcW w:type="dxa" w:w="1277"/>
           </w:tcPr>
           <w:p>
             <w:pPr>
@@ -4956,7 +4976,7 @@
       <w:tr>
         <w:tc>
           <w:tcPr>
-            <w:tcW w:type="dxa" w:w="1304"/>
+            <w:tcW w:type="dxa" w:w="1399"/>
           </w:tcPr>
           <w:p>
             <w:pPr>
@@ -4972,7 +4992,7 @@
         </w:tc>
         <w:tc>
           <w:tcPr>
-            <w:tcW w:type="dxa" w:w="1077"/>
+            <w:tcW w:type="dxa" w:w="1156"/>
           </w:tcPr>
           <w:p>
             <w:pPr>
@@ -4988,7 +5008,7 @@
         </w:tc>
         <w:tc>
           <w:tcPr>
-            <w:tcW w:type="dxa" w:w="1304"/>
+            <w:tcW w:type="dxa" w:w="1399"/>
           </w:tcPr>
           <w:p>
             <w:pPr>
@@ -5004,7 +5024,7 @@
         </w:tc>
         <w:tc>
           <w:tcPr>
-            <w:tcW w:type="dxa" w:w="1191"/>
+            <w:tcW w:type="dxa" w:w="1277"/>
           </w:tcPr>
           <w:p>
             <w:pPr>
@@ -5020,7 +5040,7 @@
         </w:tc>
         <w:tc>
           <w:tcPr>
-            <w:tcW w:type="dxa" w:w="1191"/>
+            <w:tcW w:type="dxa" w:w="1277"/>
           </w:tcPr>
           <w:p>
             <w:pPr>
@@ -5036,7 +5056,7 @@
         </w:tc>
         <w:tc>
           <w:tcPr>
-            <w:tcW w:type="dxa" w:w="1304"/>
+            <w:tcW w:type="dxa" w:w="1399"/>
           </w:tcPr>
           <w:p>
             <w:pPr>
@@ -5052,7 +5072,7 @@
         </w:tc>
         <w:tc>
           <w:tcPr>
-            <w:tcW w:type="dxa" w:w="1191"/>
+            <w:tcW w:type="dxa" w:w="1277"/>
           </w:tcPr>
           <w:p>
             <w:pPr>
@@ -5068,7 +5088,7 @@
         </w:tc>
         <w:tc>
           <w:tcPr>
-            <w:tcW w:type="dxa" w:w="1191"/>
+            <w:tcW w:type="dxa" w:w="1277"/>
           </w:tcPr>
           <w:p>
             <w:pPr>
@@ -5086,7 +5106,7 @@
       <w:tr>
         <w:tc>
           <w:tcPr>
-            <w:tcW w:type="dxa" w:w="1304"/>
+            <w:tcW w:type="dxa" w:w="1399"/>
           </w:tcPr>
           <w:p>
             <w:pPr>
@@ -5102,7 +5122,7 @@
         </w:tc>
         <w:tc>
           <w:tcPr>
-            <w:tcW w:type="dxa" w:w="1077"/>
+            <w:tcW w:type="dxa" w:w="1156"/>
           </w:tcPr>
           <w:p>
             <w:pPr>
@@ -5118,7 +5138,7 @@
         </w:tc>
         <w:tc>
           <w:tcPr>
-            <w:tcW w:type="dxa" w:w="1304"/>
+            <w:tcW w:type="dxa" w:w="1399"/>
           </w:tcPr>
           <w:p>
             <w:pPr>
@@ -5134,7 +5154,7 @@
         </w:tc>
         <w:tc>
           <w:tcPr>
-            <w:tcW w:type="dxa" w:w="1191"/>
+            <w:tcW w:type="dxa" w:w="1277"/>
           </w:tcPr>
           <w:p>
             <w:pPr>
@@ -5150,7 +5170,7 @@
         </w:tc>
         <w:tc>
           <w:tcPr>
-            <w:tcW w:type="dxa" w:w="1191"/>
+            <w:tcW w:type="dxa" w:w="1277"/>
           </w:tcPr>
           <w:p>
             <w:pPr>
@@ -5166,7 +5186,7 @@
         </w:tc>
         <w:tc>
           <w:tcPr>
-            <w:tcW w:type="dxa" w:w="1304"/>
+            <w:tcW w:type="dxa" w:w="1399"/>
           </w:tcPr>
           <w:p>
             <w:pPr>
@@ -5182,7 +5202,7 @@
         </w:tc>
         <w:tc>
           <w:tcPr>
-            <w:tcW w:type="dxa" w:w="1191"/>
+            <w:tcW w:type="dxa" w:w="1277"/>
           </w:tcPr>
           <w:p>
             <w:pPr>
@@ -5198,7 +5218,7 @@
         </w:tc>
         <w:tc>
           <w:tcPr>
-            <w:tcW w:type="dxa" w:w="1191"/>
+            <w:tcW w:type="dxa" w:w="1277"/>
           </w:tcPr>
           <w:p>
             <w:pPr>
@@ -5216,7 +5236,7 @@
       <w:tr>
         <w:tc>
           <w:tcPr>
-            <w:tcW w:type="dxa" w:w="1304"/>
+            <w:tcW w:type="dxa" w:w="1399"/>
           </w:tcPr>
           <w:p>
             <w:pPr>
@@ -5232,7 +5252,7 @@
         </w:tc>
         <w:tc>
           <w:tcPr>
-            <w:tcW w:type="dxa" w:w="1077"/>
+            <w:tcW w:type="dxa" w:w="1156"/>
           </w:tcPr>
           <w:p>
             <w:pPr>
@@ -5248,7 +5268,7 @@
         </w:tc>
         <w:tc>
           <w:tcPr>
-            <w:tcW w:type="dxa" w:w="1304"/>
+            <w:tcW w:type="dxa" w:w="1399"/>
           </w:tcPr>
           <w:p>
             <w:pPr>
@@ -5264,7 +5284,7 @@
         </w:tc>
         <w:tc>
           <w:tcPr>
-            <w:tcW w:type="dxa" w:w="1191"/>
+            <w:tcW w:type="dxa" w:w="1277"/>
           </w:tcPr>
           <w:p>
             <w:pPr>
@@ -5280,7 +5300,7 @@
         </w:tc>
         <w:tc>
           <w:tcPr>
-            <w:tcW w:type="dxa" w:w="1191"/>
+            <w:tcW w:type="dxa" w:w="1277"/>
           </w:tcPr>
           <w:p>
             <w:pPr>
@@ -5296,7 +5316,7 @@
         </w:tc>
         <w:tc>
           <w:tcPr>
-            <w:tcW w:type="dxa" w:w="1304"/>
+            <w:tcW w:type="dxa" w:w="1399"/>
           </w:tcPr>
           <w:p>
             <w:pPr>
@@ -5312,7 +5332,7 @@
         </w:tc>
         <w:tc>
           <w:tcPr>
-            <w:tcW w:type="dxa" w:w="1191"/>
+            <w:tcW w:type="dxa" w:w="1277"/>
           </w:tcPr>
           <w:p>
             <w:pPr>
@@ -5328,7 +5348,7 @@
         </w:tc>
         <w:tc>
           <w:tcPr>
-            <w:tcW w:type="dxa" w:w="1191"/>
+            <w:tcW w:type="dxa" w:w="1277"/>
           </w:tcPr>
           <w:p>
             <w:pPr>
@@ -5346,7 +5366,7 @@
       <w:tr>
         <w:tc>
           <w:tcPr>
-            <w:tcW w:type="dxa" w:w="1304"/>
+            <w:tcW w:type="dxa" w:w="1399"/>
           </w:tcPr>
           <w:p>
             <w:pPr>
@@ -5362,7 +5382,7 @@
         </w:tc>
         <w:tc>
           <w:tcPr>
-            <w:tcW w:type="dxa" w:w="1077"/>
+            <w:tcW w:type="dxa" w:w="1156"/>
           </w:tcPr>
           <w:p>
             <w:pPr>
@@ -5378,7 +5398,7 @@
         </w:tc>
         <w:tc>
           <w:tcPr>
-            <w:tcW w:type="dxa" w:w="1304"/>
+            <w:tcW w:type="dxa" w:w="1399"/>
           </w:tcPr>
           <w:p>
             <w:pPr>
@@ -5394,7 +5414,7 @@
         </w:tc>
         <w:tc>
           <w:tcPr>
-            <w:tcW w:type="dxa" w:w="1191"/>
+            <w:tcW w:type="dxa" w:w="1277"/>
           </w:tcPr>
           <w:p>
             <w:pPr>
@@ -5410,7 +5430,7 @@
         </w:tc>
         <w:tc>
           <w:tcPr>
-            <w:tcW w:type="dxa" w:w="1191"/>
+            <w:tcW w:type="dxa" w:w="1277"/>
           </w:tcPr>
           <w:p>
             <w:pPr>
@@ -5426,7 +5446,7 @@
         </w:tc>
         <w:tc>
           <w:tcPr>
-            <w:tcW w:type="dxa" w:w="1304"/>
+            <w:tcW w:type="dxa" w:w="1399"/>
           </w:tcPr>
           <w:p>
             <w:pPr>
@@ -5442,7 +5462,7 @@
         </w:tc>
         <w:tc>
           <w:tcPr>
-            <w:tcW w:type="dxa" w:w="1191"/>
+            <w:tcW w:type="dxa" w:w="1277"/>
           </w:tcPr>
           <w:p>
             <w:pPr>
@@ -5458,7 +5478,7 @@
         </w:tc>
         <w:tc>
           <w:tcPr>
-            <w:tcW w:type="dxa" w:w="1191"/>
+            <w:tcW w:type="dxa" w:w="1277"/>
           </w:tcPr>
           <w:p>
             <w:pPr>
@@ -5476,7 +5496,7 @@
       <w:tr>
         <w:tc>
           <w:tcPr>
-            <w:tcW w:type="dxa" w:w="1304"/>
+            <w:tcW w:type="dxa" w:w="1399"/>
           </w:tcPr>
           <w:p>
             <w:pPr>
@@ -5492,7 +5512,7 @@
         </w:tc>
         <w:tc>
           <w:tcPr>
-            <w:tcW w:type="dxa" w:w="1077"/>
+            <w:tcW w:type="dxa" w:w="1156"/>
           </w:tcPr>
           <w:p>
             <w:pPr>
@@ -5508,7 +5528,7 @@
         </w:tc>
         <w:tc>
           <w:tcPr>
-            <w:tcW w:type="dxa" w:w="1304"/>
+            <w:tcW w:type="dxa" w:w="1399"/>
           </w:tcPr>
           <w:p>
             <w:pPr>
@@ -5524,7 +5544,7 @@
         </w:tc>
         <w:tc>
           <w:tcPr>
-            <w:tcW w:type="dxa" w:w="1191"/>
+            <w:tcW w:type="dxa" w:w="1277"/>
           </w:tcPr>
           <w:p>
             <w:pPr>
@@ -5540,7 +5560,7 @@
         </w:tc>
         <w:tc>
           <w:tcPr>
-            <w:tcW w:type="dxa" w:w="1191"/>
+            <w:tcW w:type="dxa" w:w="1277"/>
           </w:tcPr>
           <w:p>
             <w:pPr>
@@ -5556,7 +5576,7 @@
         </w:tc>
         <w:tc>
           <w:tcPr>
-            <w:tcW w:type="dxa" w:w="1304"/>
+            <w:tcW w:type="dxa" w:w="1399"/>
           </w:tcPr>
           <w:p>
             <w:pPr>
@@ -5572,7 +5592,7 @@
         </w:tc>
         <w:tc>
           <w:tcPr>
-            <w:tcW w:type="dxa" w:w="1191"/>
+            <w:tcW w:type="dxa" w:w="1277"/>
           </w:tcPr>
           <w:p>
             <w:pPr>
@@ -5588,7 +5608,7 @@
         </w:tc>
         <w:tc>
           <w:tcPr>
-            <w:tcW w:type="dxa" w:w="1191"/>
+            <w:tcW w:type="dxa" w:w="1277"/>
           </w:tcPr>
           <w:p>
             <w:pPr>
@@ -5638,7 +5658,11 @@
     <w:tbl>
       <w:tblPr>
         <w:tblStyle w:val="MDPItable"/>
+        <w:tblW w:w="10466" w:type="dxa"/>
+        <w:jc w:val="left"/>
+        <w:tblInd w:w="0" w:type="dxa"/>
         <w:tblW w:type="auto" w:w="0"/>
+        <w:tblLayout w:type="fixed"/>
         <w:tblLook w:firstColumn="1" w:firstRow="1" w:lastColumn="0" w:lastRow="0" w:noHBand="0" w:noVBand="1" w:val="04A0"/>
         <w:tblBorders>
           <w:top w:val="single" w:sz="4" w:color="9AA5B1"/>
@@ -5661,7 +5685,7 @@
       <w:tr>
         <w:tc>
           <w:tcPr>
-            <w:tcW w:type="dxa" w:w="1361"/>
+            <w:tcW w:type="dxa" w:w="1641"/>
             <w:shd w:fill="EDF2F7"/>
           </w:tcPr>
           <w:p>
@@ -5679,7 +5703,7 @@
         </w:tc>
         <w:tc>
           <w:tcPr>
-            <w:tcW w:type="dxa" w:w="1077"/>
+            <w:tcW w:type="dxa" w:w="1299"/>
             <w:shd w:fill="EDF2F7"/>
           </w:tcPr>
           <w:p>
@@ -5697,7 +5721,7 @@
         </w:tc>
         <w:tc>
           <w:tcPr>
-            <w:tcW w:type="dxa" w:w="1247"/>
+            <w:tcW w:type="dxa" w:w="1504"/>
             <w:shd w:fill="EDF2F7"/>
           </w:tcPr>
           <w:p>
@@ -5715,7 +5739,7 @@
         </w:tc>
         <w:tc>
           <w:tcPr>
-            <w:tcW w:type="dxa" w:w="1247"/>
+            <w:tcW w:type="dxa" w:w="1504"/>
             <w:shd w:fill="EDF2F7"/>
           </w:tcPr>
           <w:p>
@@ -5733,7 +5757,7 @@
         </w:tc>
         <w:tc>
           <w:tcPr>
-            <w:tcW w:type="dxa" w:w="1247"/>
+            <w:tcW w:type="dxa" w:w="1504"/>
             <w:shd w:fill="EDF2F7"/>
           </w:tcPr>
           <w:p>
@@ -5751,7 +5775,7 @@
         </w:tc>
         <w:tc>
           <w:tcPr>
-            <w:tcW w:type="dxa" w:w="1247"/>
+            <w:tcW w:type="dxa" w:w="1504"/>
             <w:shd w:fill="EDF2F7"/>
           </w:tcPr>
           <w:p>
@@ -5769,7 +5793,7 @@
         </w:tc>
         <w:tc>
           <w:tcPr>
-            <w:tcW w:type="dxa" w:w="1247"/>
+            <w:tcW w:type="dxa" w:w="1504"/>
             <w:shd w:fill="EDF2F7"/>
           </w:tcPr>
           <w:p>
@@ -5789,7 +5813,7 @@
       <w:tr>
         <w:tc>
           <w:tcPr>
-            <w:tcW w:type="dxa" w:w="1361"/>
+            <w:tcW w:type="dxa" w:w="1641"/>
           </w:tcPr>
           <w:p>
             <w:pPr>
@@ -5805,7 +5829,7 @@
         </w:tc>
         <w:tc>
           <w:tcPr>
-            <w:tcW w:type="dxa" w:w="1077"/>
+            <w:tcW w:type="dxa" w:w="1299"/>
           </w:tcPr>
           <w:p>
             <w:pPr>
@@ -5821,7 +5845,7 @@
         </w:tc>
         <w:tc>
           <w:tcPr>
-            <w:tcW w:type="dxa" w:w="1247"/>
+            <w:tcW w:type="dxa" w:w="1504"/>
           </w:tcPr>
           <w:p>
             <w:pPr>
@@ -5837,7 +5861,7 @@
         </w:tc>
         <w:tc>
           <w:tcPr>
-            <w:tcW w:type="dxa" w:w="1247"/>
+            <w:tcW w:type="dxa" w:w="1504"/>
           </w:tcPr>
           <w:p>
             <w:pPr>
@@ -5853,7 +5877,7 @@
         </w:tc>
         <w:tc>
           <w:tcPr>
-            <w:tcW w:type="dxa" w:w="1247"/>
+            <w:tcW w:type="dxa" w:w="1504"/>
           </w:tcPr>
           <w:p>
             <w:pPr>
@@ -5869,7 +5893,7 @@
         </w:tc>
         <w:tc>
           <w:tcPr>
-            <w:tcW w:type="dxa" w:w="1247"/>
+            <w:tcW w:type="dxa" w:w="1504"/>
           </w:tcPr>
           <w:p>
             <w:pPr>
@@ -5885,7 +5909,7 @@
         </w:tc>
         <w:tc>
           <w:tcPr>
-            <w:tcW w:type="dxa" w:w="1247"/>
+            <w:tcW w:type="dxa" w:w="1504"/>
           </w:tcPr>
           <w:p>
             <w:pPr>
@@ -5903,7 +5927,7 @@
       <w:tr>
         <w:tc>
           <w:tcPr>
-            <w:tcW w:type="dxa" w:w="1361"/>
+            <w:tcW w:type="dxa" w:w="1641"/>
           </w:tcPr>
           <w:p>
             <w:pPr>
@@ -5919,7 +5943,7 @@
         </w:tc>
         <w:tc>
           <w:tcPr>
-            <w:tcW w:type="dxa" w:w="1077"/>
+            <w:tcW w:type="dxa" w:w="1299"/>
           </w:tcPr>
           <w:p>
             <w:pPr>
@@ -5935,7 +5959,7 @@
         </w:tc>
         <w:tc>
           <w:tcPr>
-            <w:tcW w:type="dxa" w:w="1247"/>
+            <w:tcW w:type="dxa" w:w="1504"/>
           </w:tcPr>
           <w:p>
             <w:pPr>
@@ -5951,7 +5975,7 @@
         </w:tc>
         <w:tc>
           <w:tcPr>
-            <w:tcW w:type="dxa" w:w="1247"/>
+            <w:tcW w:type="dxa" w:w="1504"/>
           </w:tcPr>
           <w:p>
             <w:pPr>
@@ -5967,7 +5991,7 @@
         </w:tc>
         <w:tc>
           <w:tcPr>
-            <w:tcW w:type="dxa" w:w="1247"/>
+            <w:tcW w:type="dxa" w:w="1504"/>
           </w:tcPr>
           <w:p>
             <w:pPr>
@@ -5983,7 +6007,7 @@
         </w:tc>
         <w:tc>
           <w:tcPr>
-            <w:tcW w:type="dxa" w:w="1247"/>
+            <w:tcW w:type="dxa" w:w="1504"/>
           </w:tcPr>
           <w:p>
             <w:pPr>
@@ -5999,7 +6023,7 @@
         </w:tc>
         <w:tc>
           <w:tcPr>
-            <w:tcW w:type="dxa" w:w="1247"/>
+            <w:tcW w:type="dxa" w:w="1504"/>
           </w:tcPr>
           <w:p>
             <w:pPr>
@@ -6017,7 +6041,7 @@
       <w:tr>
         <w:tc>
           <w:tcPr>
-            <w:tcW w:type="dxa" w:w="1361"/>
+            <w:tcW w:type="dxa" w:w="1641"/>
           </w:tcPr>
           <w:p>
             <w:pPr>
@@ -6033,7 +6057,7 @@
         </w:tc>
         <w:tc>
           <w:tcPr>
-            <w:tcW w:type="dxa" w:w="1077"/>
+            <w:tcW w:type="dxa" w:w="1299"/>
           </w:tcPr>
           <w:p>
             <w:pPr>
@@ -6049,7 +6073,7 @@
         </w:tc>
         <w:tc>
           <w:tcPr>
-            <w:tcW w:type="dxa" w:w="1247"/>
+            <w:tcW w:type="dxa" w:w="1504"/>
           </w:tcPr>
           <w:p>
             <w:pPr>
@@ -6065,7 +6089,7 @@
         </w:tc>
         <w:tc>
           <w:tcPr>
-            <w:tcW w:type="dxa" w:w="1247"/>
+            <w:tcW w:type="dxa" w:w="1504"/>
           </w:tcPr>
           <w:p>
             <w:pPr>
@@ -6081,7 +6105,7 @@
         </w:tc>
         <w:tc>
           <w:tcPr>
-            <w:tcW w:type="dxa" w:w="1247"/>
+            <w:tcW w:type="dxa" w:w="1504"/>
           </w:tcPr>
           <w:p>
             <w:pPr>
@@ -6097,7 +6121,7 @@
         </w:tc>
         <w:tc>
           <w:tcPr>
-            <w:tcW w:type="dxa" w:w="1247"/>
+            <w:tcW w:type="dxa" w:w="1504"/>
           </w:tcPr>
           <w:p>
             <w:pPr>
@@ -6113,7 +6137,7 @@
         </w:tc>
         <w:tc>
           <w:tcPr>
-            <w:tcW w:type="dxa" w:w="1247"/>
+            <w:tcW w:type="dxa" w:w="1504"/>
           </w:tcPr>
           <w:p>
             <w:pPr>
@@ -6131,7 +6155,7 @@
       <w:tr>
         <w:tc>
           <w:tcPr>
-            <w:tcW w:type="dxa" w:w="1361"/>
+            <w:tcW w:type="dxa" w:w="1641"/>
           </w:tcPr>
           <w:p>
             <w:pPr>
@@ -6147,7 +6171,7 @@
         </w:tc>
         <w:tc>
           <w:tcPr>
-            <w:tcW w:type="dxa" w:w="1077"/>
+            <w:tcW w:type="dxa" w:w="1299"/>
           </w:tcPr>
           <w:p>
             <w:pPr>
@@ -6163,7 +6187,7 @@
         </w:tc>
         <w:tc>
           <w:tcPr>
-            <w:tcW w:type="dxa" w:w="1247"/>
+            <w:tcW w:type="dxa" w:w="1504"/>
           </w:tcPr>
           <w:p>
             <w:pPr>
@@ -6179,7 +6203,7 @@
         </w:tc>
         <w:tc>
           <w:tcPr>
-            <w:tcW w:type="dxa" w:w="1247"/>
+            <w:tcW w:type="dxa" w:w="1504"/>
           </w:tcPr>
           <w:p>
             <w:pPr>
@@ -6195,7 +6219,7 @@
         </w:tc>
         <w:tc>
           <w:tcPr>
-            <w:tcW w:type="dxa" w:w="1247"/>
+            <w:tcW w:type="dxa" w:w="1504"/>
           </w:tcPr>
           <w:p>
             <w:pPr>
@@ -6211,7 +6235,7 @@
         </w:tc>
         <w:tc>
           <w:tcPr>
-            <w:tcW w:type="dxa" w:w="1247"/>
+            <w:tcW w:type="dxa" w:w="1504"/>
           </w:tcPr>
           <w:p>
             <w:pPr>
@@ -6227,7 +6251,7 @@
         </w:tc>
         <w:tc>
           <w:tcPr>
-            <w:tcW w:type="dxa" w:w="1247"/>
+            <w:tcW w:type="dxa" w:w="1504"/>
           </w:tcPr>
           <w:p>
             <w:pPr>
@@ -6245,7 +6269,7 @@
       <w:tr>
         <w:tc>
           <w:tcPr>
-            <w:tcW w:type="dxa" w:w="1361"/>
+            <w:tcW w:type="dxa" w:w="1641"/>
           </w:tcPr>
           <w:p>
             <w:pPr>
@@ -6261,7 +6285,7 @@
         </w:tc>
         <w:tc>
           <w:tcPr>
-            <w:tcW w:type="dxa" w:w="1077"/>
+            <w:tcW w:type="dxa" w:w="1299"/>
           </w:tcPr>
           <w:p>
             <w:pPr>
@@ -6277,7 +6301,7 @@
         </w:tc>
         <w:tc>
           <w:tcPr>
-            <w:tcW w:type="dxa" w:w="1247"/>
+            <w:tcW w:type="dxa" w:w="1504"/>
           </w:tcPr>
           <w:p>
             <w:pPr>
@@ -6293,7 +6317,7 @@
         </w:tc>
         <w:tc>
           <w:tcPr>
-            <w:tcW w:type="dxa" w:w="1247"/>
+            <w:tcW w:type="dxa" w:w="1504"/>
           </w:tcPr>
           <w:p>
             <w:pPr>
@@ -6309,7 +6333,7 @@
         </w:tc>
         <w:tc>
           <w:tcPr>
-            <w:tcW w:type="dxa" w:w="1247"/>
+            <w:tcW w:type="dxa" w:w="1504"/>
           </w:tcPr>
           <w:p>
             <w:pPr>
@@ -6325,7 +6349,7 @@
         </w:tc>
         <w:tc>
           <w:tcPr>
-            <w:tcW w:type="dxa" w:w="1247"/>
+            <w:tcW w:type="dxa" w:w="1504"/>
           </w:tcPr>
           <w:p>
             <w:pPr>
@@ -6341,7 +6365,7 @@
         </w:tc>
         <w:tc>
           <w:tcPr>
-            <w:tcW w:type="dxa" w:w="1247"/>
+            <w:tcW w:type="dxa" w:w="1504"/>
           </w:tcPr>
           <w:p>
             <w:pPr>
@@ -6359,7 +6383,7 @@
       <w:tr>
         <w:tc>
           <w:tcPr>
-            <w:tcW w:type="dxa" w:w="1361"/>
+            <w:tcW w:type="dxa" w:w="1641"/>
           </w:tcPr>
           <w:p>
             <w:pPr>
@@ -6375,7 +6399,7 @@
         </w:tc>
         <w:tc>
           <w:tcPr>
-            <w:tcW w:type="dxa" w:w="1077"/>
+            <w:tcW w:type="dxa" w:w="1299"/>
           </w:tcPr>
           <w:p>
             <w:pPr>
@@ -6391,7 +6415,7 @@
         </w:tc>
         <w:tc>
           <w:tcPr>
-            <w:tcW w:type="dxa" w:w="1247"/>
+            <w:tcW w:type="dxa" w:w="1504"/>
           </w:tcPr>
           <w:p>
             <w:pPr>
@@ -6407,7 +6431,7 @@
         </w:tc>
         <w:tc>
           <w:tcPr>
-            <w:tcW w:type="dxa" w:w="1247"/>
+            <w:tcW w:type="dxa" w:w="1504"/>
           </w:tcPr>
           <w:p>
             <w:pPr>
@@ -6423,7 +6447,7 @@
         </w:tc>
         <w:tc>
           <w:tcPr>
-            <w:tcW w:type="dxa" w:w="1247"/>
+            <w:tcW w:type="dxa" w:w="1504"/>
           </w:tcPr>
           <w:p>
             <w:pPr>
@@ -6439,7 +6463,7 @@
         </w:tc>
         <w:tc>
           <w:tcPr>
-            <w:tcW w:type="dxa" w:w="1247"/>
+            <w:tcW w:type="dxa" w:w="1504"/>
           </w:tcPr>
           <w:p>
             <w:pPr>
@@ -6455,7 +6479,7 @@
         </w:tc>
         <w:tc>
           <w:tcPr>
-            <w:tcW w:type="dxa" w:w="1247"/>
+            <w:tcW w:type="dxa" w:w="1504"/>
           </w:tcPr>
           <w:p>
             <w:pPr>
@@ -6473,7 +6497,7 @@
       <w:tr>
         <w:tc>
           <w:tcPr>
-            <w:tcW w:type="dxa" w:w="1361"/>
+            <w:tcW w:type="dxa" w:w="1641"/>
           </w:tcPr>
           <w:p>
             <w:pPr>
@@ -6489,7 +6513,7 @@
         </w:tc>
         <w:tc>
           <w:tcPr>
-            <w:tcW w:type="dxa" w:w="1077"/>
+            <w:tcW w:type="dxa" w:w="1299"/>
           </w:tcPr>
           <w:p>
             <w:pPr>
@@ -6505,7 +6529,7 @@
         </w:tc>
         <w:tc>
           <w:tcPr>
-            <w:tcW w:type="dxa" w:w="1247"/>
+            <w:tcW w:type="dxa" w:w="1504"/>
           </w:tcPr>
           <w:p>
             <w:pPr>
@@ -6521,7 +6545,7 @@
         </w:tc>
         <w:tc>
           <w:tcPr>
-            <w:tcW w:type="dxa" w:w="1247"/>
+            <w:tcW w:type="dxa" w:w="1504"/>
           </w:tcPr>
           <w:p>
             <w:pPr>
@@ -6537,7 +6561,7 @@
         </w:tc>
         <w:tc>
           <w:tcPr>
-            <w:tcW w:type="dxa" w:w="1247"/>
+            <w:tcW w:type="dxa" w:w="1504"/>
           </w:tcPr>
           <w:p>
             <w:pPr>
@@ -6553,7 +6577,7 @@
         </w:tc>
         <w:tc>
           <w:tcPr>
-            <w:tcW w:type="dxa" w:w="1247"/>
+            <w:tcW w:type="dxa" w:w="1504"/>
           </w:tcPr>
           <w:p>
             <w:pPr>
@@ -6569,7 +6593,7 @@
         </w:tc>
         <w:tc>
           <w:tcPr>
-            <w:tcW w:type="dxa" w:w="1247"/>
+            <w:tcW w:type="dxa" w:w="1504"/>
           </w:tcPr>
           <w:p>
             <w:pPr>
@@ -6587,7 +6611,7 @@
       <w:tr>
         <w:tc>
           <w:tcPr>
-            <w:tcW w:type="dxa" w:w="1361"/>
+            <w:tcW w:type="dxa" w:w="1641"/>
           </w:tcPr>
           <w:p>
             <w:pPr>
@@ -6603,7 +6627,7 @@
         </w:tc>
         <w:tc>
           <w:tcPr>
-            <w:tcW w:type="dxa" w:w="1077"/>
+            <w:tcW w:type="dxa" w:w="1299"/>
           </w:tcPr>
           <w:p>
             <w:pPr>
@@ -6619,7 +6643,7 @@
         </w:tc>
         <w:tc>
           <w:tcPr>
-            <w:tcW w:type="dxa" w:w="1247"/>
+            <w:tcW w:type="dxa" w:w="1504"/>
           </w:tcPr>
           <w:p>
             <w:pPr>
@@ -6635,7 +6659,7 @@
         </w:tc>
         <w:tc>
           <w:tcPr>
-            <w:tcW w:type="dxa" w:w="1247"/>
+            <w:tcW w:type="dxa" w:w="1504"/>
           </w:tcPr>
           <w:p>
             <w:pPr>
@@ -6651,7 +6675,7 @@
         </w:tc>
         <w:tc>
           <w:tcPr>
-            <w:tcW w:type="dxa" w:w="1247"/>
+            <w:tcW w:type="dxa" w:w="1504"/>
           </w:tcPr>
           <w:p>
             <w:pPr>
@@ -6667,7 +6691,7 @@
         </w:tc>
         <w:tc>
           <w:tcPr>
-            <w:tcW w:type="dxa" w:w="1247"/>
+            <w:tcW w:type="dxa" w:w="1504"/>
           </w:tcPr>
           <w:p>
             <w:pPr>
@@ -6683,7 +6707,7 @@
         </w:tc>
         <w:tc>
           <w:tcPr>
-            <w:tcW w:type="dxa" w:w="1247"/>
+            <w:tcW w:type="dxa" w:w="1504"/>
           </w:tcPr>
           <w:p>
             <w:pPr>
@@ -6701,7 +6725,7 @@
       <w:tr>
         <w:tc>
           <w:tcPr>
-            <w:tcW w:type="dxa" w:w="1361"/>
+            <w:tcW w:type="dxa" w:w="1641"/>
           </w:tcPr>
           <w:p>
             <w:pPr>
@@ -6717,7 +6741,7 @@
         </w:tc>
         <w:tc>
           <w:tcPr>
-            <w:tcW w:type="dxa" w:w="1077"/>
+            <w:tcW w:type="dxa" w:w="1299"/>
           </w:tcPr>
           <w:p>
             <w:pPr>
@@ -6733,7 +6757,7 @@
         </w:tc>
         <w:tc>
           <w:tcPr>
-            <w:tcW w:type="dxa" w:w="1247"/>
+            <w:tcW w:type="dxa" w:w="1504"/>
           </w:tcPr>
           <w:p>
             <w:pPr>
@@ -6749,7 +6773,7 @@
         </w:tc>
         <w:tc>
           <w:tcPr>
-            <w:tcW w:type="dxa" w:w="1247"/>
+            <w:tcW w:type="dxa" w:w="1504"/>
           </w:tcPr>
           <w:p>
             <w:pPr>
@@ -6765,7 +6789,7 @@
         </w:tc>
         <w:tc>
           <w:tcPr>
-            <w:tcW w:type="dxa" w:w="1247"/>
+            <w:tcW w:type="dxa" w:w="1504"/>
           </w:tcPr>
           <w:p>
             <w:pPr>
@@ -6781,7 +6805,7 @@
         </w:tc>
         <w:tc>
           <w:tcPr>
-            <w:tcW w:type="dxa" w:w="1247"/>
+            <w:tcW w:type="dxa" w:w="1504"/>
           </w:tcPr>
           <w:p>
             <w:pPr>
@@ -6797,7 +6821,7 @@
         </w:tc>
         <w:tc>
           <w:tcPr>
-            <w:tcW w:type="dxa" w:w="1247"/>
+            <w:tcW w:type="dxa" w:w="1504"/>
           </w:tcPr>
           <w:p>
             <w:pPr>

</xml_diff>